<commit_message>
move figures and listings to appendix files
</commit_message>
<xml_diff>
--- a/Thesis/docs/template xelatex/extra/Title.docx
+++ b/Thesis/docs/template xelatex/extra/Title.docx
@@ -1,6 +1,6 @@
 
 <file path=word/document.xml><?xml version="1.0" encoding="utf-8"?>
-<w:document xmlns:wpc="http://schemas.microsoft.com/office/word/2010/wordprocessingCanvas" xmlns:cx="http://schemas.microsoft.com/office/drawing/2014/chartex" xmlns:cx1="http://schemas.microsoft.com/office/drawing/2015/9/8/chartex" xmlns:cx2="http://schemas.microsoft.com/office/drawing/2015/10/21/chartex" xmlns:cx3="http://schemas.microsoft.com/office/drawing/2016/5/9/chartex" xmlns:cx4="http://schemas.microsoft.com/office/drawing/2016/5/10/chartex" xmlns:cx5="http://schemas.microsoft.com/office/drawing/2016/5/11/chartex" xmlns:cx6="http://schemas.microsoft.com/office/drawing/2016/5/12/chartex" xmlns:cx7="http://schemas.microsoft.com/office/drawing/2016/5/13/chartex" xmlns:cx8="http://schemas.microsoft.com/office/drawing/2016/5/14/chartex" xmlns:mc="http://schemas.openxmlformats.org/markup-compatibility/2006" xmlns:aink="http://schemas.microsoft.com/office/drawing/2016/ink" xmlns:am3d="http://schemas.microsoft.com/office/drawing/2017/model3d" xmlns:o="urn:schemas-microsoft-com:office:office" xmlns:oel="http://schemas.microsoft.com/office/2019/extlst" xmlns:r="http://schemas.openxmlformats.org/officeDocument/2006/relationships" xmlns:m="http://schemas.openxmlformats.org/officeDocument/2006/math" xmlns:v="urn:schemas-microsoft-com:vml" xmlns:wp14="http://schemas.microsoft.com/office/word/2010/wordprocessingDrawing" xmlns:wp="http://schemas.openxmlformats.org/drawingml/2006/wordprocessingDrawing" xmlns:w10="urn:schemas-microsoft-com:office:word" xmlns:w="http://schemas.openxmlformats.org/wordprocessingml/2006/main" xmlns:w14="http://schemas.microsoft.com/office/word/2010/wordml" xmlns:w15="http://schemas.microsoft.com/office/word/2012/wordml" xmlns:w16cex="http://schemas.microsoft.com/office/word/2018/wordml/cex" xmlns:w16cid="http://schemas.microsoft.com/office/word/2016/wordml/cid" xmlns:w16="http://schemas.microsoft.com/office/word/2018/wordml" xmlns:w16du="http://schemas.microsoft.com/office/word/2023/wordml/word16du" xmlns:w16sdtdh="http://schemas.microsoft.com/office/word/2020/wordml/sdtdatahash" xmlns:w16sdtfl="http://schemas.microsoft.com/office/word/2024/wordml/sdtformatlock" xmlns:w16se="http://schemas.microsoft.com/office/word/2015/wordml/symex" xmlns:wpg="http://schemas.microsoft.com/office/word/2010/wordprocessingGroup" xmlns:wpi="http://schemas.microsoft.com/office/word/2010/wordprocessingInk" xmlns:wne="http://schemas.microsoft.com/office/word/2006/wordml" xmlns:wps="http://schemas.microsoft.com/office/word/2010/wordprocessingShape" mc:Ignorable="w14 w15 w16se w16cid w16 w16cex w16sdtdh w16sdtfl w16du wp14">
+<w:document xmlns:wpc="http://schemas.microsoft.com/office/word/2010/wordprocessingCanvas" xmlns:cx="http://schemas.microsoft.com/office/drawing/2014/chartex" xmlns:cx1="http://schemas.microsoft.com/office/drawing/2015/9/8/chartex" xmlns:cx2="http://schemas.microsoft.com/office/drawing/2015/10/21/chartex" xmlns:cx3="http://schemas.microsoft.com/office/drawing/2016/5/9/chartex" xmlns:cx4="http://schemas.microsoft.com/office/drawing/2016/5/10/chartex" xmlns:cx5="http://schemas.microsoft.com/office/drawing/2016/5/11/chartex" xmlns:cx6="http://schemas.microsoft.com/office/drawing/2016/5/12/chartex" xmlns:cx7="http://schemas.microsoft.com/office/drawing/2016/5/13/chartex" xmlns:cx8="http://schemas.microsoft.com/office/drawing/2016/5/14/chartex" xmlns:mc="http://schemas.openxmlformats.org/markup-compatibility/2006" xmlns:aink="http://schemas.microsoft.com/office/drawing/2016/ink" xmlns:am3d="http://schemas.microsoft.com/office/drawing/2017/model3d" xmlns:o="urn:schemas-microsoft-com:office:office" xmlns:oel="http://schemas.microsoft.com/office/2019/extlst" xmlns:r="http://schemas.openxmlformats.org/officeDocument/2006/relationships" xmlns:m="http://schemas.openxmlformats.org/officeDocument/2006/math" xmlns:v="urn:schemas-microsoft-com:vml" xmlns:wp14="http://schemas.microsoft.com/office/word/2010/wordprocessingDrawing" xmlns:wp="http://schemas.openxmlformats.org/drawingml/2006/wordprocessingDrawing" xmlns:w10="urn:schemas-microsoft-com:office:word" xmlns:w="http://schemas.openxmlformats.org/wordprocessingml/2006/main" xmlns:w14="http://schemas.microsoft.com/office/word/2010/wordml" xmlns:w15="http://schemas.microsoft.com/office/word/2012/wordml" xmlns:w16cex="http://schemas.microsoft.com/office/word/2018/wordml/cex" xmlns:w16cid="http://schemas.microsoft.com/office/word/2016/wordml/cid" xmlns:w16="http://schemas.microsoft.com/office/word/2018/wordml" xmlns:w16sdtdh="http://schemas.microsoft.com/office/word/2020/wordml/sdtdatahash" xmlns:w16se="http://schemas.microsoft.com/office/word/2015/wordml/symex" xmlns:wpg="http://schemas.microsoft.com/office/word/2010/wordprocessingGroup" xmlns:wpi="http://schemas.microsoft.com/office/word/2010/wordprocessingInk" xmlns:wne="http://schemas.microsoft.com/office/word/2006/wordml" xmlns:wps="http://schemas.microsoft.com/office/word/2010/wordprocessingShape" mc:Ignorable="w14 w15 w16se w16cid w16 w16cex w16sdtdh wp14">
   <w:body>
     <w:p>
       <w:pPr>
@@ -382,7 +382,25 @@
           <w:bCs/>
           <w:szCs w:val="28"/>
         </w:rPr>
-        <w:t>РАЗРАБОТКА СИСТЕМЫ ДЛЯ ПРОКСИРОВАНИЯ И МОНИТОРИНГА СЕРВИСОВ-ЗАГЛУШЕК В СРЕДЕ НАГРУЗОЧНОГО ТЕСТИРОВАНИЯ</w:t>
+        <w:t xml:space="preserve">РАЗРАБОТКА СИСТЕМЫ ДЛЯ ПРОКСИРОВАНИЯ И МОНИТОРИНГА </w:t>
+      </w:r>
+      <w:r>
+        <w:rPr>
+          <w:rFonts w:cs="Times New Roman"/>
+          <w:b/>
+          <w:bCs/>
+          <w:szCs w:val="28"/>
+        </w:rPr>
+        <w:t>ИМИТАЦИОННЫХ СЕРВИСОВ</w:t>
+      </w:r>
+      <w:r>
+        <w:rPr>
+          <w:rFonts w:cs="Times New Roman"/>
+          <w:b/>
+          <w:bCs/>
+          <w:szCs w:val="28"/>
+        </w:rPr>
+        <w:t xml:space="preserve"> В СРЕДЕ НАГРУЗОЧНОГО ТЕСТИРОВАНИЯ</w:t>
       </w:r>
     </w:p>
     <w:bookmarkEnd w:id="2"/>
@@ -650,6 +668,7 @@
             </w:rPr>
             <w:t xml:space="preserve">Руководитель </w:t>
           </w:r>
+          <w:proofErr w:type="gramStart"/>
           <w:r>
             <w:rPr>
               <w:rFonts w:eastAsia="Times New Roman" w:cs="Times New Roman"/>
@@ -677,7 +696,18 @@
               <w:u w:val="single"/>
               <w:lang w:eastAsia="ru-RU"/>
             </w:rPr>
-            <w:t xml:space="preserve">                    </w:t>
+            <w:t xml:space="preserve"> </w:t>
+          </w:r>
+          <w:proofErr w:type="gramEnd"/>
+          <w:r>
+            <w:rPr>
+              <w:rFonts w:eastAsia="Times New Roman" w:cs="Times New Roman"/>
+              <w:color w:val="000000"/>
+              <w:szCs w:val="28"/>
+              <w:u w:val="single"/>
+              <w:lang w:eastAsia="ru-RU"/>
+            </w:rPr>
+            <w:t xml:space="preserve">                   </w:t>
           </w:r>
           <w:r>
             <w:rPr>
@@ -697,6 +727,7 @@
             </w:rPr>
             <w:t xml:space="preserve"> </w:t>
           </w:r>
+          <w:proofErr w:type="spellStart"/>
           <w:r>
             <w:rPr>
               <w:rFonts w:eastAsia="Times New Roman" w:cs="Times New Roman"/>
@@ -705,7 +736,18 @@
               <w:u w:val="single"/>
               <w:lang w:eastAsia="ru-RU"/>
             </w:rPr>
-            <w:t xml:space="preserve">Кружалов Алексей Сергеевич </w:t>
+            <w:t>Кружалов</w:t>
+          </w:r>
+          <w:proofErr w:type="spellEnd"/>
+          <w:r>
+            <w:rPr>
+              <w:rFonts w:eastAsia="Times New Roman" w:cs="Times New Roman"/>
+              <w:color w:val="000000"/>
+              <w:szCs w:val="28"/>
+              <w:u w:val="single"/>
+              <w:lang w:eastAsia="ru-RU"/>
+            </w:rPr>
+            <w:t xml:space="preserve"> Алексей Сергеевич </w:t>
           </w:r>
           <w:r>
             <w:rPr>
@@ -1294,15 +1336,40 @@
           <w:p>
             <w:pPr>
               <w:spacing w:line="240" w:lineRule="auto"/>
-              <w:ind w:left="114"/>
+              <w:jc w:val="both"/>
               <w:rPr>
                 <w:rFonts w:eastAsia="Times New Roman" w:cs="Times New Roman"/>
-                <w:bCs/>
                 <w:color w:val="000000"/>
                 <w:szCs w:val="28"/>
                 <w:lang w:val="ru-RU" w:eastAsia="ru-RU"/>
               </w:rPr>
             </w:pPr>
+            <w:r>
+              <w:rPr>
+                <w:rFonts w:cs="Times New Roman"/>
+                <w:szCs w:val="28"/>
+                <w:lang w:val="ru-RU"/>
+              </w:rPr>
+              <w:t xml:space="preserve">Разработка системы для </w:t>
+            </w:r>
+            <w:proofErr w:type="spellStart"/>
+            <w:r>
+              <w:rPr>
+                <w:rFonts w:cs="Times New Roman"/>
+                <w:szCs w:val="28"/>
+                <w:lang w:val="ru-RU"/>
+              </w:rPr>
+              <w:t>проксирования</w:t>
+            </w:r>
+            <w:proofErr w:type="spellEnd"/>
+            <w:r>
+              <w:rPr>
+                <w:rFonts w:cs="Times New Roman"/>
+                <w:szCs w:val="28"/>
+                <w:lang w:val="ru-RU"/>
+              </w:rPr>
+              <w:t xml:space="preserve"> и мониторинга имитационных сервисов в среде нагрузочного тестирования</w:t>
+            </w:r>
           </w:p>
         </w:tc>
       </w:tr>
@@ -7699,6 +7766,7 @@
           <w:szCs w:val="24"/>
         </w:rPr>
       </w:pPr>
+      <w:proofErr w:type="gramStart"/>
       <w:r>
         <w:rPr>
           <w:szCs w:val="28"/>
@@ -7711,7 +7779,15 @@
           <w:szCs w:val="28"/>
           <w:u w:val="single"/>
         </w:rPr>
-        <w:t xml:space="preserve">      </w:t>
+        <w:t xml:space="preserve">  </w:t>
+      </w:r>
+      <w:proofErr w:type="gramEnd"/>
+      <w:r>
+        <w:rPr>
+          <w:szCs w:val="28"/>
+          <w:u w:val="single"/>
+        </w:rPr>
+        <w:t xml:space="preserve">    </w:t>
       </w:r>
       <w:bookmarkEnd w:id="4"/>
       <w:r>
@@ -7883,6 +7959,7 @@
           <w:szCs w:val="24"/>
         </w:rPr>
       </w:pPr>
+      <w:proofErr w:type="gramStart"/>
       <w:r>
         <w:rPr>
           <w:szCs w:val="28"/>
@@ -7894,64 +7971,72 @@
           <w:szCs w:val="28"/>
           <w:u w:val="single"/>
         </w:rPr>
+        <w:t xml:space="preserve">  </w:t>
+      </w:r>
+      <w:proofErr w:type="gramEnd"/>
+      <w:r>
+        <w:rPr>
+          <w:szCs w:val="28"/>
+          <w:u w:val="single"/>
+        </w:rPr>
+        <w:t xml:space="preserve">    </w:t>
+      </w:r>
+      <w:r>
+        <w:rPr>
+          <w:szCs w:val="28"/>
+        </w:rPr>
+        <w:t>»</w:t>
+      </w:r>
+      <w:r>
+        <w:rPr>
+          <w:szCs w:val="28"/>
+          <w:u w:val="single"/>
+        </w:rPr>
+        <w:t xml:space="preserve">           </w:t>
+      </w:r>
+      <w:r>
+        <w:rPr>
+          <w:szCs w:val="28"/>
+        </w:rPr>
+        <w:t>202</w:t>
+      </w:r>
+      <w:r>
+        <w:rPr>
+          <w:szCs w:val="28"/>
+        </w:rPr>
+        <w:t>6</w:t>
+      </w:r>
+      <w:r>
+        <w:rPr>
+          <w:szCs w:val="28"/>
+        </w:rPr>
+        <w:t xml:space="preserve">, </w:t>
+      </w:r>
+      <w:r>
+        <w:rPr>
+          <w:szCs w:val="28"/>
+          <w:u w:val="single"/>
+        </w:rPr>
+        <w:t xml:space="preserve">       </w:t>
+      </w:r>
+      <w:r>
+        <w:rPr>
+          <w:szCs w:val="28"/>
+          <w:u w:val="single"/>
+        </w:rPr>
+        <w:t xml:space="preserve">              </w:t>
+      </w:r>
+      <w:r>
+        <w:rPr>
+          <w:szCs w:val="28"/>
+          <w:u w:val="single"/>
+        </w:rPr>
         <w:t xml:space="preserve">      </w:t>
       </w:r>
       <w:r>
         <w:rPr>
           <w:szCs w:val="28"/>
         </w:rPr>
-        <w:t>»</w:t>
-      </w:r>
-      <w:r>
-        <w:rPr>
-          <w:szCs w:val="28"/>
-          <w:u w:val="single"/>
-        </w:rPr>
-        <w:t xml:space="preserve">           </w:t>
-      </w:r>
-      <w:r>
-        <w:rPr>
-          <w:szCs w:val="28"/>
-        </w:rPr>
-        <w:t>202</w:t>
-      </w:r>
-      <w:r>
-        <w:rPr>
-          <w:szCs w:val="28"/>
-        </w:rPr>
-        <w:t>6</w:t>
-      </w:r>
-      <w:r>
-        <w:rPr>
-          <w:szCs w:val="28"/>
-        </w:rPr>
-        <w:t xml:space="preserve">, </w:t>
-      </w:r>
-      <w:r>
-        <w:rPr>
-          <w:szCs w:val="28"/>
-          <w:u w:val="single"/>
-        </w:rPr>
-        <w:t xml:space="preserve">       </w:t>
-      </w:r>
-      <w:r>
-        <w:rPr>
-          <w:szCs w:val="28"/>
-          <w:u w:val="single"/>
-        </w:rPr>
-        <w:t xml:space="preserve">              </w:t>
-      </w:r>
-      <w:r>
-        <w:rPr>
-          <w:szCs w:val="28"/>
-          <w:u w:val="single"/>
-        </w:rPr>
-        <w:t xml:space="preserve">      </w:t>
-      </w:r>
-      <w:r>
-        <w:rPr>
-          <w:szCs w:val="28"/>
-        </w:rPr>
         <w:t>/</w:t>
       </w:r>
       <w:r>
@@ -7960,6 +8045,7 @@
         </w:rPr>
         <w:t xml:space="preserve"> </w:t>
       </w:r>
+      <w:proofErr w:type="spellStart"/>
       <w:r>
         <w:rPr>
           <w:rFonts w:eastAsia="Times New Roman" w:cs="Times New Roman"/>
@@ -7968,7 +8054,18 @@
           <w:u w:val="single"/>
           <w:lang w:eastAsia="ru-RU"/>
         </w:rPr>
-        <w:t>Кружалов Алексей Сергеевич</w:t>
+        <w:t>Кружалов</w:t>
+      </w:r>
+      <w:proofErr w:type="spellEnd"/>
+      <w:r>
+        <w:rPr>
+          <w:rFonts w:eastAsia="Times New Roman" w:cs="Times New Roman"/>
+          <w:color w:val="000000"/>
+          <w:szCs w:val="28"/>
+          <w:u w:val="single"/>
+          <w:lang w:eastAsia="ru-RU"/>
+        </w:rPr>
+        <w:t xml:space="preserve"> Алексей Сергеевич</w:t>
       </w:r>
       <w:r>
         <w:rPr>
@@ -8104,6 +8201,7 @@
           <w:szCs w:val="24"/>
         </w:rPr>
       </w:pPr>
+      <w:proofErr w:type="gramStart"/>
       <w:r>
         <w:t>«</w:t>
       </w:r>
@@ -8112,7 +8210,15 @@
           <w:szCs w:val="28"/>
           <w:u w:val="single"/>
         </w:rPr>
-        <w:t xml:space="preserve">      </w:t>
+        <w:t xml:space="preserve">  </w:t>
+      </w:r>
+      <w:proofErr w:type="gramEnd"/>
+      <w:r>
+        <w:rPr>
+          <w:szCs w:val="28"/>
+          <w:u w:val="single"/>
+        </w:rPr>
+        <w:t xml:space="preserve">    </w:t>
       </w:r>
       <w:r>
         <w:t>»</w:t>
@@ -8266,7 +8372,7 @@
 </file>
 
 <file path=word/endnotes.xml><?xml version="1.0" encoding="utf-8"?>
-<w:endnotes xmlns:wpc="http://schemas.microsoft.com/office/word/2010/wordprocessingCanvas" xmlns:cx="http://schemas.microsoft.com/office/drawing/2014/chartex" xmlns:cx1="http://schemas.microsoft.com/office/drawing/2015/9/8/chartex" xmlns:cx2="http://schemas.microsoft.com/office/drawing/2015/10/21/chartex" xmlns:cx3="http://schemas.microsoft.com/office/drawing/2016/5/9/chartex" xmlns:cx4="http://schemas.microsoft.com/office/drawing/2016/5/10/chartex" xmlns:cx5="http://schemas.microsoft.com/office/drawing/2016/5/11/chartex" xmlns:cx6="http://schemas.microsoft.com/office/drawing/2016/5/12/chartex" xmlns:cx7="http://schemas.microsoft.com/office/drawing/2016/5/13/chartex" xmlns:cx8="http://schemas.microsoft.com/office/drawing/2016/5/14/chartex" xmlns:mc="http://schemas.openxmlformats.org/markup-compatibility/2006" xmlns:aink="http://schemas.microsoft.com/office/drawing/2016/ink" xmlns:am3d="http://schemas.microsoft.com/office/drawing/2017/model3d" xmlns:o="urn:schemas-microsoft-com:office:office" xmlns:oel="http://schemas.microsoft.com/office/2019/extlst" xmlns:r="http://schemas.openxmlformats.org/officeDocument/2006/relationships" xmlns:m="http://schemas.openxmlformats.org/officeDocument/2006/math" xmlns:v="urn:schemas-microsoft-com:vml" xmlns:wp14="http://schemas.microsoft.com/office/word/2010/wordprocessingDrawing" xmlns:wp="http://schemas.openxmlformats.org/drawingml/2006/wordprocessingDrawing" xmlns:w10="urn:schemas-microsoft-com:office:word" xmlns:w="http://schemas.openxmlformats.org/wordprocessingml/2006/main" xmlns:w14="http://schemas.microsoft.com/office/word/2010/wordml" xmlns:w15="http://schemas.microsoft.com/office/word/2012/wordml" xmlns:w16cex="http://schemas.microsoft.com/office/word/2018/wordml/cex" xmlns:w16cid="http://schemas.microsoft.com/office/word/2016/wordml/cid" xmlns:w16="http://schemas.microsoft.com/office/word/2018/wordml" xmlns:w16du="http://schemas.microsoft.com/office/word/2023/wordml/word16du" xmlns:w16sdtdh="http://schemas.microsoft.com/office/word/2020/wordml/sdtdatahash" xmlns:w16sdtfl="http://schemas.microsoft.com/office/word/2024/wordml/sdtformatlock" xmlns:w16se="http://schemas.microsoft.com/office/word/2015/wordml/symex" xmlns:wpg="http://schemas.microsoft.com/office/word/2010/wordprocessingGroup" xmlns:wpi="http://schemas.microsoft.com/office/word/2010/wordprocessingInk" xmlns:wne="http://schemas.microsoft.com/office/word/2006/wordml" xmlns:wps="http://schemas.microsoft.com/office/word/2010/wordprocessingShape" mc:Ignorable="w14 w15 w16se w16cid w16 w16cex w16sdtdh w16sdtfl w16du wp14">
+<w:endnotes xmlns:wpc="http://schemas.microsoft.com/office/word/2010/wordprocessingCanvas" xmlns:cx="http://schemas.microsoft.com/office/drawing/2014/chartex" xmlns:cx1="http://schemas.microsoft.com/office/drawing/2015/9/8/chartex" xmlns:cx2="http://schemas.microsoft.com/office/drawing/2015/10/21/chartex" xmlns:cx3="http://schemas.microsoft.com/office/drawing/2016/5/9/chartex" xmlns:cx4="http://schemas.microsoft.com/office/drawing/2016/5/10/chartex" xmlns:cx5="http://schemas.microsoft.com/office/drawing/2016/5/11/chartex" xmlns:cx6="http://schemas.microsoft.com/office/drawing/2016/5/12/chartex" xmlns:cx7="http://schemas.microsoft.com/office/drawing/2016/5/13/chartex" xmlns:cx8="http://schemas.microsoft.com/office/drawing/2016/5/14/chartex" xmlns:mc="http://schemas.openxmlformats.org/markup-compatibility/2006" xmlns:aink="http://schemas.microsoft.com/office/drawing/2016/ink" xmlns:am3d="http://schemas.microsoft.com/office/drawing/2017/model3d" xmlns:o="urn:schemas-microsoft-com:office:office" xmlns:oel="http://schemas.microsoft.com/office/2019/extlst" xmlns:r="http://schemas.openxmlformats.org/officeDocument/2006/relationships" xmlns:m="http://schemas.openxmlformats.org/officeDocument/2006/math" xmlns:v="urn:schemas-microsoft-com:vml" xmlns:wp14="http://schemas.microsoft.com/office/word/2010/wordprocessingDrawing" xmlns:wp="http://schemas.openxmlformats.org/drawingml/2006/wordprocessingDrawing" xmlns:w10="urn:schemas-microsoft-com:office:word" xmlns:w="http://schemas.openxmlformats.org/wordprocessingml/2006/main" xmlns:w14="http://schemas.microsoft.com/office/word/2010/wordml" xmlns:w15="http://schemas.microsoft.com/office/word/2012/wordml" xmlns:w16cex="http://schemas.microsoft.com/office/word/2018/wordml/cex" xmlns:w16cid="http://schemas.microsoft.com/office/word/2016/wordml/cid" xmlns:w16="http://schemas.microsoft.com/office/word/2018/wordml" xmlns:w16sdtdh="http://schemas.microsoft.com/office/word/2020/wordml/sdtdatahash" xmlns:w16se="http://schemas.microsoft.com/office/word/2015/wordml/symex" xmlns:wpg="http://schemas.microsoft.com/office/word/2010/wordprocessingGroup" xmlns:wpi="http://schemas.microsoft.com/office/word/2010/wordprocessingInk" xmlns:wne="http://schemas.microsoft.com/office/word/2006/wordml" xmlns:wps="http://schemas.microsoft.com/office/word/2010/wordprocessingShape" mc:Ignorable="w14 w15 w16se w16cid w16 w16cex w16sdtdh wp14">
   <w:endnote w:type="separator" w:id="-1">
     <w:p>
       <w:pPr>
@@ -8291,7 +8397,7 @@
 </file>
 
 <file path=word/footer1.xml><?xml version="1.0" encoding="utf-8"?>
-<w:ftr xmlns:wpc="http://schemas.microsoft.com/office/word/2010/wordprocessingCanvas" xmlns:cx="http://schemas.microsoft.com/office/drawing/2014/chartex" xmlns:cx1="http://schemas.microsoft.com/office/drawing/2015/9/8/chartex" xmlns:cx2="http://schemas.microsoft.com/office/drawing/2015/10/21/chartex" xmlns:cx3="http://schemas.microsoft.com/office/drawing/2016/5/9/chartex" xmlns:cx4="http://schemas.microsoft.com/office/drawing/2016/5/10/chartex" xmlns:cx5="http://schemas.microsoft.com/office/drawing/2016/5/11/chartex" xmlns:cx6="http://schemas.microsoft.com/office/drawing/2016/5/12/chartex" xmlns:cx7="http://schemas.microsoft.com/office/drawing/2016/5/13/chartex" xmlns:cx8="http://schemas.microsoft.com/office/drawing/2016/5/14/chartex" xmlns:mc="http://schemas.openxmlformats.org/markup-compatibility/2006" xmlns:aink="http://schemas.microsoft.com/office/drawing/2016/ink" xmlns:am3d="http://schemas.microsoft.com/office/drawing/2017/model3d" xmlns:o="urn:schemas-microsoft-com:office:office" xmlns:oel="http://schemas.microsoft.com/office/2019/extlst" xmlns:r="http://schemas.openxmlformats.org/officeDocument/2006/relationships" xmlns:m="http://schemas.openxmlformats.org/officeDocument/2006/math" xmlns:v="urn:schemas-microsoft-com:vml" xmlns:wp14="http://schemas.microsoft.com/office/word/2010/wordprocessingDrawing" xmlns:wp="http://schemas.openxmlformats.org/drawingml/2006/wordprocessingDrawing" xmlns:w10="urn:schemas-microsoft-com:office:word" xmlns:w="http://schemas.openxmlformats.org/wordprocessingml/2006/main" xmlns:w14="http://schemas.microsoft.com/office/word/2010/wordml" xmlns:w15="http://schemas.microsoft.com/office/word/2012/wordml" xmlns:w16cex="http://schemas.microsoft.com/office/word/2018/wordml/cex" xmlns:w16cid="http://schemas.microsoft.com/office/word/2016/wordml/cid" xmlns:w16="http://schemas.microsoft.com/office/word/2018/wordml" xmlns:w16du="http://schemas.microsoft.com/office/word/2023/wordml/word16du" xmlns:w16sdtdh="http://schemas.microsoft.com/office/word/2020/wordml/sdtdatahash" xmlns:w16sdtfl="http://schemas.microsoft.com/office/word/2024/wordml/sdtformatlock" xmlns:w16se="http://schemas.microsoft.com/office/word/2015/wordml/symex" xmlns:wpg="http://schemas.microsoft.com/office/word/2010/wordprocessingGroup" xmlns:wpi="http://schemas.microsoft.com/office/word/2010/wordprocessingInk" xmlns:wne="http://schemas.microsoft.com/office/word/2006/wordml" xmlns:wps="http://schemas.microsoft.com/office/word/2010/wordprocessingShape" mc:Ignorable="w14 w15 w16se w16cid w16 w16cex w16sdtdh w16sdtfl w16du wp14">
+<w:ftr xmlns:wpc="http://schemas.microsoft.com/office/word/2010/wordprocessingCanvas" xmlns:cx="http://schemas.microsoft.com/office/drawing/2014/chartex" xmlns:cx1="http://schemas.microsoft.com/office/drawing/2015/9/8/chartex" xmlns:cx2="http://schemas.microsoft.com/office/drawing/2015/10/21/chartex" xmlns:cx3="http://schemas.microsoft.com/office/drawing/2016/5/9/chartex" xmlns:cx4="http://schemas.microsoft.com/office/drawing/2016/5/10/chartex" xmlns:cx5="http://schemas.microsoft.com/office/drawing/2016/5/11/chartex" xmlns:cx6="http://schemas.microsoft.com/office/drawing/2016/5/12/chartex" xmlns:cx7="http://schemas.microsoft.com/office/drawing/2016/5/13/chartex" xmlns:cx8="http://schemas.microsoft.com/office/drawing/2016/5/14/chartex" xmlns:mc="http://schemas.openxmlformats.org/markup-compatibility/2006" xmlns:aink="http://schemas.microsoft.com/office/drawing/2016/ink" xmlns:am3d="http://schemas.microsoft.com/office/drawing/2017/model3d" xmlns:o="urn:schemas-microsoft-com:office:office" xmlns:oel="http://schemas.microsoft.com/office/2019/extlst" xmlns:r="http://schemas.openxmlformats.org/officeDocument/2006/relationships" xmlns:m="http://schemas.openxmlformats.org/officeDocument/2006/math" xmlns:v="urn:schemas-microsoft-com:vml" xmlns:wp14="http://schemas.microsoft.com/office/word/2010/wordprocessingDrawing" xmlns:wp="http://schemas.openxmlformats.org/drawingml/2006/wordprocessingDrawing" xmlns:w10="urn:schemas-microsoft-com:office:word" xmlns:w="http://schemas.openxmlformats.org/wordprocessingml/2006/main" xmlns:w14="http://schemas.microsoft.com/office/word/2010/wordml" xmlns:w15="http://schemas.microsoft.com/office/word/2012/wordml" xmlns:w16cex="http://schemas.microsoft.com/office/word/2018/wordml/cex" xmlns:w16cid="http://schemas.microsoft.com/office/word/2016/wordml/cid" xmlns:w16="http://schemas.microsoft.com/office/word/2018/wordml" xmlns:w16sdtdh="http://schemas.microsoft.com/office/word/2020/wordml/sdtdatahash" xmlns:w16se="http://schemas.microsoft.com/office/word/2015/wordml/symex" xmlns:wpg="http://schemas.microsoft.com/office/word/2010/wordprocessingGroup" xmlns:wpi="http://schemas.microsoft.com/office/word/2010/wordprocessingInk" xmlns:wne="http://schemas.microsoft.com/office/word/2006/wordml" xmlns:wps="http://schemas.microsoft.com/office/word/2010/wordprocessingShape" mc:Ignorable="w14 w15 w16se w16cid w16 w16cex w16sdtdh wp14">
   <w:p>
     <w:pPr>
       <w:pStyle w:val="af7"/>
@@ -8302,7 +8408,7 @@
 </file>
 
 <file path=word/footer2.xml><?xml version="1.0" encoding="utf-8"?>
-<w:ftr xmlns:wpc="http://schemas.microsoft.com/office/word/2010/wordprocessingCanvas" xmlns:cx="http://schemas.microsoft.com/office/drawing/2014/chartex" xmlns:cx1="http://schemas.microsoft.com/office/drawing/2015/9/8/chartex" xmlns:cx2="http://schemas.microsoft.com/office/drawing/2015/10/21/chartex" xmlns:cx3="http://schemas.microsoft.com/office/drawing/2016/5/9/chartex" xmlns:cx4="http://schemas.microsoft.com/office/drawing/2016/5/10/chartex" xmlns:cx5="http://schemas.microsoft.com/office/drawing/2016/5/11/chartex" xmlns:cx6="http://schemas.microsoft.com/office/drawing/2016/5/12/chartex" xmlns:cx7="http://schemas.microsoft.com/office/drawing/2016/5/13/chartex" xmlns:cx8="http://schemas.microsoft.com/office/drawing/2016/5/14/chartex" xmlns:mc="http://schemas.openxmlformats.org/markup-compatibility/2006" xmlns:aink="http://schemas.microsoft.com/office/drawing/2016/ink" xmlns:am3d="http://schemas.microsoft.com/office/drawing/2017/model3d" xmlns:o="urn:schemas-microsoft-com:office:office" xmlns:oel="http://schemas.microsoft.com/office/2019/extlst" xmlns:r="http://schemas.openxmlformats.org/officeDocument/2006/relationships" xmlns:m="http://schemas.openxmlformats.org/officeDocument/2006/math" xmlns:v="urn:schemas-microsoft-com:vml" xmlns:wp14="http://schemas.microsoft.com/office/word/2010/wordprocessingDrawing" xmlns:wp="http://schemas.openxmlformats.org/drawingml/2006/wordprocessingDrawing" xmlns:w10="urn:schemas-microsoft-com:office:word" xmlns:w="http://schemas.openxmlformats.org/wordprocessingml/2006/main" xmlns:w14="http://schemas.microsoft.com/office/word/2010/wordml" xmlns:w15="http://schemas.microsoft.com/office/word/2012/wordml" xmlns:w16cex="http://schemas.microsoft.com/office/word/2018/wordml/cex" xmlns:w16cid="http://schemas.microsoft.com/office/word/2016/wordml/cid" xmlns:w16="http://schemas.microsoft.com/office/word/2018/wordml" xmlns:w16du="http://schemas.microsoft.com/office/word/2023/wordml/word16du" xmlns:w16sdtdh="http://schemas.microsoft.com/office/word/2020/wordml/sdtdatahash" xmlns:w16sdtfl="http://schemas.microsoft.com/office/word/2024/wordml/sdtformatlock" xmlns:w16se="http://schemas.microsoft.com/office/word/2015/wordml/symex" xmlns:wpg="http://schemas.microsoft.com/office/word/2010/wordprocessingGroup" xmlns:wpi="http://schemas.microsoft.com/office/word/2010/wordprocessingInk" xmlns:wne="http://schemas.microsoft.com/office/word/2006/wordml" xmlns:wps="http://schemas.microsoft.com/office/word/2010/wordprocessingShape" mc:Ignorable="w14 w15 w16se w16cid w16 w16cex w16sdtdh w16sdtfl w16du wp14">
+<w:ftr xmlns:wpc="http://schemas.microsoft.com/office/word/2010/wordprocessingCanvas" xmlns:cx="http://schemas.microsoft.com/office/drawing/2014/chartex" xmlns:cx1="http://schemas.microsoft.com/office/drawing/2015/9/8/chartex" xmlns:cx2="http://schemas.microsoft.com/office/drawing/2015/10/21/chartex" xmlns:cx3="http://schemas.microsoft.com/office/drawing/2016/5/9/chartex" xmlns:cx4="http://schemas.microsoft.com/office/drawing/2016/5/10/chartex" xmlns:cx5="http://schemas.microsoft.com/office/drawing/2016/5/11/chartex" xmlns:cx6="http://schemas.microsoft.com/office/drawing/2016/5/12/chartex" xmlns:cx7="http://schemas.microsoft.com/office/drawing/2016/5/13/chartex" xmlns:cx8="http://schemas.microsoft.com/office/drawing/2016/5/14/chartex" xmlns:mc="http://schemas.openxmlformats.org/markup-compatibility/2006" xmlns:aink="http://schemas.microsoft.com/office/drawing/2016/ink" xmlns:am3d="http://schemas.microsoft.com/office/drawing/2017/model3d" xmlns:o="urn:schemas-microsoft-com:office:office" xmlns:oel="http://schemas.microsoft.com/office/2019/extlst" xmlns:r="http://schemas.openxmlformats.org/officeDocument/2006/relationships" xmlns:m="http://schemas.openxmlformats.org/officeDocument/2006/math" xmlns:v="urn:schemas-microsoft-com:vml" xmlns:wp14="http://schemas.microsoft.com/office/word/2010/wordprocessingDrawing" xmlns:wp="http://schemas.openxmlformats.org/drawingml/2006/wordprocessingDrawing" xmlns:w10="urn:schemas-microsoft-com:office:word" xmlns:w="http://schemas.openxmlformats.org/wordprocessingml/2006/main" xmlns:w14="http://schemas.microsoft.com/office/word/2010/wordml" xmlns:w15="http://schemas.microsoft.com/office/word/2012/wordml" xmlns:w16cex="http://schemas.microsoft.com/office/word/2018/wordml/cex" xmlns:w16cid="http://schemas.microsoft.com/office/word/2016/wordml/cid" xmlns:w16="http://schemas.microsoft.com/office/word/2018/wordml" xmlns:w16sdtdh="http://schemas.microsoft.com/office/word/2020/wordml/sdtdatahash" xmlns:w16se="http://schemas.microsoft.com/office/word/2015/wordml/symex" xmlns:wpg="http://schemas.microsoft.com/office/word/2010/wordprocessingGroup" xmlns:wpi="http://schemas.microsoft.com/office/word/2010/wordprocessingInk" xmlns:wne="http://schemas.microsoft.com/office/word/2006/wordml" xmlns:wps="http://schemas.microsoft.com/office/word/2010/wordprocessingShape" mc:Ignorable="w14 w15 w16se w16cid w16 w16cex w16sdtdh wp14">
   <w:p>
     <w:pPr>
       <w:pStyle w:val="af7"/>
@@ -8315,7 +8421,7 @@
 </file>
 
 <file path=word/footnotes.xml><?xml version="1.0" encoding="utf-8"?>
-<w:footnotes xmlns:wpc="http://schemas.microsoft.com/office/word/2010/wordprocessingCanvas" xmlns:cx="http://schemas.microsoft.com/office/drawing/2014/chartex" xmlns:cx1="http://schemas.microsoft.com/office/drawing/2015/9/8/chartex" xmlns:cx2="http://schemas.microsoft.com/office/drawing/2015/10/21/chartex" xmlns:cx3="http://schemas.microsoft.com/office/drawing/2016/5/9/chartex" xmlns:cx4="http://schemas.microsoft.com/office/drawing/2016/5/10/chartex" xmlns:cx5="http://schemas.microsoft.com/office/drawing/2016/5/11/chartex" xmlns:cx6="http://schemas.microsoft.com/office/drawing/2016/5/12/chartex" xmlns:cx7="http://schemas.microsoft.com/office/drawing/2016/5/13/chartex" xmlns:cx8="http://schemas.microsoft.com/office/drawing/2016/5/14/chartex" xmlns:mc="http://schemas.openxmlformats.org/markup-compatibility/2006" xmlns:aink="http://schemas.microsoft.com/office/drawing/2016/ink" xmlns:am3d="http://schemas.microsoft.com/office/drawing/2017/model3d" xmlns:o="urn:schemas-microsoft-com:office:office" xmlns:oel="http://schemas.microsoft.com/office/2019/extlst" xmlns:r="http://schemas.openxmlformats.org/officeDocument/2006/relationships" xmlns:m="http://schemas.openxmlformats.org/officeDocument/2006/math" xmlns:v="urn:schemas-microsoft-com:vml" xmlns:wp14="http://schemas.microsoft.com/office/word/2010/wordprocessingDrawing" xmlns:wp="http://schemas.openxmlformats.org/drawingml/2006/wordprocessingDrawing" xmlns:w10="urn:schemas-microsoft-com:office:word" xmlns:w="http://schemas.openxmlformats.org/wordprocessingml/2006/main" xmlns:w14="http://schemas.microsoft.com/office/word/2010/wordml" xmlns:w15="http://schemas.microsoft.com/office/word/2012/wordml" xmlns:w16cex="http://schemas.microsoft.com/office/word/2018/wordml/cex" xmlns:w16cid="http://schemas.microsoft.com/office/word/2016/wordml/cid" xmlns:w16="http://schemas.microsoft.com/office/word/2018/wordml" xmlns:w16du="http://schemas.microsoft.com/office/word/2023/wordml/word16du" xmlns:w16sdtdh="http://schemas.microsoft.com/office/word/2020/wordml/sdtdatahash" xmlns:w16sdtfl="http://schemas.microsoft.com/office/word/2024/wordml/sdtformatlock" xmlns:w16se="http://schemas.microsoft.com/office/word/2015/wordml/symex" xmlns:wpg="http://schemas.microsoft.com/office/word/2010/wordprocessingGroup" xmlns:wpi="http://schemas.microsoft.com/office/word/2010/wordprocessingInk" xmlns:wne="http://schemas.microsoft.com/office/word/2006/wordml" xmlns:wps="http://schemas.microsoft.com/office/word/2010/wordprocessingShape" mc:Ignorable="w14 w15 w16se w16cid w16 w16cex w16sdtdh w16sdtfl w16du wp14">
+<w:footnotes xmlns:wpc="http://schemas.microsoft.com/office/word/2010/wordprocessingCanvas" xmlns:cx="http://schemas.microsoft.com/office/drawing/2014/chartex" xmlns:cx1="http://schemas.microsoft.com/office/drawing/2015/9/8/chartex" xmlns:cx2="http://schemas.microsoft.com/office/drawing/2015/10/21/chartex" xmlns:cx3="http://schemas.microsoft.com/office/drawing/2016/5/9/chartex" xmlns:cx4="http://schemas.microsoft.com/office/drawing/2016/5/10/chartex" xmlns:cx5="http://schemas.microsoft.com/office/drawing/2016/5/11/chartex" xmlns:cx6="http://schemas.microsoft.com/office/drawing/2016/5/12/chartex" xmlns:cx7="http://schemas.microsoft.com/office/drawing/2016/5/13/chartex" xmlns:cx8="http://schemas.microsoft.com/office/drawing/2016/5/14/chartex" xmlns:mc="http://schemas.openxmlformats.org/markup-compatibility/2006" xmlns:aink="http://schemas.microsoft.com/office/drawing/2016/ink" xmlns:am3d="http://schemas.microsoft.com/office/drawing/2017/model3d" xmlns:o="urn:schemas-microsoft-com:office:office" xmlns:oel="http://schemas.microsoft.com/office/2019/extlst" xmlns:r="http://schemas.openxmlformats.org/officeDocument/2006/relationships" xmlns:m="http://schemas.openxmlformats.org/officeDocument/2006/math" xmlns:v="urn:schemas-microsoft-com:vml" xmlns:wp14="http://schemas.microsoft.com/office/word/2010/wordprocessingDrawing" xmlns:wp="http://schemas.openxmlformats.org/drawingml/2006/wordprocessingDrawing" xmlns:w10="urn:schemas-microsoft-com:office:word" xmlns:w="http://schemas.openxmlformats.org/wordprocessingml/2006/main" xmlns:w14="http://schemas.microsoft.com/office/word/2010/wordml" xmlns:w15="http://schemas.microsoft.com/office/word/2012/wordml" xmlns:w16cex="http://schemas.microsoft.com/office/word/2018/wordml/cex" xmlns:w16cid="http://schemas.microsoft.com/office/word/2016/wordml/cid" xmlns:w16="http://schemas.microsoft.com/office/word/2018/wordml" xmlns:w16sdtdh="http://schemas.microsoft.com/office/word/2020/wordml/sdtdatahash" xmlns:w16se="http://schemas.microsoft.com/office/word/2015/wordml/symex" xmlns:wpg="http://schemas.microsoft.com/office/word/2010/wordprocessingGroup" xmlns:wpi="http://schemas.microsoft.com/office/word/2010/wordprocessingInk" xmlns:wne="http://schemas.microsoft.com/office/word/2006/wordml" xmlns:wps="http://schemas.microsoft.com/office/word/2010/wordprocessingShape" mc:Ignorable="w14 w15 w16se w16cid w16 w16cex w16sdtdh wp14">
   <w:footnote w:type="separator" w:id="-1">
     <w:p>
       <w:pPr>
@@ -8340,7 +8446,7 @@
 </file>
 
 <file path=word/numbering.xml><?xml version="1.0" encoding="utf-8"?>
-<w:numbering xmlns:wpc="http://schemas.microsoft.com/office/word/2010/wordprocessingCanvas" xmlns:cx="http://schemas.microsoft.com/office/drawing/2014/chartex" xmlns:cx1="http://schemas.microsoft.com/office/drawing/2015/9/8/chartex" xmlns:cx2="http://schemas.microsoft.com/office/drawing/2015/10/21/chartex" xmlns:cx3="http://schemas.microsoft.com/office/drawing/2016/5/9/chartex" xmlns:cx4="http://schemas.microsoft.com/office/drawing/2016/5/10/chartex" xmlns:cx5="http://schemas.microsoft.com/office/drawing/2016/5/11/chartex" xmlns:cx6="http://schemas.microsoft.com/office/drawing/2016/5/12/chartex" xmlns:cx7="http://schemas.microsoft.com/office/drawing/2016/5/13/chartex" xmlns:cx8="http://schemas.microsoft.com/office/drawing/2016/5/14/chartex" xmlns:mc="http://schemas.openxmlformats.org/markup-compatibility/2006" xmlns:aink="http://schemas.microsoft.com/office/drawing/2016/ink" xmlns:am3d="http://schemas.microsoft.com/office/drawing/2017/model3d" xmlns:o="urn:schemas-microsoft-com:office:office" xmlns:oel="http://schemas.microsoft.com/office/2019/extlst" xmlns:r="http://schemas.openxmlformats.org/officeDocument/2006/relationships" xmlns:m="http://schemas.openxmlformats.org/officeDocument/2006/math" xmlns:v="urn:schemas-microsoft-com:vml" xmlns:wp14="http://schemas.microsoft.com/office/word/2010/wordprocessingDrawing" xmlns:wp="http://schemas.openxmlformats.org/drawingml/2006/wordprocessingDrawing" xmlns:w10="urn:schemas-microsoft-com:office:word" xmlns:w="http://schemas.openxmlformats.org/wordprocessingml/2006/main" xmlns:w14="http://schemas.microsoft.com/office/word/2010/wordml" xmlns:w15="http://schemas.microsoft.com/office/word/2012/wordml" xmlns:w16cex="http://schemas.microsoft.com/office/word/2018/wordml/cex" xmlns:w16cid="http://schemas.microsoft.com/office/word/2016/wordml/cid" xmlns:w16="http://schemas.microsoft.com/office/word/2018/wordml" xmlns:w16du="http://schemas.microsoft.com/office/word/2023/wordml/word16du" xmlns:w16sdtdh="http://schemas.microsoft.com/office/word/2020/wordml/sdtdatahash" xmlns:w16sdtfl="http://schemas.microsoft.com/office/word/2024/wordml/sdtformatlock" xmlns:w16se="http://schemas.microsoft.com/office/word/2015/wordml/symex" xmlns:wpg="http://schemas.microsoft.com/office/word/2010/wordprocessingGroup" xmlns:wpi="http://schemas.microsoft.com/office/word/2010/wordprocessingInk" xmlns:wne="http://schemas.microsoft.com/office/word/2006/wordml" xmlns:wps="http://schemas.microsoft.com/office/word/2010/wordprocessingShape" mc:Ignorable="w14 w15 w16se w16cid w16 w16cex w16sdtdh w16sdtfl w16du wp14">
+<w:numbering xmlns:wpc="http://schemas.microsoft.com/office/word/2010/wordprocessingCanvas" xmlns:cx="http://schemas.microsoft.com/office/drawing/2014/chartex" xmlns:cx1="http://schemas.microsoft.com/office/drawing/2015/9/8/chartex" xmlns:cx2="http://schemas.microsoft.com/office/drawing/2015/10/21/chartex" xmlns:cx3="http://schemas.microsoft.com/office/drawing/2016/5/9/chartex" xmlns:cx4="http://schemas.microsoft.com/office/drawing/2016/5/10/chartex" xmlns:cx5="http://schemas.microsoft.com/office/drawing/2016/5/11/chartex" xmlns:cx6="http://schemas.microsoft.com/office/drawing/2016/5/12/chartex" xmlns:cx7="http://schemas.microsoft.com/office/drawing/2016/5/13/chartex" xmlns:cx8="http://schemas.microsoft.com/office/drawing/2016/5/14/chartex" xmlns:mc="http://schemas.openxmlformats.org/markup-compatibility/2006" xmlns:aink="http://schemas.microsoft.com/office/drawing/2016/ink" xmlns:am3d="http://schemas.microsoft.com/office/drawing/2017/model3d" xmlns:o="urn:schemas-microsoft-com:office:office" xmlns:oel="http://schemas.microsoft.com/office/2019/extlst" xmlns:r="http://schemas.openxmlformats.org/officeDocument/2006/relationships" xmlns:m="http://schemas.openxmlformats.org/officeDocument/2006/math" xmlns:v="urn:schemas-microsoft-com:vml" xmlns:wp14="http://schemas.microsoft.com/office/word/2010/wordprocessingDrawing" xmlns:wp="http://schemas.openxmlformats.org/drawingml/2006/wordprocessingDrawing" xmlns:w10="urn:schemas-microsoft-com:office:word" xmlns:w="http://schemas.openxmlformats.org/wordprocessingml/2006/main" xmlns:w14="http://schemas.microsoft.com/office/word/2010/wordml" xmlns:w15="http://schemas.microsoft.com/office/word/2012/wordml" xmlns:w16cex="http://schemas.microsoft.com/office/word/2018/wordml/cex" xmlns:w16cid="http://schemas.microsoft.com/office/word/2016/wordml/cid" xmlns:w16="http://schemas.microsoft.com/office/word/2018/wordml" xmlns:w16sdtdh="http://schemas.microsoft.com/office/word/2020/wordml/sdtdatahash" xmlns:w16se="http://schemas.microsoft.com/office/word/2015/wordml/symex" xmlns:wpg="http://schemas.microsoft.com/office/word/2010/wordprocessingGroup" xmlns:wpi="http://schemas.microsoft.com/office/word/2010/wordprocessingInk" xmlns:wne="http://schemas.microsoft.com/office/word/2006/wordml" xmlns:wps="http://schemas.microsoft.com/office/word/2010/wordprocessingShape" mc:Ignorable="w14 w15 w16se w16cid w16 w16cex w16sdtdh wp14">
   <w:abstractNum w:abstractNumId="0" w15:restartNumberingAfterBreak="0">
     <w:nsid w:val="032C6A35"/>
     <w:multiLevelType w:val="hybridMultilevel"/>
@@ -9719,7 +9825,7 @@
 </file>
 
 <file path=word/styles.xml><?xml version="1.0" encoding="utf-8"?>
-<w:styles xmlns:mc="http://schemas.openxmlformats.org/markup-compatibility/2006" xmlns:r="http://schemas.openxmlformats.org/officeDocument/2006/relationships" xmlns:w="http://schemas.openxmlformats.org/wordprocessingml/2006/main" xmlns:w14="http://schemas.microsoft.com/office/word/2010/wordml" xmlns:w15="http://schemas.microsoft.com/office/word/2012/wordml" xmlns:w16cex="http://schemas.microsoft.com/office/word/2018/wordml/cex" xmlns:w16cid="http://schemas.microsoft.com/office/word/2016/wordml/cid" xmlns:w16="http://schemas.microsoft.com/office/word/2018/wordml" xmlns:w16du="http://schemas.microsoft.com/office/word/2023/wordml/word16du" xmlns:w16sdtdh="http://schemas.microsoft.com/office/word/2020/wordml/sdtdatahash" xmlns:w16sdtfl="http://schemas.microsoft.com/office/word/2024/wordml/sdtformatlock" xmlns:w16se="http://schemas.microsoft.com/office/word/2015/wordml/symex" mc:Ignorable="w14 w15 w16se w16cid w16 w16cex w16sdtdh w16sdtfl w16du">
+<w:styles xmlns:mc="http://schemas.openxmlformats.org/markup-compatibility/2006" xmlns:r="http://schemas.openxmlformats.org/officeDocument/2006/relationships" xmlns:w="http://schemas.openxmlformats.org/wordprocessingml/2006/main" xmlns:w14="http://schemas.microsoft.com/office/word/2010/wordml" xmlns:w15="http://schemas.microsoft.com/office/word/2012/wordml" xmlns:w16cex="http://schemas.microsoft.com/office/word/2018/wordml/cex" xmlns:w16cid="http://schemas.microsoft.com/office/word/2016/wordml/cid" xmlns:w16="http://schemas.microsoft.com/office/word/2018/wordml" xmlns:w16sdtdh="http://schemas.microsoft.com/office/word/2020/wordml/sdtdatahash" xmlns:w16se="http://schemas.microsoft.com/office/word/2015/wordml/symex" mc:Ignorable="w14 w15 w16se w16cid w16 w16cex w16sdtdh">
   <w:docDefaults>
     <w:rPrDefault>
       <w:rPr>
@@ -10116,7 +10222,7 @@
   <w:style w:type="paragraph" w:default="1" w:styleId="a1">
     <w:name w:val="Normal"/>
     <w:qFormat/>
-    <w:rsid w:val="006B7638"/>
+    <w:rsid w:val="00F8594C"/>
     <w:pPr>
       <w:spacing w:line="480" w:lineRule="auto"/>
     </w:pPr>

</xml_diff>

<commit_message>
add presentation and finish 3rd chapter
</commit_message>
<xml_diff>
--- a/Thesis/docs/template xelatex/extra/Title.docx
+++ b/Thesis/docs/template xelatex/extra/Title.docx
@@ -219,13 +219,33 @@
           <w:u w:val="single"/>
           <w:lang w:eastAsia="ru-RU"/>
         </w:rPr>
-        <w:t>Пухова Е. А.</w:t>
+        <w:t xml:space="preserve"> П</w:t>
       </w:r>
       <w:r>
         <w:rPr>
           <w:rFonts w:eastAsia="Times New Roman" w:cs="Times New Roman"/>
           <w:color w:val="000000"/>
           <w:szCs w:val="28"/>
+          <w:u w:val="single"/>
+          <w:lang w:eastAsia="ru-RU"/>
+        </w:rPr>
+        <w:t>ухова Е. А.</w:t>
+      </w:r>
+      <w:r>
+        <w:rPr>
+          <w:rFonts w:eastAsia="Times New Roman" w:cs="Times New Roman"/>
+          <w:color w:val="000000"/>
+          <w:szCs w:val="28"/>
+          <w:u w:val="single"/>
+          <w:lang w:eastAsia="ru-RU"/>
+        </w:rPr>
+        <w:t xml:space="preserve">  </w:t>
+      </w:r>
+      <w:r>
+        <w:rPr>
+          <w:rFonts w:eastAsia="Times New Roman" w:cs="Times New Roman"/>
+          <w:color w:val="000000"/>
+          <w:szCs w:val="28"/>
           <w:lang w:eastAsia="ru-RU"/>
         </w:rPr>
         <w:t xml:space="preserve"> /</w:t>
@@ -272,6 +292,7 @@
         </w:rPr>
         <w:t xml:space="preserve">________________ / </w:t>
       </w:r>
+      <w:proofErr w:type="spellStart"/>
       <w:r>
         <w:rPr>
           <w:rFonts w:eastAsia="Times New Roman" w:cs="Times New Roman"/>
@@ -280,16 +301,27 @@
           <w:u w:val="single"/>
           <w:lang w:eastAsia="ru-RU"/>
         </w:rPr>
-        <w:t>Даньшина М. В.</w:t>
-      </w:r>
+        <w:t>Гневшев</w:t>
+      </w:r>
+      <w:proofErr w:type="spellEnd"/>
       <w:r>
         <w:rPr>
           <w:rFonts w:eastAsia="Times New Roman" w:cs="Times New Roman"/>
           <w:color w:val="000000"/>
           <w:szCs w:val="28"/>
+          <w:u w:val="single"/>
           <w:lang w:eastAsia="ru-RU"/>
         </w:rPr>
-        <w:t xml:space="preserve"> /</w:t>
+        <w:t xml:space="preserve"> А. Ю.</w:t>
+      </w:r>
+      <w:r>
+        <w:rPr>
+          <w:rFonts w:eastAsia="Times New Roman" w:cs="Times New Roman"/>
+          <w:color w:val="000000"/>
+          <w:szCs w:val="28"/>
+          <w:lang w:eastAsia="ru-RU"/>
+        </w:rPr>
+        <w:t>/</w:t>
       </w:r>
     </w:p>
     <w:p>
@@ -1254,7 +1286,7 @@
       <w:tblPr>
         <w:tblStyle w:val="TableNormal1"/>
         <w:tblpPr w:leftFromText="180" w:rightFromText="180" w:vertAnchor="text" w:horzAnchor="margin" w:tblpY="246"/>
-        <w:tblW w:w="9450" w:type="dxa"/>
+        <w:tblW w:w="9351" w:type="dxa"/>
         <w:tblBorders>
           <w:top w:val="single" w:sz="4" w:space="0" w:color="000000"/>
           <w:left w:val="single" w:sz="4" w:space="0" w:color="000000"/>
@@ -1272,7 +1304,7 @@
       </w:tblPr>
       <w:tblGrid>
         <w:gridCol w:w="2578"/>
-        <w:gridCol w:w="6872"/>
+        <w:gridCol w:w="6773"/>
       </w:tblGrid>
       <w:tr>
         <w:trPr>
@@ -1281,6 +1313,10 @@
         <w:tc>
           <w:tcPr>
             <w:tcW w:w="2578" w:type="dxa"/>
+            <w:tcMar>
+              <w:left w:w="57" w:type="dxa"/>
+              <w:right w:w="57" w:type="dxa"/>
+            </w:tcMar>
             <w:vAlign w:val="center"/>
           </w:tcPr>
           <w:p>
@@ -1330,7 +1366,11 @@
         </w:tc>
         <w:tc>
           <w:tcPr>
-            <w:tcW w:w="6872" w:type="dxa"/>
+            <w:tcW w:w="6773" w:type="dxa"/>
+            <w:tcMar>
+              <w:left w:w="57" w:type="dxa"/>
+              <w:right w:w="57" w:type="dxa"/>
+            </w:tcMar>
             <w:vAlign w:val="center"/>
           </w:tcPr>
           <w:p>
@@ -1379,8 +1419,12 @@
         </w:trPr>
         <w:tc>
           <w:tcPr>
-            <w:tcW w:w="9450" w:type="dxa"/>
+            <w:tcW w:w="9351" w:type="dxa"/>
             <w:gridSpan w:val="2"/>
+            <w:tcMar>
+              <w:left w:w="57" w:type="dxa"/>
+              <w:right w:w="57" w:type="dxa"/>
+            </w:tcMar>
             <w:vAlign w:val="center"/>
           </w:tcPr>
           <w:p>
@@ -1437,12 +1481,16 @@
         <w:tc>
           <w:tcPr>
             <w:tcW w:w="2578" w:type="dxa"/>
+            <w:tcMar>
+              <w:left w:w="57" w:type="dxa"/>
+              <w:right w:w="57" w:type="dxa"/>
+            </w:tcMar>
             <w:vAlign w:val="center"/>
           </w:tcPr>
           <w:p>
             <w:pPr>
               <w:spacing w:line="240" w:lineRule="auto"/>
-              <w:ind w:left="108"/>
+              <w:ind w:left="108" w:right="110"/>
               <w:jc w:val="both"/>
               <w:rPr>
                 <w:rFonts w:eastAsia="Times New Roman" w:cs="Times New Roman"/>
@@ -1465,13 +1513,17 @@
         </w:tc>
         <w:tc>
           <w:tcPr>
-            <w:tcW w:w="6872" w:type="dxa"/>
+            <w:tcW w:w="6773" w:type="dxa"/>
+            <w:tcMar>
+              <w:left w:w="57" w:type="dxa"/>
+              <w:right w:w="57" w:type="dxa"/>
+            </w:tcMar>
             <w:vAlign w:val="center"/>
           </w:tcPr>
           <w:p>
             <w:pPr>
               <w:spacing w:line="240" w:lineRule="auto"/>
-              <w:ind w:left="163"/>
+              <w:ind w:left="163" w:right="80"/>
               <w:contextualSpacing/>
               <w:jc w:val="both"/>
               <w:rPr>
@@ -1488,7 +1540,43 @@
                 <w:szCs w:val="24"/>
                 <w:lang w:val="ru-RU" w:eastAsia="ru-RU"/>
               </w:rPr>
-              <w:t>Автоматизированная информационная система для централизованного управления и мониторинга распределённой инфраструктуры имитационных сервисов (заглушек) в среде нагрузочного тестирования.</w:t>
+              <w:t xml:space="preserve">Автоматизированная информационная система для централизованного мониторинга </w:t>
+            </w:r>
+            <w:r>
+              <w:rPr>
+                <w:rFonts w:eastAsia="Times New Roman" w:cs="Times New Roman"/>
+                <w:color w:val="000000"/>
+                <w:szCs w:val="24"/>
+                <w:lang w:val="ru-RU" w:eastAsia="ru-RU"/>
+              </w:rPr>
+              <w:t xml:space="preserve">и управления </w:t>
+            </w:r>
+            <w:r>
+              <w:rPr>
+                <w:rFonts w:eastAsia="Times New Roman" w:cs="Times New Roman"/>
+                <w:color w:val="000000"/>
+                <w:szCs w:val="24"/>
+                <w:lang w:val="ru-RU" w:eastAsia="ru-RU"/>
+              </w:rPr>
+              <w:t>распределённой инфраструктур</w:t>
+            </w:r>
+            <w:r>
+              <w:rPr>
+                <w:rFonts w:eastAsia="Times New Roman" w:cs="Times New Roman"/>
+                <w:color w:val="000000"/>
+                <w:szCs w:val="24"/>
+                <w:lang w:val="ru-RU" w:eastAsia="ru-RU"/>
+              </w:rPr>
+              <w:t>ой</w:t>
+            </w:r>
+            <w:r>
+              <w:rPr>
+                <w:rFonts w:eastAsia="Times New Roman" w:cs="Times New Roman"/>
+                <w:color w:val="000000"/>
+                <w:szCs w:val="24"/>
+                <w:lang w:val="ru-RU" w:eastAsia="ru-RU"/>
+              </w:rPr>
+              <w:t xml:space="preserve"> имитационных сервисов (заглушек) в среде нагрузочного тестирования.</w:t>
             </w:r>
           </w:p>
         </w:tc>
@@ -1500,12 +1588,16 @@
         <w:tc>
           <w:tcPr>
             <w:tcW w:w="2578" w:type="dxa"/>
+            <w:tcMar>
+              <w:left w:w="57" w:type="dxa"/>
+              <w:right w:w="57" w:type="dxa"/>
+            </w:tcMar>
             <w:vAlign w:val="center"/>
           </w:tcPr>
           <w:p>
             <w:pPr>
               <w:spacing w:line="240" w:lineRule="auto"/>
-              <w:ind w:left="108"/>
+              <w:ind w:left="108" w:right="110"/>
               <w:jc w:val="both"/>
               <w:rPr>
                 <w:rFonts w:eastAsia="Times New Roman" w:cs="Times New Roman"/>
@@ -1537,7 +1629,11 @@
         </w:tc>
         <w:tc>
           <w:tcPr>
-            <w:tcW w:w="6872" w:type="dxa"/>
+            <w:tcW w:w="6773" w:type="dxa"/>
+            <w:tcMar>
+              <w:left w:w="57" w:type="dxa"/>
+              <w:right w:w="57" w:type="dxa"/>
+            </w:tcMar>
           </w:tcPr>
           <w:p>
             <w:pPr>
@@ -1547,6 +1643,7 @@
                 <w:numId w:val="3"/>
               </w:numPr>
               <w:spacing w:line="240" w:lineRule="auto"/>
+              <w:ind w:right="87"/>
               <w:jc w:val="both"/>
               <w:rPr>
                 <w:rFonts w:eastAsia="Times New Roman" w:cs="Times New Roman"/>
@@ -1562,9 +1659,8 @@
                 <w:szCs w:val="24"/>
                 <w:lang w:val="ru-RU" w:eastAsia="ru-RU"/>
               </w:rPr>
-              <w:t>Управление жизненным циклом Java-заглушек (.</w:t>
-            </w:r>
-            <w:proofErr w:type="spellStart"/>
+              <w:t>Управление жизненным циклом</w:t>
+            </w:r>
             <w:r>
               <w:rPr>
                 <w:rFonts w:eastAsia="Times New Roman" w:cs="Times New Roman"/>
@@ -1572,9 +1668,8 @@
                 <w:szCs w:val="24"/>
                 <w:lang w:val="ru-RU" w:eastAsia="ru-RU"/>
               </w:rPr>
-              <w:t>jar</w:t>
-            </w:r>
-            <w:proofErr w:type="spellEnd"/>
+              <w:t xml:space="preserve"> имитационных сервисов</w:t>
+            </w:r>
             <w:r>
               <w:rPr>
                 <w:rFonts w:eastAsia="Times New Roman" w:cs="Times New Roman"/>
@@ -1582,27 +1677,7 @@
                 <w:szCs w:val="24"/>
                 <w:lang w:val="ru-RU" w:eastAsia="ru-RU"/>
               </w:rPr>
-              <w:t>/.</w:t>
-            </w:r>
-            <w:proofErr w:type="spellStart"/>
-            <w:r>
-              <w:rPr>
-                <w:rFonts w:eastAsia="Times New Roman" w:cs="Times New Roman"/>
-                <w:color w:val="000000"/>
-                <w:szCs w:val="24"/>
-                <w:lang w:val="ru-RU" w:eastAsia="ru-RU"/>
-              </w:rPr>
-              <w:t>war</w:t>
-            </w:r>
-            <w:proofErr w:type="spellEnd"/>
-            <w:r>
-              <w:rPr>
-                <w:rFonts w:eastAsia="Times New Roman" w:cs="Times New Roman"/>
-                <w:color w:val="000000"/>
-                <w:szCs w:val="24"/>
-                <w:lang w:val="ru-RU" w:eastAsia="ru-RU"/>
-              </w:rPr>
-              <w:t>): регистрация, запуск, остановка и удаление процессов на локальных и удалённых хостах без установки агентов.</w:t>
+              <w:t>: регистрация, запуск, остановка и удаление процессов на локальных и удалённых хостах без установки агентов.</w:t>
             </w:r>
           </w:p>
           <w:p>
@@ -1613,6 +1688,7 @@
                 <w:numId w:val="3"/>
               </w:numPr>
               <w:spacing w:line="240" w:lineRule="auto"/>
+              <w:ind w:right="87"/>
               <w:jc w:val="both"/>
               <w:rPr>
                 <w:rFonts w:eastAsia="Times New Roman" w:cs="Times New Roman"/>
@@ -1659,6 +1735,7 @@
                 <w:numId w:val="3"/>
               </w:numPr>
               <w:spacing w:line="240" w:lineRule="auto"/>
+              <w:ind w:right="87"/>
               <w:jc w:val="both"/>
               <w:rPr>
                 <w:rFonts w:eastAsia="Times New Roman" w:cs="Times New Roman"/>
@@ -1694,7 +1771,25 @@
                 <w:szCs w:val="24"/>
                 <w:lang w:val="ru-RU" w:eastAsia="ru-RU"/>
               </w:rPr>
-              <w:t>) на уровне каждой заглушки с изменением параметров в реальном времени без перезапуска.</w:t>
+              <w:t>) на уровне каждо</w:t>
+            </w:r>
+            <w:r>
+              <w:rPr>
+                <w:rFonts w:eastAsia="Times New Roman" w:cs="Times New Roman"/>
+                <w:color w:val="000000"/>
+                <w:szCs w:val="24"/>
+                <w:lang w:val="ru-RU" w:eastAsia="ru-RU"/>
+              </w:rPr>
+              <w:t xml:space="preserve">го имитационного сервиса </w:t>
+            </w:r>
+            <w:r>
+              <w:rPr>
+                <w:rFonts w:eastAsia="Times New Roman" w:cs="Times New Roman"/>
+                <w:color w:val="000000"/>
+                <w:szCs w:val="24"/>
+                <w:lang w:val="ru-RU" w:eastAsia="ru-RU"/>
+              </w:rPr>
+              <w:t>с изменением параметров в реальном времени без перезапуска.</w:t>
             </w:r>
           </w:p>
           <w:p>
@@ -1705,6 +1800,7 @@
                 <w:numId w:val="3"/>
               </w:numPr>
               <w:spacing w:line="240" w:lineRule="auto"/>
+              <w:ind w:right="87"/>
               <w:jc w:val="both"/>
               <w:rPr>
                 <w:rFonts w:eastAsia="Times New Roman" w:cs="Times New Roman"/>
@@ -1751,6 +1847,7 @@
                 <w:numId w:val="3"/>
               </w:numPr>
               <w:spacing w:line="240" w:lineRule="auto"/>
+              <w:ind w:right="87"/>
               <w:jc w:val="both"/>
               <w:rPr>
                 <w:rFonts w:eastAsia="Times New Roman" w:cs="Times New Roman"/>
@@ -1759,7 +1856,6 @@
                 <w:lang w:val="ru-RU" w:eastAsia="ru-RU"/>
               </w:rPr>
             </w:pPr>
-            <w:proofErr w:type="spellStart"/>
             <w:r>
               <w:rPr>
                 <w:rFonts w:eastAsia="Times New Roman" w:cs="Times New Roman"/>
@@ -1767,9 +1863,8 @@
                 <w:szCs w:val="24"/>
                 <w:lang w:val="ru-RU" w:eastAsia="ru-RU"/>
               </w:rPr>
-              <w:t>Персистентность</w:t>
-            </w:r>
-            <w:proofErr w:type="spellEnd"/>
+              <w:t>Обеспечение сохранности</w:t>
+            </w:r>
             <w:r>
               <w:rPr>
                 <w:rFonts w:eastAsia="Times New Roman" w:cs="Times New Roman"/>
@@ -1790,6 +1885,7 @@
                 <w:tab w:val="left" w:pos="2505"/>
               </w:tabs>
               <w:spacing w:line="240" w:lineRule="auto"/>
+              <w:ind w:right="87"/>
               <w:jc w:val="both"/>
               <w:rPr>
                 <w:lang w:val="ru-RU" w:eastAsia="ru-RU"/>
@@ -1802,27 +1898,7 @@
                 <w:szCs w:val="24"/>
                 <w:lang w:val="ru-RU" w:eastAsia="ru-RU"/>
               </w:rPr>
-              <w:t xml:space="preserve">Веб-интерфейс управления с </w:t>
-            </w:r>
-            <w:proofErr w:type="spellStart"/>
-            <w:r>
-              <w:rPr>
-                <w:rFonts w:eastAsia="Times New Roman" w:cs="Times New Roman"/>
-                <w:color w:val="000000"/>
-                <w:szCs w:val="24"/>
-                <w:lang w:val="ru-RU" w:eastAsia="ru-RU"/>
-              </w:rPr>
-              <w:t>dashboard</w:t>
-            </w:r>
-            <w:proofErr w:type="spellEnd"/>
-            <w:r>
-              <w:rPr>
-                <w:rFonts w:eastAsia="Times New Roman" w:cs="Times New Roman"/>
-                <w:color w:val="000000"/>
-                <w:szCs w:val="24"/>
-                <w:lang w:val="ru-RU" w:eastAsia="ru-RU"/>
-              </w:rPr>
-              <w:t>, настройками хостов и просмотром журналов Java-процессов.</w:t>
+              <w:t>Визуализация данных и управление системой через веб-интерфейс, позволяющий производить настройку хостов и просмотр журналов процессов.</w:t>
             </w:r>
           </w:p>
         </w:tc>
@@ -1834,12 +1910,16 @@
         <w:tc>
           <w:tcPr>
             <w:tcW w:w="2578" w:type="dxa"/>
+            <w:tcMar>
+              <w:left w:w="57" w:type="dxa"/>
+              <w:right w:w="57" w:type="dxa"/>
+            </w:tcMar>
             <w:vAlign w:val="center"/>
           </w:tcPr>
           <w:p>
             <w:pPr>
               <w:spacing w:line="240" w:lineRule="auto"/>
-              <w:ind w:left="108"/>
+              <w:ind w:left="108" w:right="110"/>
               <w:jc w:val="both"/>
               <w:rPr>
                 <w:rFonts w:eastAsia="Times New Roman" w:cs="Times New Roman"/>
@@ -1880,7 +1960,11 @@
         </w:tc>
         <w:tc>
           <w:tcPr>
-            <w:tcW w:w="6872" w:type="dxa"/>
+            <w:tcW w:w="6773" w:type="dxa"/>
+            <w:tcMar>
+              <w:left w:w="57" w:type="dxa"/>
+              <w:right w:w="57" w:type="dxa"/>
+            </w:tcMar>
             <w:vAlign w:val="center"/>
           </w:tcPr>
           <w:p>
@@ -1889,7 +1973,7 @@
                 <w:tab w:val="left" w:pos="285"/>
               </w:tabs>
               <w:spacing w:before="10" w:line="240" w:lineRule="auto"/>
-              <w:ind w:left="144" w:right="476"/>
+              <w:ind w:left="144" w:right="87"/>
               <w:jc w:val="both"/>
               <w:rPr>
                 <w:color w:val="000000" w:themeColor="text1"/>
@@ -1974,20 +2058,6 @@
         </w:tc>
       </w:tr>
     </w:tbl>
-    <w:p>
-      <w:pPr>
-        <w:spacing w:line="259" w:lineRule="auto"/>
-        <w:rPr>
-          <w:lang w:val="en-US"/>
-        </w:rPr>
-      </w:pPr>
-      <w:r>
-        <w:rPr>
-          <w:lang w:val="en-US"/>
-        </w:rPr>
-        <w:br w:type="page"/>
-      </w:r>
-    </w:p>
     <w:p>
       <w:pPr>
         <w:spacing w:before="7" w:after="0" w:line="240" w:lineRule="auto"/>
@@ -2102,7 +2172,7 @@
           <w:p>
             <w:pPr>
               <w:spacing w:line="240" w:lineRule="auto"/>
-              <w:ind w:left="108"/>
+              <w:ind w:left="108" w:right="170"/>
               <w:jc w:val="both"/>
               <w:rPr>
                 <w:rFonts w:eastAsia="Times New Roman" w:cs="Times New Roman"/>
@@ -2149,7 +2219,7 @@
                 <w:tab w:val="num" w:pos="397"/>
               </w:tabs>
               <w:spacing w:line="240" w:lineRule="auto"/>
-              <w:ind w:left="114" w:firstLine="0"/>
+              <w:ind w:left="114" w:right="95" w:firstLine="0"/>
               <w:jc w:val="both"/>
               <w:rPr>
                 <w:rFonts w:eastAsia="Times New Roman" w:cs="Times New Roman"/>
@@ -2180,7 +2250,7 @@
                 <w:tab w:val="num" w:pos="397"/>
               </w:tabs>
               <w:spacing w:line="240" w:lineRule="auto"/>
-              <w:ind w:left="114" w:firstLine="0"/>
+              <w:ind w:left="114" w:right="95" w:firstLine="0"/>
               <w:jc w:val="both"/>
               <w:rPr>
                 <w:rFonts w:eastAsia="Times New Roman" w:cs="Times New Roman"/>
@@ -2220,7 +2290,7 @@
                 <w:tab w:val="num" w:pos="397"/>
               </w:tabs>
               <w:spacing w:line="240" w:lineRule="auto"/>
-              <w:ind w:left="114" w:firstLine="0"/>
+              <w:ind w:left="114" w:right="95" w:firstLine="0"/>
               <w:jc w:val="both"/>
               <w:rPr>
                 <w:rFonts w:eastAsia="Times New Roman" w:cs="Times New Roman"/>
@@ -2260,7 +2330,7 @@
                 <w:tab w:val="num" w:pos="397"/>
               </w:tabs>
               <w:spacing w:line="240" w:lineRule="auto"/>
-              <w:ind w:left="114" w:firstLine="0"/>
+              <w:ind w:left="114" w:right="95" w:firstLine="0"/>
               <w:jc w:val="both"/>
               <w:rPr>
                 <w:rFonts w:eastAsia="Times New Roman" w:cs="Times New Roman"/>
@@ -2320,7 +2390,7 @@
                 <w:tab w:val="num" w:pos="397"/>
               </w:tabs>
               <w:spacing w:line="240" w:lineRule="auto"/>
-              <w:ind w:left="114" w:firstLine="0"/>
+              <w:ind w:left="114" w:right="95" w:firstLine="0"/>
               <w:jc w:val="both"/>
               <w:rPr>
                 <w:rFonts w:eastAsia="Times New Roman" w:cs="Times New Roman"/>
@@ -2360,7 +2430,7 @@
                 <w:tab w:val="num" w:pos="397"/>
               </w:tabs>
               <w:spacing w:line="240" w:lineRule="auto"/>
-              <w:ind w:left="114" w:firstLine="0"/>
+              <w:ind w:left="114" w:right="95" w:firstLine="0"/>
               <w:jc w:val="both"/>
               <w:rPr>
                 <w:rFonts w:eastAsia="Times New Roman" w:cs="Times New Roman"/>
@@ -2438,7 +2508,7 @@
           <w:p>
             <w:pPr>
               <w:spacing w:line="240" w:lineRule="auto"/>
-              <w:ind w:left="108"/>
+              <w:ind w:left="108" w:right="170"/>
               <w:jc w:val="both"/>
               <w:rPr>
                 <w:rFonts w:eastAsia="Times New Roman" w:cs="Times New Roman"/>
@@ -2485,6 +2555,7 @@
                 <w:tab w:val="num" w:pos="397"/>
               </w:tabs>
               <w:spacing w:line="240" w:lineRule="auto"/>
+              <w:ind w:right="95"/>
               <w:jc w:val="both"/>
               <w:rPr>
                 <w:rFonts w:eastAsia="Times New Roman" w:cs="Times New Roman"/>
@@ -2517,7 +2588,7 @@
           <w:p>
             <w:pPr>
               <w:spacing w:line="240" w:lineRule="auto"/>
-              <w:ind w:left="108"/>
+              <w:ind w:left="108" w:right="170"/>
               <w:jc w:val="both"/>
               <w:rPr>
                 <w:rFonts w:eastAsia="Times New Roman" w:cs="Times New Roman"/>
@@ -2552,6 +2623,601 @@
             <w:tcW w:w="6872" w:type="dxa"/>
             <w:vAlign w:val="center"/>
           </w:tcPr>
+          <w:p>
+            <w:pPr>
+              <w:pStyle w:val="af2"/>
+              <w:numPr>
+                <w:ilvl w:val="0"/>
+                <w:numId w:val="15"/>
+              </w:numPr>
+              <w:spacing w:line="240" w:lineRule="auto"/>
+              <w:jc w:val="both"/>
+              <w:rPr>
+                <w:rFonts w:eastAsia="Times New Roman" w:cs="Times New Roman"/>
+                <w:color w:val="000000" w:themeColor="text1"/>
+                <w:szCs w:val="24"/>
+                <w:lang w:val="ru-RU" w:eastAsia="ru-RU"/>
+              </w:rPr>
+            </w:pPr>
+            <w:r>
+              <w:rPr>
+                <w:rFonts w:eastAsia="Times New Roman" w:cs="Times New Roman"/>
+                <w:color w:val="000000" w:themeColor="text1"/>
+                <w:szCs w:val="24"/>
+                <w:lang w:val="ru-RU" w:eastAsia="ru-RU"/>
+              </w:rPr>
+              <w:t>Д</w:t>
+            </w:r>
+            <w:r>
+              <w:rPr>
+                <w:rFonts w:eastAsia="Times New Roman" w:cs="Times New Roman"/>
+                <w:color w:val="000000" w:themeColor="text1"/>
+                <w:szCs w:val="24"/>
+                <w:lang w:val="ru-RU" w:eastAsia="ru-RU"/>
+              </w:rPr>
+              <w:t xml:space="preserve">иаграмма системы </w:t>
+            </w:r>
+            <w:r>
+              <w:rPr>
+                <w:rFonts w:eastAsia="Times New Roman" w:cs="Times New Roman"/>
+                <w:color w:val="000000" w:themeColor="text1"/>
+                <w:szCs w:val="24"/>
+                <w:lang w:val="ru-RU" w:eastAsia="ru-RU"/>
+              </w:rPr>
+              <w:t xml:space="preserve">в нотации </w:t>
+            </w:r>
+            <w:r>
+              <w:rPr>
+                <w:rFonts w:eastAsia="Times New Roman" w:cs="Times New Roman"/>
+                <w:color w:val="000000" w:themeColor="text1"/>
+                <w:szCs w:val="24"/>
+                <w:lang w:eastAsia="ru-RU"/>
+              </w:rPr>
+              <w:t>C</w:t>
+            </w:r>
+            <w:r>
+              <w:rPr>
+                <w:rFonts w:eastAsia="Times New Roman" w:cs="Times New Roman"/>
+                <w:color w:val="000000" w:themeColor="text1"/>
+                <w:szCs w:val="24"/>
+                <w:lang w:val="ru-RU" w:eastAsia="ru-RU"/>
+              </w:rPr>
+              <w:t>4</w:t>
+            </w:r>
+            <w:r>
+              <w:rPr>
+                <w:rFonts w:eastAsia="Times New Roman" w:cs="Times New Roman"/>
+                <w:color w:val="000000" w:themeColor="text1"/>
+                <w:szCs w:val="24"/>
+                <w:lang w:val="ru-RU" w:eastAsia="ru-RU"/>
+              </w:rPr>
+              <w:t xml:space="preserve"> – 3</w:t>
+            </w:r>
+            <w:r>
+              <w:rPr>
+                <w:rFonts w:eastAsia="Times New Roman" w:cs="Times New Roman"/>
+                <w:color w:val="000000" w:themeColor="text1"/>
+                <w:szCs w:val="24"/>
+                <w:lang w:val="ru-RU" w:eastAsia="ru-RU"/>
+              </w:rPr>
+              <w:t xml:space="preserve"> экз.</w:t>
+            </w:r>
+          </w:p>
+          <w:p>
+            <w:pPr>
+              <w:pStyle w:val="af2"/>
+              <w:numPr>
+                <w:ilvl w:val="0"/>
+                <w:numId w:val="15"/>
+              </w:numPr>
+              <w:spacing w:line="240" w:lineRule="auto"/>
+              <w:jc w:val="both"/>
+              <w:rPr>
+                <w:rFonts w:eastAsia="Times New Roman" w:cs="Times New Roman"/>
+                <w:color w:val="000000" w:themeColor="text1"/>
+                <w:szCs w:val="24"/>
+                <w:lang w:eastAsia="ru-RU"/>
+              </w:rPr>
+            </w:pPr>
+            <w:proofErr w:type="spellStart"/>
+            <w:r>
+              <w:rPr>
+                <w:rFonts w:eastAsia="Times New Roman" w:cs="Times New Roman"/>
+                <w:color w:val="000000" w:themeColor="text1"/>
+                <w:szCs w:val="24"/>
+                <w:lang w:eastAsia="ru-RU"/>
+              </w:rPr>
+              <w:t>Диаграмма</w:t>
+            </w:r>
+            <w:proofErr w:type="spellEnd"/>
+            <w:r>
+              <w:rPr>
+                <w:rFonts w:eastAsia="Times New Roman" w:cs="Times New Roman"/>
+                <w:color w:val="000000" w:themeColor="text1"/>
+                <w:szCs w:val="24"/>
+                <w:lang w:eastAsia="ru-RU"/>
+              </w:rPr>
+              <w:t xml:space="preserve"> </w:t>
+            </w:r>
+            <w:proofErr w:type="spellStart"/>
+            <w:r>
+              <w:rPr>
+                <w:rFonts w:eastAsia="Times New Roman" w:cs="Times New Roman"/>
+                <w:color w:val="000000" w:themeColor="text1"/>
+                <w:szCs w:val="24"/>
+                <w:lang w:eastAsia="ru-RU"/>
+              </w:rPr>
+              <w:t>развёртывания</w:t>
+            </w:r>
+            <w:proofErr w:type="spellEnd"/>
+            <w:r>
+              <w:rPr>
+                <w:rFonts w:eastAsia="Times New Roman" w:cs="Times New Roman"/>
+                <w:color w:val="000000" w:themeColor="text1"/>
+                <w:szCs w:val="24"/>
+                <w:lang w:eastAsia="ru-RU"/>
+              </w:rPr>
+              <w:t xml:space="preserve"> </w:t>
+            </w:r>
+            <w:r>
+              <w:rPr>
+                <w:rFonts w:eastAsia="Times New Roman" w:cs="Times New Roman"/>
+                <w:color w:val="000000" w:themeColor="text1"/>
+                <w:szCs w:val="24"/>
+                <w:lang w:eastAsia="ru-RU"/>
+              </w:rPr>
+              <w:t>–</w:t>
+            </w:r>
+            <w:r>
+              <w:rPr>
+                <w:rFonts w:eastAsia="Times New Roman" w:cs="Times New Roman"/>
+                <w:color w:val="000000" w:themeColor="text1"/>
+                <w:szCs w:val="24"/>
+                <w:lang w:eastAsia="ru-RU"/>
+              </w:rPr>
+              <w:t xml:space="preserve"> 1 </w:t>
+            </w:r>
+            <w:proofErr w:type="spellStart"/>
+            <w:r>
+              <w:rPr>
+                <w:rFonts w:eastAsia="Times New Roman" w:cs="Times New Roman"/>
+                <w:color w:val="000000" w:themeColor="text1"/>
+                <w:szCs w:val="24"/>
+                <w:lang w:eastAsia="ru-RU"/>
+              </w:rPr>
+              <w:t>экз</w:t>
+            </w:r>
+            <w:proofErr w:type="spellEnd"/>
+            <w:r>
+              <w:rPr>
+                <w:rFonts w:eastAsia="Times New Roman" w:cs="Times New Roman"/>
+                <w:color w:val="000000" w:themeColor="text1"/>
+                <w:szCs w:val="24"/>
+                <w:lang w:eastAsia="ru-RU"/>
+              </w:rPr>
+              <w:t>.</w:t>
+            </w:r>
+          </w:p>
+          <w:p>
+            <w:pPr>
+              <w:pStyle w:val="af2"/>
+              <w:numPr>
+                <w:ilvl w:val="0"/>
+                <w:numId w:val="15"/>
+              </w:numPr>
+              <w:spacing w:line="240" w:lineRule="auto"/>
+              <w:jc w:val="both"/>
+              <w:rPr>
+                <w:rFonts w:eastAsia="Times New Roman" w:cs="Times New Roman"/>
+                <w:color w:val="000000" w:themeColor="text1"/>
+                <w:szCs w:val="24"/>
+                <w:lang w:val="ru-RU" w:eastAsia="ru-RU"/>
+              </w:rPr>
+            </w:pPr>
+            <w:r>
+              <w:rPr>
+                <w:rFonts w:eastAsia="Times New Roman" w:cs="Times New Roman"/>
+                <w:color w:val="000000" w:themeColor="text1"/>
+                <w:szCs w:val="24"/>
+                <w:lang w:eastAsia="ru-RU"/>
+              </w:rPr>
+              <w:t>ER</w:t>
+            </w:r>
+            <w:r>
+              <w:rPr>
+                <w:rFonts w:eastAsia="Times New Roman" w:cs="Times New Roman"/>
+                <w:color w:val="000000" w:themeColor="text1"/>
+                <w:szCs w:val="24"/>
+                <w:lang w:val="ru-RU" w:eastAsia="ru-RU"/>
+              </w:rPr>
+              <w:t xml:space="preserve">-диаграмма объектов в </w:t>
+            </w:r>
+            <w:r>
+              <w:rPr>
+                <w:rFonts w:eastAsia="Times New Roman" w:cs="Times New Roman"/>
+                <w:color w:val="000000" w:themeColor="text1"/>
+                <w:szCs w:val="24"/>
+                <w:lang w:eastAsia="ru-RU"/>
+              </w:rPr>
+              <w:t>Redis</w:t>
+            </w:r>
+            <w:r>
+              <w:rPr>
+                <w:rFonts w:eastAsia="Times New Roman" w:cs="Times New Roman"/>
+                <w:color w:val="000000" w:themeColor="text1"/>
+                <w:szCs w:val="24"/>
+                <w:lang w:val="ru-RU" w:eastAsia="ru-RU"/>
+              </w:rPr>
+              <w:t xml:space="preserve"> </w:t>
+            </w:r>
+            <w:r>
+              <w:rPr>
+                <w:rFonts w:eastAsia="Times New Roman" w:cs="Times New Roman"/>
+                <w:color w:val="000000" w:themeColor="text1"/>
+                <w:szCs w:val="24"/>
+                <w:lang w:val="ru-RU" w:eastAsia="ru-RU"/>
+              </w:rPr>
+              <w:t>–</w:t>
+            </w:r>
+            <w:r>
+              <w:rPr>
+                <w:rFonts w:eastAsia="Times New Roman" w:cs="Times New Roman"/>
+                <w:color w:val="000000" w:themeColor="text1"/>
+                <w:szCs w:val="24"/>
+                <w:lang w:val="ru-RU" w:eastAsia="ru-RU"/>
+              </w:rPr>
+              <w:t xml:space="preserve"> 1 экз.</w:t>
+            </w:r>
+          </w:p>
+          <w:p>
+            <w:pPr>
+              <w:pStyle w:val="af2"/>
+              <w:numPr>
+                <w:ilvl w:val="0"/>
+                <w:numId w:val="15"/>
+              </w:numPr>
+              <w:spacing w:line="240" w:lineRule="auto"/>
+              <w:jc w:val="both"/>
+              <w:rPr>
+                <w:rFonts w:eastAsia="Times New Roman" w:cs="Times New Roman"/>
+                <w:color w:val="000000" w:themeColor="text1"/>
+                <w:szCs w:val="24"/>
+                <w:lang w:eastAsia="ru-RU"/>
+              </w:rPr>
+            </w:pPr>
+            <w:proofErr w:type="spellStart"/>
+            <w:r>
+              <w:rPr>
+                <w:rFonts w:eastAsia="Times New Roman" w:cs="Times New Roman"/>
+                <w:color w:val="000000" w:themeColor="text1"/>
+                <w:szCs w:val="24"/>
+                <w:lang w:eastAsia="ru-RU"/>
+              </w:rPr>
+              <w:t>Макеты</w:t>
+            </w:r>
+            <w:proofErr w:type="spellEnd"/>
+            <w:r>
+              <w:rPr>
+                <w:rFonts w:eastAsia="Times New Roman" w:cs="Times New Roman"/>
+                <w:color w:val="000000" w:themeColor="text1"/>
+                <w:szCs w:val="24"/>
+                <w:lang w:eastAsia="ru-RU"/>
+              </w:rPr>
+              <w:t xml:space="preserve"> </w:t>
+            </w:r>
+            <w:proofErr w:type="spellStart"/>
+            <w:r>
+              <w:rPr>
+                <w:rFonts w:eastAsia="Times New Roman" w:cs="Times New Roman"/>
+                <w:color w:val="000000" w:themeColor="text1"/>
+                <w:szCs w:val="24"/>
+                <w:lang w:eastAsia="ru-RU"/>
+              </w:rPr>
+              <w:t>пользовательского</w:t>
+            </w:r>
+            <w:proofErr w:type="spellEnd"/>
+            <w:r>
+              <w:rPr>
+                <w:rFonts w:eastAsia="Times New Roman" w:cs="Times New Roman"/>
+                <w:color w:val="000000" w:themeColor="text1"/>
+                <w:szCs w:val="24"/>
+                <w:lang w:eastAsia="ru-RU"/>
+              </w:rPr>
+              <w:t xml:space="preserve"> </w:t>
+            </w:r>
+            <w:proofErr w:type="spellStart"/>
+            <w:r>
+              <w:rPr>
+                <w:rFonts w:eastAsia="Times New Roman" w:cs="Times New Roman"/>
+                <w:color w:val="000000" w:themeColor="text1"/>
+                <w:szCs w:val="24"/>
+                <w:lang w:eastAsia="ru-RU"/>
+              </w:rPr>
+              <w:t>интерфейса</w:t>
+            </w:r>
+            <w:proofErr w:type="spellEnd"/>
+            <w:r>
+              <w:rPr>
+                <w:rFonts w:eastAsia="Times New Roman" w:cs="Times New Roman"/>
+                <w:color w:val="000000" w:themeColor="text1"/>
+                <w:szCs w:val="24"/>
+                <w:lang w:eastAsia="ru-RU"/>
+              </w:rPr>
+              <w:t xml:space="preserve"> </w:t>
+            </w:r>
+            <w:r>
+              <w:rPr>
+                <w:rFonts w:eastAsia="Times New Roman" w:cs="Times New Roman"/>
+                <w:color w:val="000000" w:themeColor="text1"/>
+                <w:szCs w:val="24"/>
+                <w:lang w:eastAsia="ru-RU"/>
+              </w:rPr>
+              <w:t>–</w:t>
+            </w:r>
+            <w:r>
+              <w:rPr>
+                <w:rFonts w:eastAsia="Times New Roman" w:cs="Times New Roman"/>
+                <w:color w:val="000000" w:themeColor="text1"/>
+                <w:szCs w:val="24"/>
+                <w:lang w:eastAsia="ru-RU"/>
+              </w:rPr>
+              <w:t xml:space="preserve"> 6 </w:t>
+            </w:r>
+            <w:proofErr w:type="spellStart"/>
+            <w:r>
+              <w:rPr>
+                <w:rFonts w:eastAsia="Times New Roman" w:cs="Times New Roman"/>
+                <w:color w:val="000000" w:themeColor="text1"/>
+                <w:szCs w:val="24"/>
+                <w:lang w:eastAsia="ru-RU"/>
+              </w:rPr>
+              <w:t>экз</w:t>
+            </w:r>
+            <w:proofErr w:type="spellEnd"/>
+            <w:r>
+              <w:rPr>
+                <w:rFonts w:eastAsia="Times New Roman" w:cs="Times New Roman"/>
+                <w:color w:val="000000" w:themeColor="text1"/>
+                <w:szCs w:val="24"/>
+                <w:lang w:eastAsia="ru-RU"/>
+              </w:rPr>
+              <w:t>.</w:t>
+            </w:r>
+          </w:p>
+          <w:p>
+            <w:pPr>
+              <w:pStyle w:val="af2"/>
+              <w:numPr>
+                <w:ilvl w:val="0"/>
+                <w:numId w:val="15"/>
+              </w:numPr>
+              <w:spacing w:line="240" w:lineRule="auto"/>
+              <w:jc w:val="both"/>
+              <w:rPr>
+                <w:rFonts w:eastAsia="Times New Roman" w:cs="Times New Roman"/>
+                <w:color w:val="000000" w:themeColor="text1"/>
+                <w:szCs w:val="24"/>
+                <w:lang w:eastAsia="ru-RU"/>
+              </w:rPr>
+            </w:pPr>
+            <w:proofErr w:type="spellStart"/>
+            <w:r>
+              <w:rPr>
+                <w:rFonts w:eastAsia="Times New Roman" w:cs="Times New Roman"/>
+                <w:color w:val="000000" w:themeColor="text1"/>
+                <w:szCs w:val="24"/>
+                <w:lang w:eastAsia="ru-RU"/>
+              </w:rPr>
+              <w:t>Экраны</w:t>
+            </w:r>
+            <w:proofErr w:type="spellEnd"/>
+            <w:r>
+              <w:rPr>
+                <w:rFonts w:eastAsia="Times New Roman" w:cs="Times New Roman"/>
+                <w:color w:val="000000" w:themeColor="text1"/>
+                <w:szCs w:val="24"/>
+                <w:lang w:eastAsia="ru-RU"/>
+              </w:rPr>
+              <w:t xml:space="preserve"> </w:t>
+            </w:r>
+            <w:proofErr w:type="spellStart"/>
+            <w:r>
+              <w:rPr>
+                <w:rFonts w:eastAsia="Times New Roman" w:cs="Times New Roman"/>
+                <w:color w:val="000000" w:themeColor="text1"/>
+                <w:szCs w:val="24"/>
+                <w:lang w:eastAsia="ru-RU"/>
+              </w:rPr>
+              <w:t>реализованного</w:t>
+            </w:r>
+            <w:proofErr w:type="spellEnd"/>
+            <w:r>
+              <w:rPr>
+                <w:rFonts w:eastAsia="Times New Roman" w:cs="Times New Roman"/>
+                <w:color w:val="000000" w:themeColor="text1"/>
+                <w:szCs w:val="24"/>
+                <w:lang w:eastAsia="ru-RU"/>
+              </w:rPr>
+              <w:t xml:space="preserve"> </w:t>
+            </w:r>
+            <w:proofErr w:type="spellStart"/>
+            <w:r>
+              <w:rPr>
+                <w:rFonts w:eastAsia="Times New Roman" w:cs="Times New Roman"/>
+                <w:color w:val="000000" w:themeColor="text1"/>
+                <w:szCs w:val="24"/>
+                <w:lang w:eastAsia="ru-RU"/>
+              </w:rPr>
+              <w:t>интерфейса</w:t>
+            </w:r>
+            <w:proofErr w:type="spellEnd"/>
+            <w:r>
+              <w:rPr>
+                <w:rFonts w:eastAsia="Times New Roman" w:cs="Times New Roman"/>
+                <w:color w:val="000000" w:themeColor="text1"/>
+                <w:szCs w:val="24"/>
+                <w:lang w:eastAsia="ru-RU"/>
+              </w:rPr>
+              <w:t xml:space="preserve"> </w:t>
+            </w:r>
+            <w:r>
+              <w:rPr>
+                <w:rFonts w:eastAsia="Times New Roman" w:cs="Times New Roman"/>
+                <w:color w:val="000000" w:themeColor="text1"/>
+                <w:szCs w:val="24"/>
+                <w:lang w:eastAsia="ru-RU"/>
+              </w:rPr>
+              <w:t>–</w:t>
+            </w:r>
+            <w:r>
+              <w:rPr>
+                <w:rFonts w:eastAsia="Times New Roman" w:cs="Times New Roman"/>
+                <w:color w:val="000000" w:themeColor="text1"/>
+                <w:szCs w:val="24"/>
+                <w:lang w:eastAsia="ru-RU"/>
+              </w:rPr>
+              <w:t xml:space="preserve"> 5 </w:t>
+            </w:r>
+            <w:proofErr w:type="spellStart"/>
+            <w:r>
+              <w:rPr>
+                <w:rFonts w:eastAsia="Times New Roman" w:cs="Times New Roman"/>
+                <w:color w:val="000000" w:themeColor="text1"/>
+                <w:szCs w:val="24"/>
+                <w:lang w:eastAsia="ru-RU"/>
+              </w:rPr>
+              <w:t>экз</w:t>
+            </w:r>
+            <w:proofErr w:type="spellEnd"/>
+            <w:r>
+              <w:rPr>
+                <w:rFonts w:eastAsia="Times New Roman" w:cs="Times New Roman"/>
+                <w:color w:val="000000" w:themeColor="text1"/>
+                <w:szCs w:val="24"/>
+                <w:lang w:eastAsia="ru-RU"/>
+              </w:rPr>
+              <w:t>.</w:t>
+            </w:r>
+          </w:p>
+          <w:p>
+            <w:pPr>
+              <w:pStyle w:val="af2"/>
+              <w:numPr>
+                <w:ilvl w:val="0"/>
+                <w:numId w:val="15"/>
+              </w:numPr>
+              <w:spacing w:line="240" w:lineRule="auto"/>
+              <w:jc w:val="both"/>
+              <w:rPr>
+                <w:rFonts w:eastAsia="Times New Roman" w:cs="Times New Roman"/>
+                <w:color w:val="000000" w:themeColor="text1"/>
+                <w:szCs w:val="24"/>
+                <w:lang w:val="ru-RU" w:eastAsia="ru-RU"/>
+              </w:rPr>
+            </w:pPr>
+            <w:r>
+              <w:rPr>
+                <w:rFonts w:eastAsia="Times New Roman" w:cs="Times New Roman"/>
+                <w:color w:val="000000" w:themeColor="text1"/>
+                <w:szCs w:val="24"/>
+                <w:lang w:val="ru-RU" w:eastAsia="ru-RU"/>
+              </w:rPr>
+              <w:t xml:space="preserve">Графики результатов тестирования </w:t>
+            </w:r>
+            <w:r>
+              <w:rPr>
+                <w:rFonts w:eastAsia="Times New Roman" w:cs="Times New Roman"/>
+                <w:color w:val="000000" w:themeColor="text1"/>
+                <w:szCs w:val="24"/>
+                <w:lang w:val="ru-RU" w:eastAsia="ru-RU"/>
+              </w:rPr>
+              <w:t>–</w:t>
+            </w:r>
+            <w:r>
+              <w:rPr>
+                <w:rFonts w:eastAsia="Times New Roman" w:cs="Times New Roman"/>
+                <w:color w:val="000000" w:themeColor="text1"/>
+                <w:szCs w:val="24"/>
+                <w:lang w:val="ru-RU" w:eastAsia="ru-RU"/>
+              </w:rPr>
+              <w:t xml:space="preserve"> 3 экз.</w:t>
+            </w:r>
+          </w:p>
+          <w:p>
+            <w:pPr>
+              <w:pStyle w:val="af2"/>
+              <w:numPr>
+                <w:ilvl w:val="0"/>
+                <w:numId w:val="15"/>
+              </w:numPr>
+              <w:spacing w:line="240" w:lineRule="auto"/>
+              <w:jc w:val="both"/>
+              <w:rPr>
+                <w:rFonts w:eastAsia="Times New Roman" w:cs="Times New Roman"/>
+                <w:color w:val="000000" w:themeColor="text1"/>
+                <w:szCs w:val="24"/>
+                <w:lang w:eastAsia="ru-RU"/>
+              </w:rPr>
+            </w:pPr>
+            <w:proofErr w:type="spellStart"/>
+            <w:r>
+              <w:rPr>
+                <w:rFonts w:eastAsia="Times New Roman" w:cs="Times New Roman"/>
+                <w:color w:val="000000" w:themeColor="text1"/>
+                <w:szCs w:val="24"/>
+                <w:lang w:eastAsia="ru-RU"/>
+              </w:rPr>
+              <w:t>Презентация</w:t>
+            </w:r>
+            <w:proofErr w:type="spellEnd"/>
+            <w:r>
+              <w:rPr>
+                <w:rFonts w:eastAsia="Times New Roman" w:cs="Times New Roman"/>
+                <w:color w:val="000000" w:themeColor="text1"/>
+                <w:szCs w:val="24"/>
+                <w:lang w:eastAsia="ru-RU"/>
+              </w:rPr>
+              <w:t xml:space="preserve"> </w:t>
+            </w:r>
+            <w:r>
+              <w:rPr>
+                <w:rFonts w:eastAsia="Times New Roman" w:cs="Times New Roman"/>
+                <w:color w:val="000000" w:themeColor="text1"/>
+                <w:szCs w:val="24"/>
+                <w:lang w:eastAsia="ru-RU"/>
+              </w:rPr>
+              <w:t>–</w:t>
+            </w:r>
+            <w:r>
+              <w:rPr>
+                <w:rFonts w:eastAsia="Times New Roman" w:cs="Times New Roman"/>
+                <w:color w:val="000000" w:themeColor="text1"/>
+                <w:szCs w:val="24"/>
+                <w:lang w:eastAsia="ru-RU"/>
+              </w:rPr>
+              <w:t xml:space="preserve"> 1 </w:t>
+            </w:r>
+            <w:proofErr w:type="spellStart"/>
+            <w:r>
+              <w:rPr>
+                <w:rFonts w:eastAsia="Times New Roman" w:cs="Times New Roman"/>
+                <w:color w:val="000000" w:themeColor="text1"/>
+                <w:szCs w:val="24"/>
+                <w:lang w:eastAsia="ru-RU"/>
+              </w:rPr>
+              <w:t>экз</w:t>
+            </w:r>
+            <w:proofErr w:type="spellEnd"/>
+            <w:r>
+              <w:rPr>
+                <w:rFonts w:eastAsia="Times New Roman" w:cs="Times New Roman"/>
+                <w:color w:val="000000" w:themeColor="text1"/>
+                <w:szCs w:val="24"/>
+                <w:lang w:eastAsia="ru-RU"/>
+              </w:rPr>
+              <w:t>.</w:t>
+            </w:r>
+          </w:p>
           <w:p>
             <w:pPr>
               <w:pStyle w:val="af2"/>
@@ -2565,24 +3231,6 @@
                 <w:lang w:val="ru-RU" w:eastAsia="ru-RU"/>
               </w:rPr>
             </w:pPr>
-            <w:r>
-              <w:rPr>
-                <w:rFonts w:eastAsia="Times New Roman" w:cs="Times New Roman"/>
-                <w:color w:val="000000" w:themeColor="text1"/>
-                <w:szCs w:val="24"/>
-                <w:lang w:val="ru-RU" w:eastAsia="ru-RU"/>
-              </w:rPr>
-              <w:t xml:space="preserve">1. </w:t>
-            </w:r>
-            <w:r>
-              <w:rPr>
-                <w:rFonts w:eastAsia="Times New Roman" w:cs="Times New Roman"/>
-                <w:color w:val="000000" w:themeColor="text1"/>
-                <w:szCs w:val="24"/>
-                <w:lang w:val="ru-RU" w:eastAsia="ru-RU"/>
-              </w:rPr>
-              <w:t>Список графической части</w:t>
-            </w:r>
           </w:p>
         </w:tc>
       </w:tr>
@@ -3399,18 +4047,27 @@
               <w:bottom w:val="single" w:sz="4" w:space="0" w:color="000000"/>
               <w:right w:val="single" w:sz="4" w:space="0" w:color="000000"/>
             </w:tcBorders>
-            <w:vAlign w:val="bottom"/>
-          </w:tcPr>
-          <w:p>
-            <w:pPr>
-              <w:spacing w:after="0" w:line="240" w:lineRule="auto"/>
-              <w:rPr>
-                <w:rFonts w:cs="Times New Roman"/>
-                <w:color w:val="000000"/>
-                <w:sz w:val="24"/>
-                <w:szCs w:val="24"/>
-              </w:rPr>
-            </w:pPr>
+            <w:vAlign w:val="center"/>
+          </w:tcPr>
+          <w:p>
+            <w:pPr>
+              <w:spacing w:after="0" w:line="240" w:lineRule="auto"/>
+              <w:rPr>
+                <w:rFonts w:cs="Times New Roman"/>
+                <w:color w:val="000000"/>
+                <w:sz w:val="24"/>
+                <w:szCs w:val="24"/>
+              </w:rPr>
+            </w:pPr>
+            <w:r>
+              <w:rPr>
+                <w:rFonts w:cs="Times New Roman"/>
+                <w:color w:val="000000"/>
+                <w:sz w:val="24"/>
+                <w:szCs w:val="24"/>
+              </w:rPr>
+              <w:t>Согласование темы с научным руководителем</w:t>
+            </w:r>
           </w:p>
         </w:tc>
         <w:tc>
@@ -3422,27 +4079,19 @@
               <w:bottom w:val="single" w:sz="4" w:space="0" w:color="000000"/>
               <w:right w:val="single" w:sz="4" w:space="0" w:color="000000"/>
             </w:tcBorders>
-            <w:vAlign w:val="bottom"/>
-          </w:tcPr>
-          <w:p>
-            <w:pPr>
-              <w:spacing w:after="0" w:line="240" w:lineRule="auto"/>
-              <w:rPr>
-                <w:rFonts w:cs="Times New Roman"/>
-                <w:color w:val="000000"/>
-                <w:sz w:val="24"/>
-                <w:szCs w:val="24"/>
-              </w:rPr>
-            </w:pPr>
-            <w:r>
-              <w:rPr>
-                <w:rFonts w:cs="Times New Roman"/>
-                <w:color w:val="000000"/>
-                <w:sz w:val="24"/>
-                <w:szCs w:val="24"/>
-              </w:rPr>
-              <w:t> </w:t>
-            </w:r>
+            <w:shd w:val="clear" w:color="auto" w:fill="7F7F7F" w:themeFill="text1" w:themeFillTint="80"/>
+            <w:vAlign w:val="bottom"/>
+          </w:tcPr>
+          <w:p>
+            <w:pPr>
+              <w:spacing w:after="0" w:line="240" w:lineRule="auto"/>
+              <w:rPr>
+                <w:rFonts w:cs="Times New Roman"/>
+                <w:color w:val="000000"/>
+                <w:sz w:val="24"/>
+                <w:szCs w:val="24"/>
+              </w:rPr>
+            </w:pPr>
           </w:p>
         </w:tc>
         <w:tc>
@@ -3466,15 +4115,6 @@
                 <w:szCs w:val="24"/>
               </w:rPr>
             </w:pPr>
-            <w:r>
-              <w:rPr>
-                <w:rFonts w:cs="Times New Roman"/>
-                <w:color w:val="000000"/>
-                <w:sz w:val="24"/>
-                <w:szCs w:val="24"/>
-              </w:rPr>
-              <w:t> </w:t>
-            </w:r>
           </w:p>
         </w:tc>
         <w:tc>
@@ -3498,15 +4138,6 @@
                 <w:szCs w:val="24"/>
               </w:rPr>
             </w:pPr>
-            <w:r>
-              <w:rPr>
-                <w:rFonts w:cs="Times New Roman"/>
-                <w:color w:val="000000"/>
-                <w:sz w:val="24"/>
-                <w:szCs w:val="24"/>
-              </w:rPr>
-              <w:t> </w:t>
-            </w:r>
           </w:p>
         </w:tc>
         <w:tc>
@@ -3530,15 +4161,6 @@
                 <w:szCs w:val="24"/>
               </w:rPr>
             </w:pPr>
-            <w:r>
-              <w:rPr>
-                <w:rFonts w:cs="Times New Roman"/>
-                <w:color w:val="000000"/>
-                <w:sz w:val="24"/>
-                <w:szCs w:val="24"/>
-              </w:rPr>
-              <w:t> </w:t>
-            </w:r>
           </w:p>
         </w:tc>
         <w:tc>
@@ -3562,15 +4184,6 @@
                 <w:szCs w:val="24"/>
               </w:rPr>
             </w:pPr>
-            <w:r>
-              <w:rPr>
-                <w:rFonts w:cs="Times New Roman"/>
-                <w:color w:val="000000"/>
-                <w:sz w:val="24"/>
-                <w:szCs w:val="24"/>
-              </w:rPr>
-              <w:t> </w:t>
-            </w:r>
           </w:p>
         </w:tc>
         <w:tc>
@@ -3594,15 +4207,6 @@
                 <w:szCs w:val="24"/>
               </w:rPr>
             </w:pPr>
-            <w:r>
-              <w:rPr>
-                <w:rFonts w:cs="Times New Roman"/>
-                <w:color w:val="000000"/>
-                <w:sz w:val="24"/>
-                <w:szCs w:val="24"/>
-              </w:rPr>
-              <w:t> </w:t>
-            </w:r>
           </w:p>
         </w:tc>
         <w:tc>
@@ -3626,15 +4230,6 @@
                 <w:szCs w:val="24"/>
               </w:rPr>
             </w:pPr>
-            <w:r>
-              <w:rPr>
-                <w:rFonts w:cs="Times New Roman"/>
-                <w:color w:val="000000"/>
-                <w:sz w:val="24"/>
-                <w:szCs w:val="24"/>
-              </w:rPr>
-              <w:t> </w:t>
-            </w:r>
           </w:p>
         </w:tc>
         <w:tc>
@@ -3658,15 +4253,6 @@
                 <w:szCs w:val="24"/>
               </w:rPr>
             </w:pPr>
-            <w:r>
-              <w:rPr>
-                <w:rFonts w:cs="Times New Roman"/>
-                <w:color w:val="000000"/>
-                <w:sz w:val="24"/>
-                <w:szCs w:val="24"/>
-              </w:rPr>
-              <w:t> </w:t>
-            </w:r>
           </w:p>
         </w:tc>
         <w:tc>
@@ -3690,15 +4276,6 @@
                 <w:szCs w:val="24"/>
               </w:rPr>
             </w:pPr>
-            <w:r>
-              <w:rPr>
-                <w:rFonts w:cs="Times New Roman"/>
-                <w:color w:val="000000"/>
-                <w:sz w:val="24"/>
-                <w:szCs w:val="24"/>
-              </w:rPr>
-              <w:t> </w:t>
-            </w:r>
           </w:p>
         </w:tc>
         <w:tc>
@@ -3722,15 +4299,6 @@
                 <w:szCs w:val="24"/>
               </w:rPr>
             </w:pPr>
-            <w:r>
-              <w:rPr>
-                <w:rFonts w:cs="Times New Roman"/>
-                <w:color w:val="000000"/>
-                <w:sz w:val="24"/>
-                <w:szCs w:val="24"/>
-              </w:rPr>
-              <w:t> </w:t>
-            </w:r>
           </w:p>
         </w:tc>
         <w:tc>
@@ -3754,15 +4322,6 @@
                 <w:szCs w:val="24"/>
               </w:rPr>
             </w:pPr>
-            <w:r>
-              <w:rPr>
-                <w:rFonts w:cs="Times New Roman"/>
-                <w:color w:val="000000"/>
-                <w:sz w:val="24"/>
-                <w:szCs w:val="24"/>
-              </w:rPr>
-              <w:t> </w:t>
-            </w:r>
           </w:p>
         </w:tc>
         <w:tc>
@@ -3786,15 +4345,6 @@
                 <w:szCs w:val="24"/>
               </w:rPr>
             </w:pPr>
-            <w:r>
-              <w:rPr>
-                <w:rFonts w:cs="Times New Roman"/>
-                <w:color w:val="000000"/>
-                <w:sz w:val="24"/>
-                <w:szCs w:val="24"/>
-              </w:rPr>
-              <w:t> </w:t>
-            </w:r>
           </w:p>
         </w:tc>
         <w:tc>
@@ -3818,15 +4368,6 @@
                 <w:szCs w:val="24"/>
               </w:rPr>
             </w:pPr>
-            <w:r>
-              <w:rPr>
-                <w:rFonts w:cs="Times New Roman"/>
-                <w:color w:val="000000"/>
-                <w:sz w:val="24"/>
-                <w:szCs w:val="24"/>
-              </w:rPr>
-              <w:t> </w:t>
-            </w:r>
           </w:p>
         </w:tc>
         <w:tc>
@@ -3850,15 +4391,6 @@
                 <w:szCs w:val="24"/>
               </w:rPr>
             </w:pPr>
-            <w:r>
-              <w:rPr>
-                <w:rFonts w:cs="Times New Roman"/>
-                <w:color w:val="000000"/>
-                <w:sz w:val="24"/>
-                <w:szCs w:val="24"/>
-              </w:rPr>
-              <w:t> </w:t>
-            </w:r>
           </w:p>
         </w:tc>
         <w:tc>
@@ -3882,15 +4414,6 @@
                 <w:szCs w:val="24"/>
               </w:rPr>
             </w:pPr>
-            <w:r>
-              <w:rPr>
-                <w:rFonts w:cs="Times New Roman"/>
-                <w:color w:val="000000"/>
-                <w:sz w:val="24"/>
-                <w:szCs w:val="24"/>
-              </w:rPr>
-              <w:t> </w:t>
-            </w:r>
           </w:p>
         </w:tc>
         <w:tc>
@@ -3914,15 +4437,6 @@
                 <w:szCs w:val="24"/>
               </w:rPr>
             </w:pPr>
-            <w:r>
-              <w:rPr>
-                <w:rFonts w:cs="Times New Roman"/>
-                <w:color w:val="000000"/>
-                <w:sz w:val="24"/>
-                <w:szCs w:val="24"/>
-              </w:rPr>
-              <w:t> </w:t>
-            </w:r>
           </w:p>
         </w:tc>
         <w:tc>
@@ -3946,15 +4460,6 @@
                 <w:szCs w:val="24"/>
               </w:rPr>
             </w:pPr>
-            <w:r>
-              <w:rPr>
-                <w:rFonts w:cs="Times New Roman"/>
-                <w:color w:val="000000"/>
-                <w:sz w:val="24"/>
-                <w:szCs w:val="24"/>
-              </w:rPr>
-              <w:t> </w:t>
-            </w:r>
           </w:p>
         </w:tc>
         <w:tc>
@@ -3978,15 +4483,6 @@
                 <w:szCs w:val="24"/>
               </w:rPr>
             </w:pPr>
-            <w:r>
-              <w:rPr>
-                <w:rFonts w:cs="Times New Roman"/>
-                <w:color w:val="000000"/>
-                <w:sz w:val="24"/>
-                <w:szCs w:val="24"/>
-              </w:rPr>
-              <w:t> </w:t>
-            </w:r>
           </w:p>
         </w:tc>
       </w:tr>
@@ -4003,18 +4499,27 @@
               <w:bottom w:val="single" w:sz="4" w:space="0" w:color="000000"/>
               <w:right w:val="single" w:sz="4" w:space="0" w:color="000000"/>
             </w:tcBorders>
-            <w:vAlign w:val="bottom"/>
-          </w:tcPr>
-          <w:p>
-            <w:pPr>
-              <w:spacing w:after="0" w:line="240" w:lineRule="auto"/>
-              <w:rPr>
-                <w:rFonts w:cs="Times New Roman"/>
-                <w:color w:val="000000"/>
-                <w:sz w:val="24"/>
-                <w:szCs w:val="24"/>
-              </w:rPr>
-            </w:pPr>
+            <w:vAlign w:val="center"/>
+          </w:tcPr>
+          <w:p>
+            <w:pPr>
+              <w:spacing w:after="0" w:line="240" w:lineRule="auto"/>
+              <w:rPr>
+                <w:rFonts w:cs="Times New Roman"/>
+                <w:color w:val="000000"/>
+                <w:sz w:val="24"/>
+                <w:szCs w:val="24"/>
+              </w:rPr>
+            </w:pPr>
+            <w:r>
+              <w:rPr>
+                <w:rFonts w:cs="Times New Roman"/>
+                <w:color w:val="000000"/>
+                <w:sz w:val="24"/>
+                <w:szCs w:val="24"/>
+              </w:rPr>
+              <w:t>Анализ предметной области и существующих решений</w:t>
+            </w:r>
           </w:p>
         </w:tc>
         <w:tc>
@@ -4033,15 +4538,15 @@
               <w:spacing w:after="0" w:line="240" w:lineRule="auto"/>
               <w:rPr>
                 <w:rFonts w:cs="Times New Roman"/>
-                <w:color w:val="FF0000"/>
-                <w:sz w:val="24"/>
-                <w:szCs w:val="24"/>
-              </w:rPr>
-            </w:pPr>
-            <w:r>
-              <w:rPr>
-                <w:rFonts w:cs="Times New Roman"/>
-                <w:color w:val="FF0000"/>
+                <w:color w:val="000000"/>
+                <w:sz w:val="24"/>
+                <w:szCs w:val="24"/>
+              </w:rPr>
+            </w:pPr>
+            <w:r>
+              <w:rPr>
+                <w:rFonts w:cs="Times New Roman"/>
+                <w:color w:val="000000"/>
                 <w:sz w:val="24"/>
                 <w:szCs w:val="24"/>
               </w:rPr>
@@ -4058,6 +4563,7 @@
               <w:bottom w:val="single" w:sz="4" w:space="0" w:color="000000"/>
               <w:right w:val="single" w:sz="4" w:space="0" w:color="000000"/>
             </w:tcBorders>
+            <w:shd w:val="clear" w:color="auto" w:fill="7F7F7F" w:themeFill="text1" w:themeFillTint="80"/>
             <w:vAlign w:val="bottom"/>
           </w:tcPr>
           <w:p>
@@ -4090,6 +4596,7 @@
               <w:bottom w:val="single" w:sz="4" w:space="0" w:color="000000"/>
               <w:right w:val="single" w:sz="4" w:space="0" w:color="000000"/>
             </w:tcBorders>
+            <w:shd w:val="clear" w:color="auto" w:fill="7F7F7F" w:themeFill="text1" w:themeFillTint="80"/>
             <w:vAlign w:val="bottom"/>
           </w:tcPr>
           <w:p>
@@ -4607,17 +5114,27 @@
               <w:bottom w:val="single" w:sz="4" w:space="0" w:color="000000"/>
               <w:right w:val="single" w:sz="4" w:space="0" w:color="000000"/>
             </w:tcBorders>
-            <w:vAlign w:val="bottom"/>
-          </w:tcPr>
-          <w:p>
-            <w:pPr>
-              <w:spacing w:after="0" w:line="240" w:lineRule="auto"/>
-              <w:rPr>
-                <w:rFonts w:cs="Times New Roman"/>
-                <w:sz w:val="24"/>
-                <w:szCs w:val="24"/>
-              </w:rPr>
-            </w:pPr>
+            <w:vAlign w:val="center"/>
+          </w:tcPr>
+          <w:p>
+            <w:pPr>
+              <w:spacing w:after="0" w:line="240" w:lineRule="auto"/>
+              <w:rPr>
+                <w:rFonts w:cs="Times New Roman"/>
+                <w:color w:val="000000"/>
+                <w:sz w:val="24"/>
+                <w:szCs w:val="24"/>
+              </w:rPr>
+            </w:pPr>
+            <w:r>
+              <w:rPr>
+                <w:rFonts w:cs="Times New Roman"/>
+                <w:color w:val="000000"/>
+                <w:sz w:val="24"/>
+                <w:szCs w:val="24"/>
+              </w:rPr>
+              <w:t>Обоснование технологического стека и формирование требований</w:t>
+            </w:r>
           </w:p>
         </w:tc>
         <w:tc>
@@ -4636,11 +5153,20 @@
               <w:spacing w:after="0" w:line="240" w:lineRule="auto"/>
               <w:rPr>
                 <w:rFonts w:cs="Times New Roman"/>
-                <w:color w:val="000000"/>
-                <w:sz w:val="24"/>
-                <w:szCs w:val="24"/>
-              </w:rPr>
-            </w:pPr>
+                <w:color w:val="FF0000"/>
+                <w:sz w:val="24"/>
+                <w:szCs w:val="24"/>
+              </w:rPr>
+            </w:pPr>
+            <w:r>
+              <w:rPr>
+                <w:rFonts w:cs="Times New Roman"/>
+                <w:color w:val="FF0000"/>
+                <w:sz w:val="24"/>
+                <w:szCs w:val="24"/>
+              </w:rPr>
+              <w:t> </w:t>
+            </w:r>
           </w:p>
         </w:tc>
         <w:tc>
@@ -4664,6 +5190,15 @@
                 <w:szCs w:val="24"/>
               </w:rPr>
             </w:pPr>
+            <w:r>
+              <w:rPr>
+                <w:rFonts w:cs="Times New Roman"/>
+                <w:color w:val="000000"/>
+                <w:sz w:val="24"/>
+                <w:szCs w:val="24"/>
+              </w:rPr>
+              <w:t> </w:t>
+            </w:r>
           </w:p>
         </w:tc>
         <w:tc>
@@ -4687,6 +5222,15 @@
                 <w:szCs w:val="24"/>
               </w:rPr>
             </w:pPr>
+            <w:r>
+              <w:rPr>
+                <w:rFonts w:cs="Times New Roman"/>
+                <w:color w:val="000000"/>
+                <w:sz w:val="24"/>
+                <w:szCs w:val="24"/>
+              </w:rPr>
+              <w:t> </w:t>
+            </w:r>
           </w:p>
         </w:tc>
         <w:tc>
@@ -4698,18 +5242,28 @@
               <w:bottom w:val="single" w:sz="4" w:space="0" w:color="000000"/>
               <w:right w:val="single" w:sz="4" w:space="0" w:color="000000"/>
             </w:tcBorders>
-            <w:vAlign w:val="bottom"/>
-          </w:tcPr>
-          <w:p>
-            <w:pPr>
-              <w:spacing w:after="0" w:line="240" w:lineRule="auto"/>
-              <w:rPr>
-                <w:rFonts w:cs="Times New Roman"/>
-                <w:color w:val="000000"/>
-                <w:sz w:val="24"/>
-                <w:szCs w:val="24"/>
-              </w:rPr>
-            </w:pPr>
+            <w:shd w:val="clear" w:color="auto" w:fill="7F7F7F" w:themeFill="text1" w:themeFillTint="80"/>
+            <w:vAlign w:val="bottom"/>
+          </w:tcPr>
+          <w:p>
+            <w:pPr>
+              <w:spacing w:after="0" w:line="240" w:lineRule="auto"/>
+              <w:rPr>
+                <w:rFonts w:cs="Times New Roman"/>
+                <w:color w:val="000000"/>
+                <w:sz w:val="24"/>
+                <w:szCs w:val="24"/>
+              </w:rPr>
+            </w:pPr>
+            <w:r>
+              <w:rPr>
+                <w:rFonts w:cs="Times New Roman"/>
+                <w:color w:val="000000"/>
+                <w:sz w:val="24"/>
+                <w:szCs w:val="24"/>
+              </w:rPr>
+              <w:t> </w:t>
+            </w:r>
           </w:p>
         </w:tc>
         <w:tc>
@@ -4733,6 +5287,15 @@
                 <w:szCs w:val="24"/>
               </w:rPr>
             </w:pPr>
+            <w:r>
+              <w:rPr>
+                <w:rFonts w:cs="Times New Roman"/>
+                <w:color w:val="000000"/>
+                <w:sz w:val="24"/>
+                <w:szCs w:val="24"/>
+              </w:rPr>
+              <w:t> </w:t>
+            </w:r>
           </w:p>
         </w:tc>
         <w:tc>
@@ -4756,6 +5319,15 @@
                 <w:szCs w:val="24"/>
               </w:rPr>
             </w:pPr>
+            <w:r>
+              <w:rPr>
+                <w:rFonts w:cs="Times New Roman"/>
+                <w:color w:val="000000"/>
+                <w:sz w:val="24"/>
+                <w:szCs w:val="24"/>
+              </w:rPr>
+              <w:t> </w:t>
+            </w:r>
           </w:p>
         </w:tc>
         <w:tc>
@@ -4779,6 +5351,15 @@
                 <w:szCs w:val="24"/>
               </w:rPr>
             </w:pPr>
+            <w:r>
+              <w:rPr>
+                <w:rFonts w:cs="Times New Roman"/>
+                <w:color w:val="000000"/>
+                <w:sz w:val="24"/>
+                <w:szCs w:val="24"/>
+              </w:rPr>
+              <w:t> </w:t>
+            </w:r>
           </w:p>
         </w:tc>
         <w:tc>
@@ -4802,6 +5383,15 @@
                 <w:szCs w:val="24"/>
               </w:rPr>
             </w:pPr>
+            <w:r>
+              <w:rPr>
+                <w:rFonts w:cs="Times New Roman"/>
+                <w:color w:val="000000"/>
+                <w:sz w:val="24"/>
+                <w:szCs w:val="24"/>
+              </w:rPr>
+              <w:t> </w:t>
+            </w:r>
           </w:p>
         </w:tc>
         <w:tc>
@@ -4825,6 +5415,15 @@
                 <w:szCs w:val="24"/>
               </w:rPr>
             </w:pPr>
+            <w:r>
+              <w:rPr>
+                <w:rFonts w:cs="Times New Roman"/>
+                <w:color w:val="000000"/>
+                <w:sz w:val="24"/>
+                <w:szCs w:val="24"/>
+              </w:rPr>
+              <w:t> </w:t>
+            </w:r>
           </w:p>
         </w:tc>
         <w:tc>
@@ -4848,6 +5447,15 @@
                 <w:szCs w:val="24"/>
               </w:rPr>
             </w:pPr>
+            <w:r>
+              <w:rPr>
+                <w:rFonts w:cs="Times New Roman"/>
+                <w:color w:val="000000"/>
+                <w:sz w:val="24"/>
+                <w:szCs w:val="24"/>
+              </w:rPr>
+              <w:t> </w:t>
+            </w:r>
           </w:p>
         </w:tc>
         <w:tc>
@@ -4871,6 +5479,15 @@
                 <w:szCs w:val="24"/>
               </w:rPr>
             </w:pPr>
+            <w:r>
+              <w:rPr>
+                <w:rFonts w:cs="Times New Roman"/>
+                <w:color w:val="000000"/>
+                <w:sz w:val="24"/>
+                <w:szCs w:val="24"/>
+              </w:rPr>
+              <w:t> </w:t>
+            </w:r>
           </w:p>
         </w:tc>
         <w:tc>
@@ -4894,6 +5511,15 @@
                 <w:szCs w:val="24"/>
               </w:rPr>
             </w:pPr>
+            <w:r>
+              <w:rPr>
+                <w:rFonts w:cs="Times New Roman"/>
+                <w:color w:val="000000"/>
+                <w:sz w:val="24"/>
+                <w:szCs w:val="24"/>
+              </w:rPr>
+              <w:t> </w:t>
+            </w:r>
           </w:p>
         </w:tc>
         <w:tc>
@@ -4917,6 +5543,15 @@
                 <w:szCs w:val="24"/>
               </w:rPr>
             </w:pPr>
+            <w:r>
+              <w:rPr>
+                <w:rFonts w:cs="Times New Roman"/>
+                <w:color w:val="000000"/>
+                <w:sz w:val="24"/>
+                <w:szCs w:val="24"/>
+              </w:rPr>
+              <w:t> </w:t>
+            </w:r>
           </w:p>
         </w:tc>
         <w:tc>
@@ -4940,6 +5575,15 @@
                 <w:szCs w:val="24"/>
               </w:rPr>
             </w:pPr>
+            <w:r>
+              <w:rPr>
+                <w:rFonts w:cs="Times New Roman"/>
+                <w:color w:val="000000"/>
+                <w:sz w:val="24"/>
+                <w:szCs w:val="24"/>
+              </w:rPr>
+              <w:t> </w:t>
+            </w:r>
           </w:p>
         </w:tc>
         <w:tc>
@@ -4963,6 +5607,15 @@
                 <w:szCs w:val="24"/>
               </w:rPr>
             </w:pPr>
+            <w:r>
+              <w:rPr>
+                <w:rFonts w:cs="Times New Roman"/>
+                <w:color w:val="000000"/>
+                <w:sz w:val="24"/>
+                <w:szCs w:val="24"/>
+              </w:rPr>
+              <w:t> </w:t>
+            </w:r>
           </w:p>
         </w:tc>
         <w:tc>
@@ -4986,6 +5639,15 @@
                 <w:szCs w:val="24"/>
               </w:rPr>
             </w:pPr>
+            <w:r>
+              <w:rPr>
+                <w:rFonts w:cs="Times New Roman"/>
+                <w:color w:val="000000"/>
+                <w:sz w:val="24"/>
+                <w:szCs w:val="24"/>
+              </w:rPr>
+              <w:t> </w:t>
+            </w:r>
           </w:p>
         </w:tc>
         <w:tc>
@@ -5009,6 +5671,15 @@
                 <w:szCs w:val="24"/>
               </w:rPr>
             </w:pPr>
+            <w:r>
+              <w:rPr>
+                <w:rFonts w:cs="Times New Roman"/>
+                <w:color w:val="000000"/>
+                <w:sz w:val="24"/>
+                <w:szCs w:val="24"/>
+              </w:rPr>
+              <w:t> </w:t>
+            </w:r>
           </w:p>
         </w:tc>
         <w:tc>
@@ -5032,6 +5703,15 @@
                 <w:szCs w:val="24"/>
               </w:rPr>
             </w:pPr>
+            <w:r>
+              <w:rPr>
+                <w:rFonts w:cs="Times New Roman"/>
+                <w:color w:val="000000"/>
+                <w:sz w:val="24"/>
+                <w:szCs w:val="24"/>
+              </w:rPr>
+              <w:t> </w:t>
+            </w:r>
           </w:p>
         </w:tc>
       </w:tr>
@@ -5048,17 +5728,25 @@
               <w:bottom w:val="single" w:sz="4" w:space="0" w:color="000000"/>
               <w:right w:val="single" w:sz="4" w:space="0" w:color="000000"/>
             </w:tcBorders>
-            <w:vAlign w:val="bottom"/>
-          </w:tcPr>
-          <w:p>
-            <w:pPr>
-              <w:spacing w:after="0" w:line="240" w:lineRule="auto"/>
-              <w:rPr>
-                <w:rFonts w:cs="Times New Roman"/>
-                <w:sz w:val="24"/>
-                <w:szCs w:val="24"/>
-              </w:rPr>
-            </w:pPr>
+            <w:vAlign w:val="center"/>
+          </w:tcPr>
+          <w:p>
+            <w:pPr>
+              <w:spacing w:after="0" w:line="240" w:lineRule="auto"/>
+              <w:rPr>
+                <w:rFonts w:cs="Times New Roman"/>
+                <w:sz w:val="24"/>
+                <w:szCs w:val="24"/>
+              </w:rPr>
+            </w:pPr>
+            <w:r>
+              <w:rPr>
+                <w:rFonts w:cs="Times New Roman"/>
+                <w:sz w:val="24"/>
+                <w:szCs w:val="24"/>
+              </w:rPr>
+              <w:t>Проектирование архитектуры системы</w:t>
+            </w:r>
           </w:p>
         </w:tc>
         <w:tc>
@@ -5162,6 +5850,7 @@
               <w:bottom w:val="single" w:sz="4" w:space="0" w:color="000000"/>
               <w:right w:val="single" w:sz="4" w:space="0" w:color="000000"/>
             </w:tcBorders>
+            <w:shd w:val="clear" w:color="auto" w:fill="7F7F7F" w:themeFill="text1" w:themeFillTint="80"/>
             <w:vAlign w:val="bottom"/>
           </w:tcPr>
           <w:p>
@@ -5185,6 +5874,7 @@
               <w:bottom w:val="single" w:sz="4" w:space="0" w:color="000000"/>
               <w:right w:val="single" w:sz="4" w:space="0" w:color="000000"/>
             </w:tcBorders>
+            <w:shd w:val="clear" w:color="auto" w:fill="7F7F7F" w:themeFill="text1" w:themeFillTint="80"/>
             <w:vAlign w:val="bottom"/>
           </w:tcPr>
           <w:p>
@@ -5208,6 +5898,7 @@
               <w:bottom w:val="single" w:sz="4" w:space="0" w:color="000000"/>
               <w:right w:val="single" w:sz="4" w:space="0" w:color="000000"/>
             </w:tcBorders>
+            <w:shd w:val="clear" w:color="auto" w:fill="7F7F7F" w:themeFill="text1" w:themeFillTint="80"/>
             <w:vAlign w:val="bottom"/>
           </w:tcPr>
           <w:p>
@@ -5238,7 +5929,7 @@
               <w:spacing w:after="0" w:line="240" w:lineRule="auto"/>
               <w:rPr>
                 <w:rFonts w:cs="Times New Roman"/>
-                <w:color w:val="FF0000"/>
+                <w:color w:val="000000"/>
                 <w:sz w:val="24"/>
                 <w:szCs w:val="24"/>
               </w:rPr>
@@ -5261,7 +5952,7 @@
               <w:spacing w:after="0" w:line="240" w:lineRule="auto"/>
               <w:rPr>
                 <w:rFonts w:cs="Times New Roman"/>
-                <w:color w:val="FF0000"/>
+                <w:color w:val="000000"/>
                 <w:sz w:val="24"/>
                 <w:szCs w:val="24"/>
               </w:rPr>
@@ -5489,18 +6180,25 @@
               <w:bottom w:val="single" w:sz="4" w:space="0" w:color="000000"/>
               <w:right w:val="single" w:sz="4" w:space="0" w:color="000000"/>
             </w:tcBorders>
-            <w:vAlign w:val="bottom"/>
-          </w:tcPr>
-          <w:p>
-            <w:pPr>
-              <w:spacing w:after="0" w:line="240" w:lineRule="auto"/>
-              <w:rPr>
-                <w:rFonts w:cs="Times New Roman"/>
-                <w:color w:val="000000"/>
-                <w:sz w:val="24"/>
-                <w:szCs w:val="24"/>
-              </w:rPr>
-            </w:pPr>
+            <w:vAlign w:val="center"/>
+          </w:tcPr>
+          <w:p>
+            <w:pPr>
+              <w:spacing w:after="0" w:line="240" w:lineRule="auto"/>
+              <w:rPr>
+                <w:rFonts w:cs="Times New Roman"/>
+                <w:sz w:val="24"/>
+                <w:szCs w:val="24"/>
+              </w:rPr>
+            </w:pPr>
+            <w:r>
+              <w:rPr>
+                <w:rFonts w:cs="Times New Roman"/>
+                <w:sz w:val="24"/>
+                <w:szCs w:val="24"/>
+              </w:rPr>
+              <w:t>Разработка модулей управления процессами и проксирования</w:t>
+            </w:r>
           </w:p>
         </w:tc>
         <w:tc>
@@ -5524,15 +6222,6 @@
                 <w:szCs w:val="24"/>
               </w:rPr>
             </w:pPr>
-            <w:r>
-              <w:rPr>
-                <w:rFonts w:cs="Times New Roman"/>
-                <w:color w:val="000000"/>
-                <w:sz w:val="24"/>
-                <w:szCs w:val="24"/>
-              </w:rPr>
-              <w:t> </w:t>
-            </w:r>
           </w:p>
         </w:tc>
         <w:tc>
@@ -5556,15 +6245,6 @@
                 <w:szCs w:val="24"/>
               </w:rPr>
             </w:pPr>
-            <w:r>
-              <w:rPr>
-                <w:rFonts w:cs="Times New Roman"/>
-                <w:color w:val="000000"/>
-                <w:sz w:val="24"/>
-                <w:szCs w:val="24"/>
-              </w:rPr>
-              <w:t> </w:t>
-            </w:r>
           </w:p>
         </w:tc>
         <w:tc>
@@ -5588,15 +6268,6 @@
                 <w:szCs w:val="24"/>
               </w:rPr>
             </w:pPr>
-            <w:r>
-              <w:rPr>
-                <w:rFonts w:cs="Times New Roman"/>
-                <w:color w:val="000000"/>
-                <w:sz w:val="24"/>
-                <w:szCs w:val="24"/>
-              </w:rPr>
-              <w:t> </w:t>
-            </w:r>
           </w:p>
         </w:tc>
         <w:tc>
@@ -5620,15 +6291,6 @@
                 <w:szCs w:val="24"/>
               </w:rPr>
             </w:pPr>
-            <w:r>
-              <w:rPr>
-                <w:rFonts w:cs="Times New Roman"/>
-                <w:color w:val="000000"/>
-                <w:sz w:val="24"/>
-                <w:szCs w:val="24"/>
-              </w:rPr>
-              <w:t> </w:t>
-            </w:r>
           </w:p>
         </w:tc>
         <w:tc>
@@ -5652,15 +6314,6 @@
                 <w:szCs w:val="24"/>
               </w:rPr>
             </w:pPr>
-            <w:r>
-              <w:rPr>
-                <w:rFonts w:cs="Times New Roman"/>
-                <w:color w:val="000000"/>
-                <w:sz w:val="24"/>
-                <w:szCs w:val="24"/>
-              </w:rPr>
-              <w:t> </w:t>
-            </w:r>
           </w:p>
         </w:tc>
         <w:tc>
@@ -5684,15 +6337,6 @@
                 <w:szCs w:val="24"/>
               </w:rPr>
             </w:pPr>
-            <w:r>
-              <w:rPr>
-                <w:rFonts w:cs="Times New Roman"/>
-                <w:color w:val="000000"/>
-                <w:sz w:val="24"/>
-                <w:szCs w:val="24"/>
-              </w:rPr>
-              <w:t> </w:t>
-            </w:r>
           </w:p>
         </w:tc>
         <w:tc>
@@ -5716,15 +6360,6 @@
                 <w:szCs w:val="24"/>
               </w:rPr>
             </w:pPr>
-            <w:r>
-              <w:rPr>
-                <w:rFonts w:cs="Times New Roman"/>
-                <w:color w:val="000000"/>
-                <w:sz w:val="24"/>
-                <w:szCs w:val="24"/>
-              </w:rPr>
-              <w:t> </w:t>
-            </w:r>
           </w:p>
         </w:tc>
         <w:tc>
@@ -5736,14 +6371,15 @@
               <w:bottom w:val="single" w:sz="4" w:space="0" w:color="000000"/>
               <w:right w:val="single" w:sz="4" w:space="0" w:color="000000"/>
             </w:tcBorders>
-            <w:vAlign w:val="bottom"/>
-          </w:tcPr>
-          <w:p>
-            <w:pPr>
-              <w:spacing w:after="0" w:line="240" w:lineRule="auto"/>
-              <w:rPr>
-                <w:rFonts w:cs="Times New Roman"/>
-                <w:color w:val="000000"/>
+            <w:shd w:val="clear" w:color="auto" w:fill="7F7F7F" w:themeFill="text1" w:themeFillTint="80"/>
+            <w:vAlign w:val="bottom"/>
+          </w:tcPr>
+          <w:p>
+            <w:pPr>
+              <w:spacing w:after="0" w:line="240" w:lineRule="auto"/>
+              <w:rPr>
+                <w:rFonts w:cs="Times New Roman"/>
+                <w:color w:val="FF0000"/>
                 <w:sz w:val="24"/>
                 <w:szCs w:val="24"/>
               </w:rPr>
@@ -5759,27 +6395,19 @@
               <w:bottom w:val="single" w:sz="4" w:space="0" w:color="000000"/>
               <w:right w:val="single" w:sz="4" w:space="0" w:color="000000"/>
             </w:tcBorders>
-            <w:vAlign w:val="bottom"/>
-          </w:tcPr>
-          <w:p>
-            <w:pPr>
-              <w:spacing w:after="0" w:line="240" w:lineRule="auto"/>
-              <w:rPr>
-                <w:rFonts w:cs="Times New Roman"/>
-                <w:color w:val="000000"/>
-                <w:sz w:val="24"/>
-                <w:szCs w:val="24"/>
-              </w:rPr>
-            </w:pPr>
-            <w:r>
-              <w:rPr>
-                <w:rFonts w:cs="Times New Roman"/>
-                <w:color w:val="000000"/>
-                <w:sz w:val="24"/>
-                <w:szCs w:val="24"/>
-              </w:rPr>
-              <w:t> </w:t>
-            </w:r>
+            <w:shd w:val="clear" w:color="auto" w:fill="7F7F7F" w:themeFill="text1" w:themeFillTint="80"/>
+            <w:vAlign w:val="bottom"/>
+          </w:tcPr>
+          <w:p>
+            <w:pPr>
+              <w:spacing w:after="0" w:line="240" w:lineRule="auto"/>
+              <w:rPr>
+                <w:rFonts w:cs="Times New Roman"/>
+                <w:color w:val="FF0000"/>
+                <w:sz w:val="24"/>
+                <w:szCs w:val="24"/>
+              </w:rPr>
+            </w:pPr>
           </w:p>
         </w:tc>
         <w:tc>
@@ -5791,27 +6419,19 @@
               <w:bottom w:val="single" w:sz="4" w:space="0" w:color="000000"/>
               <w:right w:val="single" w:sz="4" w:space="0" w:color="000000"/>
             </w:tcBorders>
-            <w:vAlign w:val="bottom"/>
-          </w:tcPr>
-          <w:p>
-            <w:pPr>
-              <w:spacing w:after="0" w:line="240" w:lineRule="auto"/>
-              <w:rPr>
-                <w:rFonts w:cs="Times New Roman"/>
-                <w:color w:val="000000"/>
-                <w:sz w:val="24"/>
-                <w:szCs w:val="24"/>
-              </w:rPr>
-            </w:pPr>
-            <w:r>
-              <w:rPr>
-                <w:rFonts w:cs="Times New Roman"/>
-                <w:color w:val="000000"/>
-                <w:sz w:val="24"/>
-                <w:szCs w:val="24"/>
-              </w:rPr>
-              <w:t> </w:t>
-            </w:r>
+            <w:shd w:val="clear" w:color="auto" w:fill="7F7F7F" w:themeFill="text1" w:themeFillTint="80"/>
+            <w:vAlign w:val="bottom"/>
+          </w:tcPr>
+          <w:p>
+            <w:pPr>
+              <w:spacing w:after="0" w:line="240" w:lineRule="auto"/>
+              <w:rPr>
+                <w:rFonts w:cs="Times New Roman"/>
+                <w:color w:val="000000"/>
+                <w:sz w:val="24"/>
+                <w:szCs w:val="24"/>
+              </w:rPr>
+            </w:pPr>
           </w:p>
         </w:tc>
         <w:tc>
@@ -5823,27 +6443,19 @@
               <w:bottom w:val="single" w:sz="4" w:space="0" w:color="000000"/>
               <w:right w:val="single" w:sz="4" w:space="0" w:color="000000"/>
             </w:tcBorders>
-            <w:vAlign w:val="bottom"/>
-          </w:tcPr>
-          <w:p>
-            <w:pPr>
-              <w:spacing w:after="0" w:line="240" w:lineRule="auto"/>
-              <w:rPr>
-                <w:rFonts w:cs="Times New Roman"/>
-                <w:color w:val="000000"/>
-                <w:sz w:val="24"/>
-                <w:szCs w:val="24"/>
-              </w:rPr>
-            </w:pPr>
-            <w:r>
-              <w:rPr>
-                <w:rFonts w:cs="Times New Roman"/>
-                <w:color w:val="000000"/>
-                <w:sz w:val="24"/>
-                <w:szCs w:val="24"/>
-              </w:rPr>
-              <w:t> </w:t>
-            </w:r>
+            <w:shd w:val="clear" w:color="auto" w:fill="7F7F7F" w:themeFill="text1" w:themeFillTint="80"/>
+            <w:vAlign w:val="bottom"/>
+          </w:tcPr>
+          <w:p>
+            <w:pPr>
+              <w:spacing w:after="0" w:line="240" w:lineRule="auto"/>
+              <w:rPr>
+                <w:rFonts w:cs="Times New Roman"/>
+                <w:color w:val="000000"/>
+                <w:sz w:val="24"/>
+                <w:szCs w:val="24"/>
+              </w:rPr>
+            </w:pPr>
           </w:p>
         </w:tc>
         <w:tc>
@@ -5867,15 +6479,6 @@
                 <w:szCs w:val="24"/>
               </w:rPr>
             </w:pPr>
-            <w:r>
-              <w:rPr>
-                <w:rFonts w:cs="Times New Roman"/>
-                <w:color w:val="000000"/>
-                <w:sz w:val="24"/>
-                <w:szCs w:val="24"/>
-              </w:rPr>
-              <w:t> </w:t>
-            </w:r>
           </w:p>
         </w:tc>
         <w:tc>
@@ -5899,15 +6502,6 @@
                 <w:szCs w:val="24"/>
               </w:rPr>
             </w:pPr>
-            <w:r>
-              <w:rPr>
-                <w:rFonts w:cs="Times New Roman"/>
-                <w:color w:val="000000"/>
-                <w:sz w:val="24"/>
-                <w:szCs w:val="24"/>
-              </w:rPr>
-              <w:t> </w:t>
-            </w:r>
           </w:p>
         </w:tc>
         <w:tc>
@@ -5931,15 +6525,6 @@
                 <w:szCs w:val="24"/>
               </w:rPr>
             </w:pPr>
-            <w:r>
-              <w:rPr>
-                <w:rFonts w:cs="Times New Roman"/>
-                <w:color w:val="000000"/>
-                <w:sz w:val="24"/>
-                <w:szCs w:val="24"/>
-              </w:rPr>
-              <w:t> </w:t>
-            </w:r>
           </w:p>
         </w:tc>
         <w:tc>
@@ -5963,15 +6548,6 @@
                 <w:szCs w:val="24"/>
               </w:rPr>
             </w:pPr>
-            <w:r>
-              <w:rPr>
-                <w:rFonts w:cs="Times New Roman"/>
-                <w:color w:val="000000"/>
-                <w:sz w:val="24"/>
-                <w:szCs w:val="24"/>
-              </w:rPr>
-              <w:t> </w:t>
-            </w:r>
           </w:p>
         </w:tc>
         <w:tc>
@@ -5995,15 +6571,6 @@
                 <w:szCs w:val="24"/>
               </w:rPr>
             </w:pPr>
-            <w:r>
-              <w:rPr>
-                <w:rFonts w:cs="Times New Roman"/>
-                <w:color w:val="000000"/>
-                <w:sz w:val="24"/>
-                <w:szCs w:val="24"/>
-              </w:rPr>
-              <w:t> </w:t>
-            </w:r>
           </w:p>
         </w:tc>
         <w:tc>
@@ -6027,15 +6594,6 @@
                 <w:szCs w:val="24"/>
               </w:rPr>
             </w:pPr>
-            <w:r>
-              <w:rPr>
-                <w:rFonts w:cs="Times New Roman"/>
-                <w:color w:val="000000"/>
-                <w:sz w:val="24"/>
-                <w:szCs w:val="24"/>
-              </w:rPr>
-              <w:t> </w:t>
-            </w:r>
           </w:p>
         </w:tc>
         <w:tc>
@@ -6059,15 +6617,6 @@
                 <w:szCs w:val="24"/>
               </w:rPr>
             </w:pPr>
-            <w:r>
-              <w:rPr>
-                <w:rFonts w:cs="Times New Roman"/>
-                <w:color w:val="000000"/>
-                <w:sz w:val="24"/>
-                <w:szCs w:val="24"/>
-              </w:rPr>
-              <w:t> </w:t>
-            </w:r>
           </w:p>
         </w:tc>
       </w:tr>
@@ -6084,17 +6633,27 @@
               <w:bottom w:val="single" w:sz="4" w:space="0" w:color="000000"/>
               <w:right w:val="single" w:sz="4" w:space="0" w:color="000000"/>
             </w:tcBorders>
-            <w:vAlign w:val="bottom"/>
-          </w:tcPr>
-          <w:p>
-            <w:pPr>
-              <w:spacing w:after="0" w:line="240" w:lineRule="auto"/>
-              <w:rPr>
-                <w:rFonts w:cs="Times New Roman"/>
-                <w:sz w:val="24"/>
-                <w:szCs w:val="24"/>
-              </w:rPr>
-            </w:pPr>
+            <w:vAlign w:val="center"/>
+          </w:tcPr>
+          <w:p>
+            <w:pPr>
+              <w:spacing w:after="0" w:line="240" w:lineRule="auto"/>
+              <w:rPr>
+                <w:rFonts w:cs="Times New Roman"/>
+                <w:color w:val="000000"/>
+                <w:sz w:val="24"/>
+                <w:szCs w:val="24"/>
+              </w:rPr>
+            </w:pPr>
+            <w:r>
+              <w:rPr>
+                <w:rFonts w:cs="Times New Roman"/>
+                <w:color w:val="000000"/>
+                <w:sz w:val="24"/>
+                <w:szCs w:val="24"/>
+              </w:rPr>
+              <w:t>Реализация веб-интерфейса и модуля мониторинга</w:t>
+            </w:r>
           </w:p>
         </w:tc>
         <w:tc>
@@ -6342,6 +6901,29 @@
                 <w:szCs w:val="24"/>
               </w:rPr>
             </w:pPr>
+          </w:p>
+        </w:tc>
+        <w:tc>
+          <w:tcPr>
+            <w:tcW w:w="322" w:type="dxa"/>
+            <w:tcBorders>
+              <w:top w:val="nil"/>
+              <w:left w:val="nil"/>
+              <w:bottom w:val="single" w:sz="4" w:space="0" w:color="000000"/>
+              <w:right w:val="single" w:sz="4" w:space="0" w:color="000000"/>
+            </w:tcBorders>
+            <w:vAlign w:val="bottom"/>
+          </w:tcPr>
+          <w:p>
+            <w:pPr>
+              <w:spacing w:after="0" w:line="240" w:lineRule="auto"/>
+              <w:rPr>
+                <w:rFonts w:cs="Times New Roman"/>
+                <w:color w:val="000000"/>
+                <w:sz w:val="24"/>
+                <w:szCs w:val="24"/>
+              </w:rPr>
+            </w:pPr>
             <w:r>
               <w:rPr>
                 <w:rFonts w:cs="Times New Roman"/>
@@ -6355,7 +6937,7 @@
         </w:tc>
         <w:tc>
           <w:tcPr>
-            <w:tcW w:w="322" w:type="dxa"/>
+            <w:tcW w:w="416" w:type="dxa"/>
             <w:tcBorders>
               <w:top w:val="nil"/>
               <w:left w:val="nil"/>
@@ -6426,6 +7008,7 @@
               <w:bottom w:val="single" w:sz="4" w:space="0" w:color="000000"/>
               <w:right w:val="single" w:sz="4" w:space="0" w:color="000000"/>
             </w:tcBorders>
+            <w:shd w:val="clear" w:color="auto" w:fill="7F7F7F" w:themeFill="text1" w:themeFillTint="80"/>
             <w:vAlign w:val="bottom"/>
           </w:tcPr>
           <w:p>
@@ -6458,38 +7041,7 @@
               <w:bottom w:val="single" w:sz="4" w:space="0" w:color="000000"/>
               <w:right w:val="single" w:sz="4" w:space="0" w:color="000000"/>
             </w:tcBorders>
-            <w:vAlign w:val="bottom"/>
-          </w:tcPr>
-          <w:p>
-            <w:pPr>
-              <w:spacing w:after="0" w:line="240" w:lineRule="auto"/>
-              <w:rPr>
-                <w:rFonts w:cs="Times New Roman"/>
-                <w:color w:val="000000"/>
-                <w:sz w:val="24"/>
-                <w:szCs w:val="24"/>
-              </w:rPr>
-            </w:pPr>
-            <w:r>
-              <w:rPr>
-                <w:rFonts w:cs="Times New Roman"/>
-                <w:color w:val="000000"/>
-                <w:sz w:val="24"/>
-                <w:szCs w:val="24"/>
-              </w:rPr>
-              <w:t> </w:t>
-            </w:r>
-          </w:p>
-        </w:tc>
-        <w:tc>
-          <w:tcPr>
-            <w:tcW w:w="416" w:type="dxa"/>
-            <w:tcBorders>
-              <w:top w:val="nil"/>
-              <w:left w:val="nil"/>
-              <w:bottom w:val="single" w:sz="4" w:space="0" w:color="000000"/>
-              <w:right w:val="single" w:sz="4" w:space="0" w:color="000000"/>
-            </w:tcBorders>
+            <w:shd w:val="clear" w:color="auto" w:fill="7F7F7F" w:themeFill="text1" w:themeFillTint="80"/>
             <w:vAlign w:val="bottom"/>
           </w:tcPr>
           <w:p>
@@ -6687,17 +7239,25 @@
               <w:bottom w:val="single" w:sz="4" w:space="0" w:color="000000"/>
               <w:right w:val="single" w:sz="4" w:space="0" w:color="000000"/>
             </w:tcBorders>
-            <w:vAlign w:val="bottom"/>
-          </w:tcPr>
-          <w:p>
-            <w:pPr>
-              <w:spacing w:after="0" w:line="240" w:lineRule="auto"/>
-              <w:rPr>
-                <w:rFonts w:cs="Times New Roman"/>
-                <w:sz w:val="24"/>
-                <w:szCs w:val="24"/>
-              </w:rPr>
-            </w:pPr>
+            <w:vAlign w:val="center"/>
+          </w:tcPr>
+          <w:p>
+            <w:pPr>
+              <w:spacing w:after="0" w:line="240" w:lineRule="auto"/>
+              <w:rPr>
+                <w:rFonts w:cs="Times New Roman"/>
+                <w:sz w:val="24"/>
+                <w:szCs w:val="24"/>
+              </w:rPr>
+            </w:pPr>
+            <w:r>
+              <w:rPr>
+                <w:rFonts w:cs="Times New Roman"/>
+                <w:sz w:val="24"/>
+                <w:szCs w:val="24"/>
+              </w:rPr>
+              <w:t>Тестирование и развёртывание в среде Astra Linux</w:t>
+            </w:r>
           </w:p>
         </w:tc>
         <w:tc>
@@ -7125,6 +7685,7 @@
               <w:bottom w:val="single" w:sz="4" w:space="0" w:color="000000"/>
               <w:right w:val="single" w:sz="4" w:space="0" w:color="000000"/>
             </w:tcBorders>
+            <w:shd w:val="clear" w:color="auto" w:fill="7F7F7F" w:themeFill="text1" w:themeFillTint="80"/>
             <w:vAlign w:val="bottom"/>
           </w:tcPr>
           <w:p>
@@ -7157,6 +7718,7 @@
               <w:bottom w:val="single" w:sz="4" w:space="0" w:color="000000"/>
               <w:right w:val="single" w:sz="4" w:space="0" w:color="000000"/>
             </w:tcBorders>
+            <w:shd w:val="clear" w:color="auto" w:fill="7F7F7F" w:themeFill="text1" w:themeFillTint="80"/>
             <w:vAlign w:val="bottom"/>
           </w:tcPr>
           <w:p>
@@ -7287,20 +7849,28 @@
             <w:tcBorders>
               <w:top w:val="nil"/>
               <w:left w:val="single" w:sz="4" w:space="0" w:color="000000"/>
-              <w:bottom w:val="single" w:sz="4" w:space="0" w:color="auto"/>
-              <w:right w:val="single" w:sz="4" w:space="0" w:color="000000"/>
-            </w:tcBorders>
-            <w:vAlign w:val="bottom"/>
-          </w:tcPr>
-          <w:p>
-            <w:pPr>
-              <w:spacing w:after="0" w:line="240" w:lineRule="auto"/>
-              <w:rPr>
-                <w:rFonts w:cs="Times New Roman"/>
-                <w:sz w:val="24"/>
-                <w:szCs w:val="24"/>
-              </w:rPr>
-            </w:pPr>
+              <w:bottom w:val="single" w:sz="4" w:space="0" w:color="000000"/>
+              <w:right w:val="single" w:sz="4" w:space="0" w:color="000000"/>
+            </w:tcBorders>
+            <w:vAlign w:val="center"/>
+          </w:tcPr>
+          <w:p>
+            <w:pPr>
+              <w:spacing w:after="0" w:line="240" w:lineRule="auto"/>
+              <w:rPr>
+                <w:rFonts w:cs="Times New Roman"/>
+                <w:sz w:val="24"/>
+                <w:szCs w:val="24"/>
+              </w:rPr>
+            </w:pPr>
+            <w:r>
+              <w:rPr>
+                <w:rFonts w:cs="Times New Roman"/>
+                <w:sz w:val="24"/>
+                <w:szCs w:val="24"/>
+              </w:rPr>
+              <w:t>Оформление пояснительной записки ВКР</w:t>
+            </w:r>
           </w:p>
         </w:tc>
         <w:tc>
@@ -7309,7 +7879,7 @@
             <w:tcBorders>
               <w:top w:val="nil"/>
               <w:left w:val="nil"/>
-              <w:bottom w:val="single" w:sz="4" w:space="0" w:color="auto"/>
+              <w:bottom w:val="single" w:sz="4" w:space="0" w:color="000000"/>
               <w:right w:val="single" w:sz="4" w:space="0" w:color="000000"/>
             </w:tcBorders>
             <w:vAlign w:val="bottom"/>
@@ -7341,7 +7911,7 @@
             <w:tcBorders>
               <w:top w:val="nil"/>
               <w:left w:val="nil"/>
-              <w:bottom w:val="single" w:sz="4" w:space="0" w:color="auto"/>
+              <w:bottom w:val="single" w:sz="4" w:space="0" w:color="000000"/>
               <w:right w:val="single" w:sz="4" w:space="0" w:color="000000"/>
             </w:tcBorders>
             <w:vAlign w:val="bottom"/>
@@ -7373,7 +7943,7 @@
             <w:tcBorders>
               <w:top w:val="nil"/>
               <w:left w:val="nil"/>
-              <w:bottom w:val="single" w:sz="4" w:space="0" w:color="auto"/>
+              <w:bottom w:val="single" w:sz="4" w:space="0" w:color="000000"/>
               <w:right w:val="single" w:sz="4" w:space="0" w:color="000000"/>
             </w:tcBorders>
             <w:vAlign w:val="bottom"/>
@@ -7405,7 +7975,7 @@
             <w:tcBorders>
               <w:top w:val="nil"/>
               <w:left w:val="nil"/>
-              <w:bottom w:val="single" w:sz="4" w:space="0" w:color="auto"/>
+              <w:bottom w:val="single" w:sz="4" w:space="0" w:color="000000"/>
               <w:right w:val="single" w:sz="4" w:space="0" w:color="000000"/>
             </w:tcBorders>
             <w:vAlign w:val="bottom"/>
@@ -7437,7 +8007,7 @@
             <w:tcBorders>
               <w:top w:val="nil"/>
               <w:left w:val="nil"/>
-              <w:bottom w:val="single" w:sz="4" w:space="0" w:color="auto"/>
+              <w:bottom w:val="single" w:sz="4" w:space="0" w:color="000000"/>
               <w:right w:val="single" w:sz="4" w:space="0" w:color="000000"/>
             </w:tcBorders>
             <w:vAlign w:val="bottom"/>
@@ -7469,7 +8039,7 @@
             <w:tcBorders>
               <w:top w:val="nil"/>
               <w:left w:val="nil"/>
-              <w:bottom w:val="single" w:sz="4" w:space="0" w:color="auto"/>
+              <w:bottom w:val="single" w:sz="4" w:space="0" w:color="000000"/>
               <w:right w:val="single" w:sz="4" w:space="0" w:color="000000"/>
             </w:tcBorders>
             <w:vAlign w:val="bottom"/>
@@ -7501,7 +8071,7 @@
             <w:tcBorders>
               <w:top w:val="nil"/>
               <w:left w:val="nil"/>
-              <w:bottom w:val="single" w:sz="4" w:space="0" w:color="auto"/>
+              <w:bottom w:val="single" w:sz="4" w:space="0" w:color="000000"/>
               <w:right w:val="single" w:sz="4" w:space="0" w:color="000000"/>
             </w:tcBorders>
             <w:vAlign w:val="bottom"/>
@@ -7533,7 +8103,7 @@
             <w:tcBorders>
               <w:top w:val="nil"/>
               <w:left w:val="nil"/>
-              <w:bottom w:val="single" w:sz="4" w:space="0" w:color="auto"/>
+              <w:bottom w:val="single" w:sz="4" w:space="0" w:color="000000"/>
               <w:right w:val="single" w:sz="4" w:space="0" w:color="000000"/>
             </w:tcBorders>
             <w:vAlign w:val="bottom"/>
@@ -7565,7 +8135,7 @@
             <w:tcBorders>
               <w:top w:val="nil"/>
               <w:left w:val="nil"/>
-              <w:bottom w:val="single" w:sz="4" w:space="0" w:color="auto"/>
+              <w:bottom w:val="single" w:sz="4" w:space="0" w:color="000000"/>
               <w:right w:val="single" w:sz="4" w:space="0" w:color="000000"/>
             </w:tcBorders>
             <w:vAlign w:val="bottom"/>
@@ -7597,7 +8167,7 @@
             <w:tcBorders>
               <w:top w:val="nil"/>
               <w:left w:val="nil"/>
-              <w:bottom w:val="single" w:sz="4" w:space="0" w:color="auto"/>
+              <w:bottom w:val="single" w:sz="4" w:space="0" w:color="000000"/>
               <w:right w:val="single" w:sz="4" w:space="0" w:color="000000"/>
             </w:tcBorders>
             <w:vAlign w:val="bottom"/>
@@ -7629,7 +8199,7 @@
             <w:tcBorders>
               <w:top w:val="nil"/>
               <w:left w:val="nil"/>
-              <w:bottom w:val="single" w:sz="4" w:space="0" w:color="auto"/>
+              <w:bottom w:val="single" w:sz="4" w:space="0" w:color="000000"/>
               <w:right w:val="single" w:sz="4" w:space="0" w:color="000000"/>
             </w:tcBorders>
             <w:vAlign w:val="bottom"/>
@@ -7661,7 +8231,7 @@
             <w:tcBorders>
               <w:top w:val="nil"/>
               <w:left w:val="nil"/>
-              <w:bottom w:val="single" w:sz="4" w:space="0" w:color="auto"/>
+              <w:bottom w:val="single" w:sz="4" w:space="0" w:color="000000"/>
               <w:right w:val="single" w:sz="4" w:space="0" w:color="000000"/>
             </w:tcBorders>
             <w:vAlign w:val="bottom"/>
@@ -7693,7 +8263,7 @@
             <w:tcBorders>
               <w:top w:val="nil"/>
               <w:left w:val="nil"/>
-              <w:bottom w:val="single" w:sz="4" w:space="0" w:color="auto"/>
+              <w:bottom w:val="single" w:sz="4" w:space="0" w:color="000000"/>
               <w:right w:val="single" w:sz="4" w:space="0" w:color="000000"/>
             </w:tcBorders>
             <w:vAlign w:val="bottom"/>
@@ -7725,7 +8295,7 @@
             <w:tcBorders>
               <w:top w:val="nil"/>
               <w:left w:val="nil"/>
-              <w:bottom w:val="single" w:sz="4" w:space="0" w:color="auto"/>
+              <w:bottom w:val="single" w:sz="4" w:space="0" w:color="000000"/>
               <w:right w:val="single" w:sz="4" w:space="0" w:color="000000"/>
             </w:tcBorders>
             <w:vAlign w:val="bottom"/>
@@ -7757,7 +8327,7 @@
             <w:tcBorders>
               <w:top w:val="nil"/>
               <w:left w:val="nil"/>
-              <w:bottom w:val="single" w:sz="4" w:space="0" w:color="auto"/>
+              <w:bottom w:val="single" w:sz="4" w:space="0" w:color="000000"/>
               <w:right w:val="single" w:sz="4" w:space="0" w:color="000000"/>
             </w:tcBorders>
             <w:vAlign w:val="bottom"/>
@@ -7789,9 +8359,10 @@
             <w:tcBorders>
               <w:top w:val="nil"/>
               <w:left w:val="nil"/>
-              <w:bottom w:val="single" w:sz="4" w:space="0" w:color="auto"/>
-              <w:right w:val="single" w:sz="4" w:space="0" w:color="000000"/>
-            </w:tcBorders>
+              <w:bottom w:val="single" w:sz="4" w:space="0" w:color="000000"/>
+              <w:right w:val="single" w:sz="4" w:space="0" w:color="000000"/>
+            </w:tcBorders>
+            <w:shd w:val="clear" w:color="auto" w:fill="7F7F7F" w:themeFill="text1" w:themeFillTint="80"/>
             <w:vAlign w:val="bottom"/>
           </w:tcPr>
           <w:p>
@@ -7821,9 +8392,10 @@
             <w:tcBorders>
               <w:top w:val="nil"/>
               <w:left w:val="nil"/>
-              <w:bottom w:val="single" w:sz="4" w:space="0" w:color="auto"/>
-              <w:right w:val="single" w:sz="4" w:space="0" w:color="000000"/>
-            </w:tcBorders>
+              <w:bottom w:val="single" w:sz="4" w:space="0" w:color="000000"/>
+              <w:right w:val="single" w:sz="4" w:space="0" w:color="000000"/>
+            </w:tcBorders>
+            <w:shd w:val="clear" w:color="auto" w:fill="7F7F7F" w:themeFill="text1" w:themeFillTint="80"/>
             <w:vAlign w:val="bottom"/>
           </w:tcPr>
           <w:p>
@@ -7853,7 +8425,7 @@
             <w:tcBorders>
               <w:top w:val="nil"/>
               <w:left w:val="nil"/>
-              <w:bottom w:val="single" w:sz="4" w:space="0" w:color="auto"/>
+              <w:bottom w:val="single" w:sz="4" w:space="0" w:color="000000"/>
               <w:right w:val="single" w:sz="4" w:space="0" w:color="000000"/>
             </w:tcBorders>
             <w:vAlign w:val="bottom"/>
@@ -7888,436 +8460,607 @@
           <w:tcPr>
             <w:tcW w:w="2481" w:type="dxa"/>
             <w:tcBorders>
-              <w:top w:val="single" w:sz="4" w:space="0" w:color="auto"/>
-              <w:left w:val="single" w:sz="4" w:space="0" w:color="auto"/>
+              <w:top w:val="nil"/>
+              <w:left w:val="single" w:sz="4" w:space="0" w:color="000000"/>
               <w:bottom w:val="single" w:sz="4" w:space="0" w:color="auto"/>
-              <w:right w:val="single" w:sz="4" w:space="0" w:color="auto"/>
-            </w:tcBorders>
-            <w:vAlign w:val="bottom"/>
-          </w:tcPr>
-          <w:p>
-            <w:pPr>
-              <w:spacing w:after="0" w:line="240" w:lineRule="auto"/>
-              <w:rPr>
-                <w:rFonts w:cs="Times New Roman"/>
-                <w:sz w:val="24"/>
-                <w:szCs w:val="24"/>
-              </w:rPr>
-            </w:pPr>
+              <w:right w:val="single" w:sz="4" w:space="0" w:color="000000"/>
+            </w:tcBorders>
+            <w:vAlign w:val="center"/>
+          </w:tcPr>
+          <w:p>
+            <w:pPr>
+              <w:spacing w:after="0" w:line="240" w:lineRule="auto"/>
+              <w:rPr>
+                <w:rFonts w:cs="Times New Roman"/>
+                <w:sz w:val="24"/>
+                <w:szCs w:val="24"/>
+              </w:rPr>
+            </w:pPr>
+            <w:r>
+              <w:rPr>
+                <w:rFonts w:cs="Times New Roman"/>
+                <w:sz w:val="24"/>
+                <w:szCs w:val="24"/>
+              </w:rPr>
+              <w:t>Нормоконтроль, подготовка к защите</w:t>
+            </w:r>
           </w:p>
         </w:tc>
         <w:tc>
           <w:tcPr>
             <w:tcW w:w="317" w:type="dxa"/>
             <w:tcBorders>
-              <w:top w:val="single" w:sz="4" w:space="0" w:color="auto"/>
-              <w:left w:val="single" w:sz="4" w:space="0" w:color="auto"/>
+              <w:top w:val="nil"/>
+              <w:left w:val="nil"/>
               <w:bottom w:val="single" w:sz="4" w:space="0" w:color="auto"/>
-              <w:right w:val="single" w:sz="4" w:space="0" w:color="auto"/>
-            </w:tcBorders>
-            <w:vAlign w:val="bottom"/>
-          </w:tcPr>
-          <w:p>
-            <w:pPr>
-              <w:spacing w:after="0" w:line="240" w:lineRule="auto"/>
-              <w:rPr>
-                <w:rFonts w:cs="Times New Roman"/>
-                <w:color w:val="000000"/>
-                <w:sz w:val="24"/>
-                <w:szCs w:val="24"/>
-              </w:rPr>
-            </w:pPr>
+              <w:right w:val="single" w:sz="4" w:space="0" w:color="000000"/>
+            </w:tcBorders>
+            <w:vAlign w:val="bottom"/>
+          </w:tcPr>
+          <w:p>
+            <w:pPr>
+              <w:spacing w:after="0" w:line="240" w:lineRule="auto"/>
+              <w:rPr>
+                <w:rFonts w:cs="Times New Roman"/>
+                <w:color w:val="000000"/>
+                <w:sz w:val="24"/>
+                <w:szCs w:val="24"/>
+              </w:rPr>
+            </w:pPr>
+            <w:r>
+              <w:rPr>
+                <w:rFonts w:cs="Times New Roman"/>
+                <w:color w:val="000000"/>
+                <w:sz w:val="24"/>
+                <w:szCs w:val="24"/>
+              </w:rPr>
+              <w:t> </w:t>
+            </w:r>
           </w:p>
         </w:tc>
         <w:tc>
           <w:tcPr>
             <w:tcW w:w="323" w:type="dxa"/>
             <w:tcBorders>
-              <w:top w:val="single" w:sz="4" w:space="0" w:color="auto"/>
-              <w:left w:val="single" w:sz="4" w:space="0" w:color="auto"/>
+              <w:top w:val="nil"/>
+              <w:left w:val="nil"/>
               <w:bottom w:val="single" w:sz="4" w:space="0" w:color="auto"/>
-              <w:right w:val="single" w:sz="4" w:space="0" w:color="auto"/>
-            </w:tcBorders>
-            <w:vAlign w:val="bottom"/>
-          </w:tcPr>
-          <w:p>
-            <w:pPr>
-              <w:spacing w:after="0" w:line="240" w:lineRule="auto"/>
-              <w:rPr>
-                <w:rFonts w:cs="Times New Roman"/>
-                <w:color w:val="000000"/>
-                <w:sz w:val="24"/>
-                <w:szCs w:val="24"/>
-              </w:rPr>
-            </w:pPr>
+              <w:right w:val="single" w:sz="4" w:space="0" w:color="000000"/>
+            </w:tcBorders>
+            <w:vAlign w:val="bottom"/>
+          </w:tcPr>
+          <w:p>
+            <w:pPr>
+              <w:spacing w:after="0" w:line="240" w:lineRule="auto"/>
+              <w:rPr>
+                <w:rFonts w:cs="Times New Roman"/>
+                <w:color w:val="000000"/>
+                <w:sz w:val="24"/>
+                <w:szCs w:val="24"/>
+              </w:rPr>
+            </w:pPr>
+            <w:r>
+              <w:rPr>
+                <w:rFonts w:cs="Times New Roman"/>
+                <w:color w:val="000000"/>
+                <w:sz w:val="24"/>
+                <w:szCs w:val="24"/>
+              </w:rPr>
+              <w:t> </w:t>
+            </w:r>
           </w:p>
         </w:tc>
         <w:tc>
           <w:tcPr>
             <w:tcW w:w="322" w:type="dxa"/>
             <w:tcBorders>
-              <w:top w:val="single" w:sz="4" w:space="0" w:color="auto"/>
-              <w:left w:val="single" w:sz="4" w:space="0" w:color="auto"/>
+              <w:top w:val="nil"/>
+              <w:left w:val="nil"/>
               <w:bottom w:val="single" w:sz="4" w:space="0" w:color="auto"/>
-              <w:right w:val="single" w:sz="4" w:space="0" w:color="auto"/>
-            </w:tcBorders>
-            <w:vAlign w:val="bottom"/>
-          </w:tcPr>
-          <w:p>
-            <w:pPr>
-              <w:spacing w:after="0" w:line="240" w:lineRule="auto"/>
-              <w:rPr>
-                <w:rFonts w:cs="Times New Roman"/>
-                <w:color w:val="000000"/>
-                <w:sz w:val="24"/>
-                <w:szCs w:val="24"/>
-              </w:rPr>
-            </w:pPr>
+              <w:right w:val="single" w:sz="4" w:space="0" w:color="000000"/>
+            </w:tcBorders>
+            <w:vAlign w:val="bottom"/>
+          </w:tcPr>
+          <w:p>
+            <w:pPr>
+              <w:spacing w:after="0" w:line="240" w:lineRule="auto"/>
+              <w:rPr>
+                <w:rFonts w:cs="Times New Roman"/>
+                <w:color w:val="000000"/>
+                <w:sz w:val="24"/>
+                <w:szCs w:val="24"/>
+              </w:rPr>
+            </w:pPr>
+            <w:r>
+              <w:rPr>
+                <w:rFonts w:cs="Times New Roman"/>
+                <w:color w:val="000000"/>
+                <w:sz w:val="24"/>
+                <w:szCs w:val="24"/>
+              </w:rPr>
+              <w:t> </w:t>
+            </w:r>
           </w:p>
         </w:tc>
         <w:tc>
           <w:tcPr>
             <w:tcW w:w="322" w:type="dxa"/>
             <w:tcBorders>
-              <w:top w:val="single" w:sz="4" w:space="0" w:color="auto"/>
-              <w:left w:val="single" w:sz="4" w:space="0" w:color="auto"/>
+              <w:top w:val="nil"/>
+              <w:left w:val="nil"/>
               <w:bottom w:val="single" w:sz="4" w:space="0" w:color="auto"/>
-              <w:right w:val="single" w:sz="4" w:space="0" w:color="auto"/>
-            </w:tcBorders>
-            <w:vAlign w:val="bottom"/>
-          </w:tcPr>
-          <w:p>
-            <w:pPr>
-              <w:spacing w:after="0" w:line="240" w:lineRule="auto"/>
-              <w:rPr>
-                <w:rFonts w:cs="Times New Roman"/>
-                <w:color w:val="000000"/>
-                <w:sz w:val="24"/>
-                <w:szCs w:val="24"/>
-              </w:rPr>
-            </w:pPr>
+              <w:right w:val="single" w:sz="4" w:space="0" w:color="000000"/>
+            </w:tcBorders>
+            <w:vAlign w:val="bottom"/>
+          </w:tcPr>
+          <w:p>
+            <w:pPr>
+              <w:spacing w:after="0" w:line="240" w:lineRule="auto"/>
+              <w:rPr>
+                <w:rFonts w:cs="Times New Roman"/>
+                <w:color w:val="000000"/>
+                <w:sz w:val="24"/>
+                <w:szCs w:val="24"/>
+              </w:rPr>
+            </w:pPr>
+            <w:r>
+              <w:rPr>
+                <w:rFonts w:cs="Times New Roman"/>
+                <w:color w:val="000000"/>
+                <w:sz w:val="24"/>
+                <w:szCs w:val="24"/>
+              </w:rPr>
+              <w:t> </w:t>
+            </w:r>
           </w:p>
         </w:tc>
         <w:tc>
           <w:tcPr>
             <w:tcW w:w="317" w:type="dxa"/>
             <w:tcBorders>
-              <w:top w:val="single" w:sz="4" w:space="0" w:color="auto"/>
-              <w:left w:val="single" w:sz="4" w:space="0" w:color="auto"/>
+              <w:top w:val="nil"/>
+              <w:left w:val="nil"/>
               <w:bottom w:val="single" w:sz="4" w:space="0" w:color="auto"/>
-              <w:right w:val="single" w:sz="4" w:space="0" w:color="auto"/>
-            </w:tcBorders>
-            <w:vAlign w:val="bottom"/>
-          </w:tcPr>
-          <w:p>
-            <w:pPr>
-              <w:spacing w:after="0" w:line="240" w:lineRule="auto"/>
-              <w:rPr>
-                <w:rFonts w:cs="Times New Roman"/>
-                <w:color w:val="000000"/>
-                <w:sz w:val="24"/>
-                <w:szCs w:val="24"/>
-              </w:rPr>
-            </w:pPr>
+              <w:right w:val="single" w:sz="4" w:space="0" w:color="000000"/>
+            </w:tcBorders>
+            <w:vAlign w:val="bottom"/>
+          </w:tcPr>
+          <w:p>
+            <w:pPr>
+              <w:spacing w:after="0" w:line="240" w:lineRule="auto"/>
+              <w:rPr>
+                <w:rFonts w:cs="Times New Roman"/>
+                <w:color w:val="000000"/>
+                <w:sz w:val="24"/>
+                <w:szCs w:val="24"/>
+              </w:rPr>
+            </w:pPr>
+            <w:r>
+              <w:rPr>
+                <w:rFonts w:cs="Times New Roman"/>
+                <w:color w:val="000000"/>
+                <w:sz w:val="24"/>
+                <w:szCs w:val="24"/>
+              </w:rPr>
+              <w:t> </w:t>
+            </w:r>
           </w:p>
         </w:tc>
         <w:tc>
           <w:tcPr>
             <w:tcW w:w="322" w:type="dxa"/>
             <w:tcBorders>
-              <w:top w:val="single" w:sz="4" w:space="0" w:color="auto"/>
-              <w:left w:val="single" w:sz="4" w:space="0" w:color="auto"/>
+              <w:top w:val="nil"/>
+              <w:left w:val="nil"/>
               <w:bottom w:val="single" w:sz="4" w:space="0" w:color="auto"/>
-              <w:right w:val="single" w:sz="4" w:space="0" w:color="auto"/>
-            </w:tcBorders>
-            <w:vAlign w:val="bottom"/>
-          </w:tcPr>
-          <w:p>
-            <w:pPr>
-              <w:spacing w:after="0" w:line="240" w:lineRule="auto"/>
-              <w:rPr>
-                <w:rFonts w:cs="Times New Roman"/>
-                <w:color w:val="000000"/>
-                <w:sz w:val="24"/>
-                <w:szCs w:val="24"/>
-              </w:rPr>
-            </w:pPr>
+              <w:right w:val="single" w:sz="4" w:space="0" w:color="000000"/>
+            </w:tcBorders>
+            <w:vAlign w:val="bottom"/>
+          </w:tcPr>
+          <w:p>
+            <w:pPr>
+              <w:spacing w:after="0" w:line="240" w:lineRule="auto"/>
+              <w:rPr>
+                <w:rFonts w:cs="Times New Roman"/>
+                <w:color w:val="000000"/>
+                <w:sz w:val="24"/>
+                <w:szCs w:val="24"/>
+              </w:rPr>
+            </w:pPr>
+            <w:r>
+              <w:rPr>
+                <w:rFonts w:cs="Times New Roman"/>
+                <w:color w:val="000000"/>
+                <w:sz w:val="24"/>
+                <w:szCs w:val="24"/>
+              </w:rPr>
+              <w:t> </w:t>
+            </w:r>
           </w:p>
         </w:tc>
         <w:tc>
           <w:tcPr>
             <w:tcW w:w="322" w:type="dxa"/>
             <w:tcBorders>
-              <w:top w:val="single" w:sz="4" w:space="0" w:color="auto"/>
-              <w:left w:val="single" w:sz="4" w:space="0" w:color="auto"/>
+              <w:top w:val="nil"/>
+              <w:left w:val="nil"/>
               <w:bottom w:val="single" w:sz="4" w:space="0" w:color="auto"/>
-              <w:right w:val="single" w:sz="4" w:space="0" w:color="auto"/>
-            </w:tcBorders>
-            <w:vAlign w:val="bottom"/>
-          </w:tcPr>
-          <w:p>
-            <w:pPr>
-              <w:spacing w:after="0" w:line="240" w:lineRule="auto"/>
-              <w:rPr>
-                <w:rFonts w:cs="Times New Roman"/>
-                <w:color w:val="000000"/>
-                <w:sz w:val="24"/>
-                <w:szCs w:val="24"/>
-              </w:rPr>
-            </w:pPr>
+              <w:right w:val="single" w:sz="4" w:space="0" w:color="000000"/>
+            </w:tcBorders>
+            <w:vAlign w:val="bottom"/>
+          </w:tcPr>
+          <w:p>
+            <w:pPr>
+              <w:spacing w:after="0" w:line="240" w:lineRule="auto"/>
+              <w:rPr>
+                <w:rFonts w:cs="Times New Roman"/>
+                <w:color w:val="000000"/>
+                <w:sz w:val="24"/>
+                <w:szCs w:val="24"/>
+              </w:rPr>
+            </w:pPr>
+            <w:r>
+              <w:rPr>
+                <w:rFonts w:cs="Times New Roman"/>
+                <w:color w:val="000000"/>
+                <w:sz w:val="24"/>
+                <w:szCs w:val="24"/>
+              </w:rPr>
+              <w:t> </w:t>
+            </w:r>
           </w:p>
         </w:tc>
         <w:tc>
           <w:tcPr>
             <w:tcW w:w="322" w:type="dxa"/>
             <w:tcBorders>
-              <w:top w:val="single" w:sz="4" w:space="0" w:color="auto"/>
-              <w:left w:val="single" w:sz="4" w:space="0" w:color="auto"/>
+              <w:top w:val="nil"/>
+              <w:left w:val="nil"/>
               <w:bottom w:val="single" w:sz="4" w:space="0" w:color="auto"/>
-              <w:right w:val="single" w:sz="4" w:space="0" w:color="auto"/>
-            </w:tcBorders>
-            <w:vAlign w:val="bottom"/>
-          </w:tcPr>
-          <w:p>
-            <w:pPr>
-              <w:spacing w:after="0" w:line="240" w:lineRule="auto"/>
-              <w:rPr>
-                <w:rFonts w:cs="Times New Roman"/>
-                <w:color w:val="000000"/>
-                <w:sz w:val="24"/>
-                <w:szCs w:val="24"/>
-              </w:rPr>
-            </w:pPr>
+              <w:right w:val="single" w:sz="4" w:space="0" w:color="000000"/>
+            </w:tcBorders>
+            <w:vAlign w:val="bottom"/>
+          </w:tcPr>
+          <w:p>
+            <w:pPr>
+              <w:spacing w:after="0" w:line="240" w:lineRule="auto"/>
+              <w:rPr>
+                <w:rFonts w:cs="Times New Roman"/>
+                <w:color w:val="000000"/>
+                <w:sz w:val="24"/>
+                <w:szCs w:val="24"/>
+              </w:rPr>
+            </w:pPr>
+            <w:r>
+              <w:rPr>
+                <w:rFonts w:cs="Times New Roman"/>
+                <w:color w:val="000000"/>
+                <w:sz w:val="24"/>
+                <w:szCs w:val="24"/>
+              </w:rPr>
+              <w:t> </w:t>
+            </w:r>
           </w:p>
         </w:tc>
         <w:tc>
           <w:tcPr>
             <w:tcW w:w="322" w:type="dxa"/>
             <w:tcBorders>
-              <w:top w:val="single" w:sz="4" w:space="0" w:color="auto"/>
-              <w:left w:val="single" w:sz="4" w:space="0" w:color="auto"/>
+              <w:top w:val="nil"/>
+              <w:left w:val="nil"/>
               <w:bottom w:val="single" w:sz="4" w:space="0" w:color="auto"/>
-              <w:right w:val="single" w:sz="4" w:space="0" w:color="auto"/>
-            </w:tcBorders>
-            <w:vAlign w:val="bottom"/>
-          </w:tcPr>
-          <w:p>
-            <w:pPr>
-              <w:spacing w:after="0" w:line="240" w:lineRule="auto"/>
-              <w:rPr>
-                <w:rFonts w:cs="Times New Roman"/>
-                <w:color w:val="000000"/>
-                <w:sz w:val="24"/>
-                <w:szCs w:val="24"/>
-              </w:rPr>
-            </w:pPr>
+              <w:right w:val="single" w:sz="4" w:space="0" w:color="000000"/>
+            </w:tcBorders>
+            <w:vAlign w:val="bottom"/>
+          </w:tcPr>
+          <w:p>
+            <w:pPr>
+              <w:spacing w:after="0" w:line="240" w:lineRule="auto"/>
+              <w:rPr>
+                <w:rFonts w:cs="Times New Roman"/>
+                <w:color w:val="000000"/>
+                <w:sz w:val="24"/>
+                <w:szCs w:val="24"/>
+              </w:rPr>
+            </w:pPr>
+            <w:r>
+              <w:rPr>
+                <w:rFonts w:cs="Times New Roman"/>
+                <w:color w:val="000000"/>
+                <w:sz w:val="24"/>
+                <w:szCs w:val="24"/>
+              </w:rPr>
+              <w:t> </w:t>
+            </w:r>
           </w:p>
         </w:tc>
         <w:tc>
           <w:tcPr>
             <w:tcW w:w="416" w:type="dxa"/>
             <w:tcBorders>
-              <w:top w:val="single" w:sz="4" w:space="0" w:color="auto"/>
-              <w:left w:val="single" w:sz="4" w:space="0" w:color="auto"/>
+              <w:top w:val="nil"/>
+              <w:left w:val="nil"/>
               <w:bottom w:val="single" w:sz="4" w:space="0" w:color="auto"/>
-              <w:right w:val="single" w:sz="4" w:space="0" w:color="auto"/>
-            </w:tcBorders>
-            <w:vAlign w:val="bottom"/>
-          </w:tcPr>
-          <w:p>
-            <w:pPr>
-              <w:spacing w:after="0" w:line="240" w:lineRule="auto"/>
-              <w:rPr>
-                <w:rFonts w:cs="Times New Roman"/>
-                <w:color w:val="000000"/>
-                <w:sz w:val="24"/>
-                <w:szCs w:val="24"/>
-              </w:rPr>
-            </w:pPr>
+              <w:right w:val="single" w:sz="4" w:space="0" w:color="000000"/>
+            </w:tcBorders>
+            <w:vAlign w:val="bottom"/>
+          </w:tcPr>
+          <w:p>
+            <w:pPr>
+              <w:spacing w:after="0" w:line="240" w:lineRule="auto"/>
+              <w:rPr>
+                <w:rFonts w:cs="Times New Roman"/>
+                <w:color w:val="000000"/>
+                <w:sz w:val="24"/>
+                <w:szCs w:val="24"/>
+              </w:rPr>
+            </w:pPr>
+            <w:r>
+              <w:rPr>
+                <w:rFonts w:cs="Times New Roman"/>
+                <w:color w:val="000000"/>
+                <w:sz w:val="24"/>
+                <w:szCs w:val="24"/>
+              </w:rPr>
+              <w:t> </w:t>
+            </w:r>
           </w:p>
         </w:tc>
         <w:tc>
           <w:tcPr>
             <w:tcW w:w="416" w:type="dxa"/>
             <w:tcBorders>
-              <w:top w:val="single" w:sz="4" w:space="0" w:color="auto"/>
-              <w:left w:val="single" w:sz="4" w:space="0" w:color="auto"/>
+              <w:top w:val="nil"/>
+              <w:left w:val="nil"/>
               <w:bottom w:val="single" w:sz="4" w:space="0" w:color="auto"/>
-              <w:right w:val="single" w:sz="4" w:space="0" w:color="auto"/>
-            </w:tcBorders>
-            <w:vAlign w:val="bottom"/>
-          </w:tcPr>
-          <w:p>
-            <w:pPr>
-              <w:spacing w:after="0" w:line="240" w:lineRule="auto"/>
-              <w:rPr>
-                <w:rFonts w:cs="Times New Roman"/>
-                <w:color w:val="000000"/>
-                <w:sz w:val="24"/>
-                <w:szCs w:val="24"/>
-              </w:rPr>
-            </w:pPr>
+              <w:right w:val="single" w:sz="4" w:space="0" w:color="000000"/>
+            </w:tcBorders>
+            <w:vAlign w:val="bottom"/>
+          </w:tcPr>
+          <w:p>
+            <w:pPr>
+              <w:spacing w:after="0" w:line="240" w:lineRule="auto"/>
+              <w:rPr>
+                <w:rFonts w:cs="Times New Roman"/>
+                <w:color w:val="000000"/>
+                <w:sz w:val="24"/>
+                <w:szCs w:val="24"/>
+              </w:rPr>
+            </w:pPr>
+            <w:r>
+              <w:rPr>
+                <w:rFonts w:cs="Times New Roman"/>
+                <w:color w:val="000000"/>
+                <w:sz w:val="24"/>
+                <w:szCs w:val="24"/>
+              </w:rPr>
+              <w:t> </w:t>
+            </w:r>
           </w:p>
         </w:tc>
         <w:tc>
           <w:tcPr>
             <w:tcW w:w="416" w:type="dxa"/>
             <w:tcBorders>
-              <w:top w:val="single" w:sz="4" w:space="0" w:color="auto"/>
-              <w:left w:val="single" w:sz="4" w:space="0" w:color="auto"/>
+              <w:top w:val="nil"/>
+              <w:left w:val="nil"/>
               <w:bottom w:val="single" w:sz="4" w:space="0" w:color="auto"/>
-              <w:right w:val="single" w:sz="4" w:space="0" w:color="auto"/>
-            </w:tcBorders>
-            <w:vAlign w:val="bottom"/>
-          </w:tcPr>
-          <w:p>
-            <w:pPr>
-              <w:spacing w:after="0" w:line="240" w:lineRule="auto"/>
-              <w:rPr>
-                <w:rFonts w:cs="Times New Roman"/>
-                <w:color w:val="000000"/>
-                <w:sz w:val="24"/>
-                <w:szCs w:val="24"/>
-              </w:rPr>
-            </w:pPr>
+              <w:right w:val="single" w:sz="4" w:space="0" w:color="000000"/>
+            </w:tcBorders>
+            <w:vAlign w:val="bottom"/>
+          </w:tcPr>
+          <w:p>
+            <w:pPr>
+              <w:spacing w:after="0" w:line="240" w:lineRule="auto"/>
+              <w:rPr>
+                <w:rFonts w:cs="Times New Roman"/>
+                <w:color w:val="000000"/>
+                <w:sz w:val="24"/>
+                <w:szCs w:val="24"/>
+              </w:rPr>
+            </w:pPr>
+            <w:r>
+              <w:rPr>
+                <w:rFonts w:cs="Times New Roman"/>
+                <w:color w:val="000000"/>
+                <w:sz w:val="24"/>
+                <w:szCs w:val="24"/>
+              </w:rPr>
+              <w:t> </w:t>
+            </w:r>
           </w:p>
         </w:tc>
         <w:tc>
           <w:tcPr>
             <w:tcW w:w="416" w:type="dxa"/>
             <w:tcBorders>
-              <w:top w:val="single" w:sz="4" w:space="0" w:color="auto"/>
-              <w:left w:val="single" w:sz="4" w:space="0" w:color="auto"/>
+              <w:top w:val="nil"/>
+              <w:left w:val="nil"/>
               <w:bottom w:val="single" w:sz="4" w:space="0" w:color="auto"/>
-              <w:right w:val="single" w:sz="4" w:space="0" w:color="auto"/>
-            </w:tcBorders>
-            <w:vAlign w:val="bottom"/>
-          </w:tcPr>
-          <w:p>
-            <w:pPr>
-              <w:spacing w:after="0" w:line="240" w:lineRule="auto"/>
-              <w:rPr>
-                <w:rFonts w:cs="Times New Roman"/>
-                <w:color w:val="000000"/>
-                <w:sz w:val="24"/>
-                <w:szCs w:val="24"/>
-              </w:rPr>
-            </w:pPr>
+              <w:right w:val="single" w:sz="4" w:space="0" w:color="000000"/>
+            </w:tcBorders>
+            <w:vAlign w:val="bottom"/>
+          </w:tcPr>
+          <w:p>
+            <w:pPr>
+              <w:spacing w:after="0" w:line="240" w:lineRule="auto"/>
+              <w:rPr>
+                <w:rFonts w:cs="Times New Roman"/>
+                <w:color w:val="000000"/>
+                <w:sz w:val="24"/>
+                <w:szCs w:val="24"/>
+              </w:rPr>
+            </w:pPr>
+            <w:r>
+              <w:rPr>
+                <w:rFonts w:cs="Times New Roman"/>
+                <w:color w:val="000000"/>
+                <w:sz w:val="24"/>
+                <w:szCs w:val="24"/>
+              </w:rPr>
+              <w:t> </w:t>
+            </w:r>
           </w:p>
         </w:tc>
         <w:tc>
           <w:tcPr>
             <w:tcW w:w="416" w:type="dxa"/>
             <w:tcBorders>
-              <w:top w:val="single" w:sz="4" w:space="0" w:color="auto"/>
-              <w:left w:val="single" w:sz="4" w:space="0" w:color="auto"/>
+              <w:top w:val="nil"/>
+              <w:left w:val="nil"/>
               <w:bottom w:val="single" w:sz="4" w:space="0" w:color="auto"/>
-              <w:right w:val="single" w:sz="4" w:space="0" w:color="auto"/>
-            </w:tcBorders>
-            <w:vAlign w:val="bottom"/>
-          </w:tcPr>
-          <w:p>
-            <w:pPr>
-              <w:spacing w:after="0" w:line="240" w:lineRule="auto"/>
-              <w:rPr>
-                <w:rFonts w:cs="Times New Roman"/>
-                <w:color w:val="000000"/>
-                <w:sz w:val="24"/>
-                <w:szCs w:val="24"/>
-              </w:rPr>
-            </w:pPr>
+              <w:right w:val="single" w:sz="4" w:space="0" w:color="000000"/>
+            </w:tcBorders>
+            <w:vAlign w:val="bottom"/>
+          </w:tcPr>
+          <w:p>
+            <w:pPr>
+              <w:spacing w:after="0" w:line="240" w:lineRule="auto"/>
+              <w:rPr>
+                <w:rFonts w:cs="Times New Roman"/>
+                <w:color w:val="000000"/>
+                <w:sz w:val="24"/>
+                <w:szCs w:val="24"/>
+              </w:rPr>
+            </w:pPr>
+            <w:r>
+              <w:rPr>
+                <w:rFonts w:cs="Times New Roman"/>
+                <w:color w:val="000000"/>
+                <w:sz w:val="24"/>
+                <w:szCs w:val="24"/>
+              </w:rPr>
+              <w:t> </w:t>
+            </w:r>
           </w:p>
         </w:tc>
         <w:tc>
           <w:tcPr>
             <w:tcW w:w="416" w:type="dxa"/>
             <w:tcBorders>
-              <w:top w:val="single" w:sz="4" w:space="0" w:color="auto"/>
-              <w:left w:val="single" w:sz="4" w:space="0" w:color="auto"/>
+              <w:top w:val="nil"/>
+              <w:left w:val="nil"/>
               <w:bottom w:val="single" w:sz="4" w:space="0" w:color="auto"/>
-              <w:right w:val="single" w:sz="4" w:space="0" w:color="auto"/>
-            </w:tcBorders>
-            <w:vAlign w:val="bottom"/>
-          </w:tcPr>
-          <w:p>
-            <w:pPr>
-              <w:spacing w:after="0" w:line="240" w:lineRule="auto"/>
-              <w:rPr>
-                <w:rFonts w:cs="Times New Roman"/>
-                <w:color w:val="000000"/>
-                <w:sz w:val="24"/>
-                <w:szCs w:val="24"/>
-              </w:rPr>
-            </w:pPr>
+              <w:right w:val="single" w:sz="4" w:space="0" w:color="000000"/>
+            </w:tcBorders>
+            <w:vAlign w:val="bottom"/>
+          </w:tcPr>
+          <w:p>
+            <w:pPr>
+              <w:spacing w:after="0" w:line="240" w:lineRule="auto"/>
+              <w:rPr>
+                <w:rFonts w:cs="Times New Roman"/>
+                <w:color w:val="000000"/>
+                <w:sz w:val="24"/>
+                <w:szCs w:val="24"/>
+              </w:rPr>
+            </w:pPr>
+            <w:r>
+              <w:rPr>
+                <w:rFonts w:cs="Times New Roman"/>
+                <w:color w:val="000000"/>
+                <w:sz w:val="24"/>
+                <w:szCs w:val="24"/>
+              </w:rPr>
+              <w:t> </w:t>
+            </w:r>
           </w:p>
         </w:tc>
         <w:tc>
           <w:tcPr>
             <w:tcW w:w="416" w:type="dxa"/>
             <w:tcBorders>
-              <w:top w:val="single" w:sz="4" w:space="0" w:color="auto"/>
-              <w:left w:val="single" w:sz="4" w:space="0" w:color="auto"/>
+              <w:top w:val="nil"/>
+              <w:left w:val="nil"/>
               <w:bottom w:val="single" w:sz="4" w:space="0" w:color="auto"/>
-              <w:right w:val="single" w:sz="4" w:space="0" w:color="auto"/>
-            </w:tcBorders>
-            <w:vAlign w:val="bottom"/>
-          </w:tcPr>
-          <w:p>
-            <w:pPr>
-              <w:spacing w:after="0" w:line="240" w:lineRule="auto"/>
-              <w:rPr>
-                <w:rFonts w:cs="Times New Roman"/>
-                <w:color w:val="000000"/>
-                <w:sz w:val="24"/>
-                <w:szCs w:val="24"/>
-              </w:rPr>
-            </w:pPr>
+              <w:right w:val="single" w:sz="4" w:space="0" w:color="000000"/>
+            </w:tcBorders>
+            <w:vAlign w:val="bottom"/>
+          </w:tcPr>
+          <w:p>
+            <w:pPr>
+              <w:spacing w:after="0" w:line="240" w:lineRule="auto"/>
+              <w:rPr>
+                <w:rFonts w:cs="Times New Roman"/>
+                <w:color w:val="000000"/>
+                <w:sz w:val="24"/>
+                <w:szCs w:val="24"/>
+              </w:rPr>
+            </w:pPr>
+            <w:r>
+              <w:rPr>
+                <w:rFonts w:cs="Times New Roman"/>
+                <w:color w:val="000000"/>
+                <w:sz w:val="24"/>
+                <w:szCs w:val="24"/>
+              </w:rPr>
+              <w:t> </w:t>
+            </w:r>
           </w:p>
         </w:tc>
         <w:tc>
           <w:tcPr>
             <w:tcW w:w="416" w:type="dxa"/>
             <w:tcBorders>
-              <w:top w:val="single" w:sz="4" w:space="0" w:color="auto"/>
-              <w:left w:val="single" w:sz="4" w:space="0" w:color="auto"/>
+              <w:top w:val="nil"/>
+              <w:left w:val="nil"/>
               <w:bottom w:val="single" w:sz="4" w:space="0" w:color="auto"/>
-              <w:right w:val="single" w:sz="4" w:space="0" w:color="auto"/>
-            </w:tcBorders>
-            <w:vAlign w:val="bottom"/>
-          </w:tcPr>
-          <w:p>
-            <w:pPr>
-              <w:spacing w:after="0" w:line="240" w:lineRule="auto"/>
-              <w:rPr>
-                <w:rFonts w:cs="Times New Roman"/>
-                <w:color w:val="000000"/>
-                <w:sz w:val="24"/>
-                <w:szCs w:val="24"/>
-              </w:rPr>
-            </w:pPr>
+              <w:right w:val="single" w:sz="4" w:space="0" w:color="000000"/>
+            </w:tcBorders>
+            <w:vAlign w:val="bottom"/>
+          </w:tcPr>
+          <w:p>
+            <w:pPr>
+              <w:spacing w:after="0" w:line="240" w:lineRule="auto"/>
+              <w:rPr>
+                <w:rFonts w:cs="Times New Roman"/>
+                <w:color w:val="000000"/>
+                <w:sz w:val="24"/>
+                <w:szCs w:val="24"/>
+              </w:rPr>
+            </w:pPr>
+            <w:r>
+              <w:rPr>
+                <w:rFonts w:cs="Times New Roman"/>
+                <w:color w:val="000000"/>
+                <w:sz w:val="24"/>
+                <w:szCs w:val="24"/>
+              </w:rPr>
+              <w:t> </w:t>
+            </w:r>
           </w:p>
         </w:tc>
         <w:tc>
           <w:tcPr>
             <w:tcW w:w="421" w:type="dxa"/>
             <w:tcBorders>
-              <w:top w:val="single" w:sz="4" w:space="0" w:color="auto"/>
-              <w:left w:val="single" w:sz="4" w:space="0" w:color="auto"/>
+              <w:top w:val="nil"/>
+              <w:left w:val="nil"/>
               <w:bottom w:val="single" w:sz="4" w:space="0" w:color="auto"/>
-              <w:right w:val="single" w:sz="4" w:space="0" w:color="auto"/>
-            </w:tcBorders>
-            <w:vAlign w:val="bottom"/>
-          </w:tcPr>
-          <w:p>
-            <w:pPr>
-              <w:spacing w:after="0" w:line="240" w:lineRule="auto"/>
-              <w:rPr>
-                <w:rFonts w:cs="Times New Roman"/>
-                <w:color w:val="000000"/>
-                <w:sz w:val="24"/>
-                <w:szCs w:val="24"/>
-              </w:rPr>
-            </w:pPr>
+              <w:right w:val="single" w:sz="4" w:space="0" w:color="000000"/>
+            </w:tcBorders>
+            <w:shd w:val="clear" w:color="auto" w:fill="7F7F7F" w:themeFill="text1" w:themeFillTint="80"/>
+            <w:vAlign w:val="bottom"/>
+          </w:tcPr>
+          <w:p>
+            <w:pPr>
+              <w:spacing w:after="0" w:line="240" w:lineRule="auto"/>
+              <w:rPr>
+                <w:rFonts w:cs="Times New Roman"/>
+                <w:color w:val="000000"/>
+                <w:sz w:val="24"/>
+                <w:szCs w:val="24"/>
+              </w:rPr>
+            </w:pPr>
+            <w:r>
+              <w:rPr>
+                <w:rFonts w:cs="Times New Roman"/>
+                <w:color w:val="000000"/>
+                <w:sz w:val="24"/>
+                <w:szCs w:val="24"/>
+              </w:rPr>
+              <w:t> </w:t>
+            </w:r>
           </w:p>
         </w:tc>
       </w:tr>
@@ -8432,12 +9175,21 @@
         </w:rPr>
         <w:t xml:space="preserve">/ </w:t>
       </w:r>
+      <w:proofErr w:type="spellStart"/>
       <w:r>
         <w:rPr>
           <w:szCs w:val="28"/>
           <w:u w:val="single"/>
         </w:rPr>
-        <w:t>Даньшина Марина Владимировна</w:t>
+        <w:t>Гневшев</w:t>
+      </w:r>
+      <w:proofErr w:type="spellEnd"/>
+      <w:r>
+        <w:rPr>
+          <w:szCs w:val="28"/>
+          <w:u w:val="single"/>
+        </w:rPr>
+        <w:t xml:space="preserve"> Александр Юрьевич</w:t>
       </w:r>
       <w:r>
         <w:rPr>
@@ -9967,6 +10719,119 @@
     </w:lvl>
   </w:abstractNum>
   <w:abstractNum w:abstractNumId="10" w15:restartNumberingAfterBreak="0">
+    <w:nsid w:val="5C3B0175"/>
+    <w:multiLevelType w:val="multilevel"/>
+    <w:tmpl w:val="113A20C4"/>
+    <w:lvl w:ilvl="0">
+      <w:start w:val="1"/>
+      <w:numFmt w:val="decimal"/>
+      <w:lvlText w:val="%1."/>
+      <w:lvlJc w:val="left"/>
+      <w:pPr>
+        <w:tabs>
+          <w:tab w:val="num" w:pos="720"/>
+        </w:tabs>
+        <w:ind w:left="720" w:hanging="360"/>
+      </w:pPr>
+    </w:lvl>
+    <w:lvl w:ilvl="1" w:tentative="1">
+      <w:start w:val="1"/>
+      <w:numFmt w:val="decimal"/>
+      <w:lvlText w:val="%2."/>
+      <w:lvlJc w:val="left"/>
+      <w:pPr>
+        <w:tabs>
+          <w:tab w:val="num" w:pos="1440"/>
+        </w:tabs>
+        <w:ind w:left="1440" w:hanging="360"/>
+      </w:pPr>
+    </w:lvl>
+    <w:lvl w:ilvl="2" w:tentative="1">
+      <w:start w:val="1"/>
+      <w:numFmt w:val="decimal"/>
+      <w:lvlText w:val="%3."/>
+      <w:lvlJc w:val="left"/>
+      <w:pPr>
+        <w:tabs>
+          <w:tab w:val="num" w:pos="2160"/>
+        </w:tabs>
+        <w:ind w:left="2160" w:hanging="360"/>
+      </w:pPr>
+    </w:lvl>
+    <w:lvl w:ilvl="3" w:tentative="1">
+      <w:start w:val="1"/>
+      <w:numFmt w:val="decimal"/>
+      <w:lvlText w:val="%4."/>
+      <w:lvlJc w:val="left"/>
+      <w:pPr>
+        <w:tabs>
+          <w:tab w:val="num" w:pos="2880"/>
+        </w:tabs>
+        <w:ind w:left="2880" w:hanging="360"/>
+      </w:pPr>
+    </w:lvl>
+    <w:lvl w:ilvl="4" w:tentative="1">
+      <w:start w:val="1"/>
+      <w:numFmt w:val="decimal"/>
+      <w:lvlText w:val="%5."/>
+      <w:lvlJc w:val="left"/>
+      <w:pPr>
+        <w:tabs>
+          <w:tab w:val="num" w:pos="3600"/>
+        </w:tabs>
+        <w:ind w:left="3600" w:hanging="360"/>
+      </w:pPr>
+    </w:lvl>
+    <w:lvl w:ilvl="5" w:tentative="1">
+      <w:start w:val="1"/>
+      <w:numFmt w:val="decimal"/>
+      <w:lvlText w:val="%6."/>
+      <w:lvlJc w:val="left"/>
+      <w:pPr>
+        <w:tabs>
+          <w:tab w:val="num" w:pos="4320"/>
+        </w:tabs>
+        <w:ind w:left="4320" w:hanging="360"/>
+      </w:pPr>
+    </w:lvl>
+    <w:lvl w:ilvl="6" w:tentative="1">
+      <w:start w:val="1"/>
+      <w:numFmt w:val="decimal"/>
+      <w:lvlText w:val="%7."/>
+      <w:lvlJc w:val="left"/>
+      <w:pPr>
+        <w:tabs>
+          <w:tab w:val="num" w:pos="5040"/>
+        </w:tabs>
+        <w:ind w:left="5040" w:hanging="360"/>
+      </w:pPr>
+    </w:lvl>
+    <w:lvl w:ilvl="7" w:tentative="1">
+      <w:start w:val="1"/>
+      <w:numFmt w:val="decimal"/>
+      <w:lvlText w:val="%8."/>
+      <w:lvlJc w:val="left"/>
+      <w:pPr>
+        <w:tabs>
+          <w:tab w:val="num" w:pos="5760"/>
+        </w:tabs>
+        <w:ind w:left="5760" w:hanging="360"/>
+      </w:pPr>
+    </w:lvl>
+    <w:lvl w:ilvl="8" w:tentative="1">
+      <w:start w:val="1"/>
+      <w:numFmt w:val="decimal"/>
+      <w:lvlText w:val="%9."/>
+      <w:lvlJc w:val="left"/>
+      <w:pPr>
+        <w:tabs>
+          <w:tab w:val="num" w:pos="6480"/>
+        </w:tabs>
+        <w:ind w:left="6480" w:hanging="360"/>
+      </w:pPr>
+    </w:lvl>
+  </w:abstractNum>
+  <w:abstractNum w:abstractNumId="11" w15:restartNumberingAfterBreak="0">
     <w:nsid w:val="61007B40"/>
     <w:multiLevelType w:val="hybridMultilevel"/>
     <w:tmpl w:val="A1608C34"/>
@@ -10059,7 +10924,7 @@
       </w:pPr>
     </w:lvl>
   </w:abstractNum>
-  <w:abstractNum w:abstractNumId="11" w15:restartNumberingAfterBreak="0">
+  <w:abstractNum w:abstractNumId="12" w15:restartNumberingAfterBreak="0">
     <w:nsid w:val="6A4E06DA"/>
     <w:multiLevelType w:val="multilevel"/>
     <w:tmpl w:val="F5E886EC"/>
@@ -10172,7 +11037,7 @@
       </w:pPr>
     </w:lvl>
   </w:abstractNum>
-  <w:abstractNum w:abstractNumId="12" w15:restartNumberingAfterBreak="0">
+  <w:abstractNum w:abstractNumId="13" w15:restartNumberingAfterBreak="0">
     <w:nsid w:val="6AB32B99"/>
     <w:multiLevelType w:val="hybridMultilevel"/>
     <w:tmpl w:val="3CE699D6"/>
@@ -10261,7 +11126,7 @@
       </w:pPr>
     </w:lvl>
   </w:abstractNum>
-  <w:abstractNum w:abstractNumId="13" w15:restartNumberingAfterBreak="0">
+  <w:abstractNum w:abstractNumId="14" w15:restartNumberingAfterBreak="0">
     <w:nsid w:val="7E1D652D"/>
     <w:multiLevelType w:val="multilevel"/>
     <w:tmpl w:val="DB10A0EE"/>
@@ -10386,7 +11251,7 @@
     <w:abstractNumId w:val="5"/>
   </w:num>
   <w:num w:numId="4" w16cid:durableId="1264537948">
-    <w:abstractNumId w:val="12"/>
+    <w:abstractNumId w:val="13"/>
   </w:num>
   <w:num w:numId="5" w16cid:durableId="386534682">
     <w:abstractNumId w:val="8"/>
@@ -10395,16 +11260,16 @@
     <w:abstractNumId w:val="7"/>
   </w:num>
   <w:num w:numId="7" w16cid:durableId="412897790">
-    <w:abstractNumId w:val="13"/>
+    <w:abstractNumId w:val="14"/>
   </w:num>
   <w:num w:numId="8" w16cid:durableId="575091131">
-    <w:abstractNumId w:val="11"/>
+    <w:abstractNumId w:val="12"/>
   </w:num>
   <w:num w:numId="9" w16cid:durableId="1270426754">
     <w:abstractNumId w:val="0"/>
   </w:num>
   <w:num w:numId="10" w16cid:durableId="175652287">
-    <w:abstractNumId w:val="10"/>
+    <w:abstractNumId w:val="11"/>
   </w:num>
   <w:num w:numId="11" w16cid:durableId="961418674">
     <w:abstractNumId w:val="3"/>
@@ -10417,6 +11282,9 @@
   </w:num>
   <w:num w:numId="14" w16cid:durableId="1886134116">
     <w:abstractNumId w:val="4"/>
+  </w:num>
+  <w:num w:numId="15" w16cid:durableId="1075323034">
+    <w:abstractNumId w:val="10"/>
   </w:num>
   <w:numIdMacAtCleanup w:val="7"/>
 </w:numbering>

</xml_diff>